<commit_message>
compare_eval: plain-English report (drop micro/macro jargon, add glossary + analysis)
Rewrite the comparison docx for a non-jargon reader: friendly approach labels
via --describe + a 'What each approach means' table, questions instead of code
labels for the head-to-head sections, P/R/F1 only (drop micro/macro wording),
real data-driven analysis paragraphs per section, and a closing metric glossary.
Percentages instead of bare decimals for recall-type metrics.

Co-Authored-By: Claude Opus 4.8 <noreply@anthropic.com>
</commit_message>
<xml_diff>
--- a/out/eval/comparison_all_modes.docx
+++ b/out/eval/comparison_all_modes.docx
@@ -7,12 +7,12 @@
         <w:pStyle w:val="Title"/>
       </w:pPr>
       <w:r>
-        <w:t>VS Selection — Mode Comparison</w:t>
+        <w:t>Value-Stream prediction — comparison of approaches</w:t>
       </w:r>
     </w:p>
     <w:p>
       <w:r>
-        <w:t>Modes: all50_semantic, all50_noscore, evidence_semantic, evidence_noscore. Each metric is the mean across that mode's repeat runs.</w:t>
+        <w:t>We predict which Value Streams a ticket belongs to. This compares a few ways of asking the model to choose, on the same 60 tickets (each run repeated 3x; numbers are the average). The two things we vary: (1) whether we show the model similar PAST tickets and the answers they got, and (2) whether we include the search engine's relevance SCORES next to each candidate. Plain-language guide to every metric is at the end.</w:t>
       </w:r>
     </w:p>
     <w:p>
@@ -20,7 +20,136 @@
         <w:pStyle w:val="Heading1"/>
       </w:pPr>
       <w:r>
-        <w:t>Verdict</w:t>
+        <w:t>What each approach means</w:t>
+      </w:r>
+    </w:p>
+    <w:tbl>
+      <w:tblPr>
+        <w:tblStyle w:val="LightGrid-Accent1"/>
+        <w:tblW w:type="auto" w:w="0"/>
+        <w:tblLook w:firstColumn="1" w:firstRow="1" w:lastColumn="0" w:lastRow="0" w:noHBand="0" w:noVBand="1" w:val="04A0"/>
+      </w:tblPr>
+      <w:tblGrid>
+        <w:gridCol w:w="4320"/>
+        <w:gridCol w:w="4320"/>
+      </w:tblGrid>
+      <w:tr>
+        <w:tc>
+          <w:tcPr>
+            <w:tcW w:type="dxa" w:w="4320"/>
+          </w:tcPr>
+          <w:p>
+            <w:r>
+              <w:t>Approach</w:t>
+            </w:r>
+          </w:p>
+        </w:tc>
+        <w:tc>
+          <w:tcPr>
+            <w:tcW w:type="dxa" w:w="4320"/>
+          </w:tcPr>
+          <w:p>
+            <w:r>
+              <w:t>What we showed the model</w:t>
+            </w:r>
+          </w:p>
+        </w:tc>
+      </w:tr>
+      <w:tr>
+        <w:tc>
+          <w:tcPr>
+            <w:tcW w:type="dxa" w:w="4320"/>
+          </w:tcPr>
+          <w:p>
+            <w:r>
+              <w:t>No history + scores</w:t>
+            </w:r>
+          </w:p>
+        </w:tc>
+        <w:tc>
+          <w:tcPr>
+            <w:tcW w:type="dxa" w:w="4320"/>
+          </w:tcPr>
+          <w:p>
+            <w:r>
+              <w:t>All 50 Value Streams offered, with the search engine's relevance scores shown. No past tickets.</w:t>
+            </w:r>
+          </w:p>
+        </w:tc>
+      </w:tr>
+      <w:tr>
+        <w:tc>
+          <w:tcPr>
+            <w:tcW w:type="dxa" w:w="4320"/>
+          </w:tcPr>
+          <w:p>
+            <w:r>
+              <w:t>No history</w:t>
+            </w:r>
+          </w:p>
+        </w:tc>
+        <w:tc>
+          <w:tcPr>
+            <w:tcW w:type="dxa" w:w="4320"/>
+          </w:tcPr>
+          <w:p>
+            <w:r>
+              <w:t>All 50 Value Streams offered, scores hidden. No past tickets.</w:t>
+            </w:r>
+          </w:p>
+        </w:tc>
+      </w:tr>
+      <w:tr>
+        <w:tc>
+          <w:tcPr>
+            <w:tcW w:type="dxa" w:w="4320"/>
+          </w:tcPr>
+          <w:p>
+            <w:r>
+              <w:t>History + scores</w:t>
+            </w:r>
+          </w:p>
+        </w:tc>
+        <w:tc>
+          <w:tcPr>
+            <w:tcW w:type="dxa" w:w="4320"/>
+          </w:tcPr>
+          <w:p>
+            <w:r>
+              <w:t>All 50 streams + similar past tickets (with their answers) shown as examples, scores shown.</w:t>
+            </w:r>
+          </w:p>
+        </w:tc>
+      </w:tr>
+      <w:tr>
+        <w:tc>
+          <w:tcPr>
+            <w:tcW w:type="dxa" w:w="4320"/>
+          </w:tcPr>
+          <w:p>
+            <w:r>
+              <w:t>History</w:t>
+            </w:r>
+          </w:p>
+        </w:tc>
+        <w:tc>
+          <w:tcPr>
+            <w:tcW w:type="dxa" w:w="4320"/>
+          </w:tcPr>
+          <w:p>
+            <w:r>
+              <w:t>All 50 streams + similar past tickets shown as examples, scores hidden.</w:t>
+            </w:r>
+          </w:p>
+        </w:tc>
+      </w:tr>
+    </w:tbl>
+    <w:p>
+      <w:pPr>
+        <w:pStyle w:val="Heading1"/>
+      </w:pPr>
+      <w:r>
+        <w:t>Bottom line</w:t>
       </w:r>
     </w:p>
     <w:p>
@@ -28,7 +157,7 @@
         <w:pStyle w:val="ListBullet"/>
       </w:pPr>
       <w:r>
-        <w:t>Winner: 'evidence_semantic' - best recall (0.743) and F1 (0.301).</w:t>
+        <w:t>Best approach: "History + scores" — it finds the most correct Value Streams (recall 74%) and has the best overall balance (F1 0.30).</w:t>
       </w:r>
     </w:p>
     <w:p>
@@ -36,7 +165,7 @@
         <w:pStyle w:val="ListBullet"/>
       </w:pPr>
       <w:r>
-        <w:t>It lifts recall +0.168 over 'all50_semantic' (0.575 -&gt; 0.743) - about 29% relative.</w:t>
+        <w:t>That is 17% more of the correct answers found than the weakest approach ("No history + scores", 57%) — a 29% relative jump.</w:t>
       </w:r>
     </w:p>
     <w:p>
@@ -44,7 +173,7 @@
         <w:pStyle w:val="ListBullet"/>
       </w:pPr>
       <w:r>
-        <w:t>Single-VS recall (easy half): 0.676 -&gt; 0.848; multi-VS F1 (hard half): 0.347 -&gt; 0.454 - it lifts BOTH, so the gain is real, not easy-case bias.</w:t>
+        <w:t>It wins on BOTH easy tickets (one correct answer: 68% → 85% found) and hard tickets (several correct answers: F1 0.35 → 0.45), so the gain is real, not just from the easy cases.</w:t>
       </w:r>
     </w:p>
     <w:p>
@@ -52,7 +181,7 @@
         <w:pStyle w:val="ListBullet"/>
       </w:pPr>
       <w:r>
-        <w:t>Historic boost in 'evidence_semantic': GT shown in the evidence is picked 0.787 of the time vs 0.439 when it isn't (+0.348) - the model is genuinely using the precedent.</w:t>
+        <w:t>Why it wins: when a correct Value Stream showed up in the past-ticket examples, the model picked it 79% of the time, vs only 44% when it didn't — so the model is genuinely learning from precedent, not guessing.</w:t>
       </w:r>
     </w:p>
     <w:p>
@@ -60,7 +189,7 @@
         <w:pStyle w:val="ListBullet"/>
       </w:pPr>
       <w:r>
-        <w:t>Headroom: the historic lane SURFACES 0.887 of GT but the model only CAPTURES 0.787 - ~0.10 of the signal is in the evidence yet not picked. A more trusting prompt (or more historic tickets) could capture it.</w:t>
+        <w:t>Room to improve: the past examples actually CONTAINED 89% of the correct answers, but the model only USED 79% of them — about 10% of the right answers were sitting in front of it, unpicked. A more trusting prompt, or showing more past tickets, could capture that.</w:t>
       </w:r>
     </w:p>
     <w:p>
@@ -68,7 +197,7 @@
         <w:pStyle w:val="ListBullet"/>
       </w:pPr>
       <w:r>
-        <w:t>Precision is count-capped (predicting 10 vs ~2.5 GT) - read recall/F1, not precision.</w:t>
+        <w:t>Note on precision: the model always returns 10 guesses but a ticket has ~2.5 correct answers, so precision is mechanically low for everyone — judge it on RECALL and F1, not raw precision.</w:t>
       </w:r>
     </w:p>
     <w:p>
@@ -76,12 +205,12 @@
         <w:pStyle w:val="Heading1"/>
       </w:pPr>
       <w:r>
-        <w:t>Axis comparison (isolated deltas)</w:t>
+        <w:t>Head-to-head: what changes when we flip one setting</w:t>
       </w:r>
     </w:p>
     <w:p>
       <w:r>
-        <w:t>Each axis holds everything else fixed and changes ONE thing, so the delta is attributable. Δ = B - A; arrow points at the better side for that metric (recall/F1/lift: higher is better; dropped GT and latency: lower is better).</w:t>
+        <w:t>Each comparison below changes exactly ONE thing between two approaches and holds everything else fixed, so any difference is caused by that one change. 'Change' is the second approach minus the first; the arrow points to whichever side is better for that metric (recall, F1 and precedent-use: higher is better; missed answers and time: lower is better).</w:t>
       </w:r>
     </w:p>
     <w:p>
@@ -89,7 +218,15 @@
         <w:pStyle w:val="Heading2"/>
       </w:pPr>
       <w:r>
-        <w:t>plain-&gt;historic (no-scores):  all50_noscore  →  evidence_noscore</w:t>
+        <w:t>Does showing similar past tickets help? (scores hidden)</w:t>
+      </w:r>
+    </w:p>
+    <w:p>
+      <w:pPr>
+        <w:pStyle w:val="IntenseQuote"/>
+      </w:pPr>
+      <w:r>
+        <w:t>Comparing  "No history"  →  "History"</w:t>
       </w:r>
     </w:p>
     <w:tbl>
@@ -112,7 +249,7 @@
           </w:tcPr>
           <w:p>
             <w:r>
-              <w:t>metric</w:t>
+              <w:t>What we measure</w:t>
             </w:r>
           </w:p>
         </w:tc>
@@ -122,7 +259,7 @@
           </w:tcPr>
           <w:p>
             <w:r>
-              <w:t>all50_noscore</w:t>
+              <w:t>No history</w:t>
             </w:r>
           </w:p>
         </w:tc>
@@ -132,7 +269,7 @@
           </w:tcPr>
           <w:p>
             <w:r>
-              <w:t>evidence_noscore</w:t>
+              <w:t>History</w:t>
             </w:r>
           </w:p>
         </w:tc>
@@ -142,7 +279,7 @@
           </w:tcPr>
           <w:p>
             <w:r>
-              <w:t>Δ (B-A)</w:t>
+              <w:t>Change</w:t>
             </w:r>
           </w:p>
         </w:tc>
@@ -152,7 +289,7 @@
           </w:tcPr>
           <w:p>
             <w:r>
-              <w:t>better</w:t>
+              <w:t>Better</w:t>
             </w:r>
           </w:p>
         </w:tc>
@@ -164,7 +301,7 @@
           </w:tcPr>
           <w:p>
             <w:r>
-              <w:t>micro R</w:t>
+              <w:t>Recall (answers found)</w:t>
             </w:r>
           </w:p>
         </w:tc>
@@ -204,7 +341,7 @@
           </w:tcPr>
           <w:p>
             <w:r>
-              <w:t>→ evidence_noscore</w:t>
+              <w:t>→ History</w:t>
             </w:r>
           </w:p>
         </w:tc>
@@ -216,7 +353,7 @@
           </w:tcPr>
           <w:p>
             <w:r>
-              <w:t>micro F1</w:t>
+              <w:t>F1 (overall balance)</w:t>
             </w:r>
           </w:p>
         </w:tc>
@@ -256,7 +393,7 @@
           </w:tcPr>
           <w:p>
             <w:r>
-              <w:t>→ evidence_noscore</w:t>
+              <w:t>→ History</w:t>
             </w:r>
           </w:p>
         </w:tc>
@@ -268,7 +405,7 @@
           </w:tcPr>
           <w:p>
             <w:r>
-              <w:t>single-VS R</w:t>
+              <w:t>Easy tickets: found</w:t>
             </w:r>
           </w:p>
         </w:tc>
@@ -308,7 +445,7 @@
           </w:tcPr>
           <w:p>
             <w:r>
-              <w:t>→ evidence_noscore</w:t>
+              <w:t>→ History</w:t>
             </w:r>
           </w:p>
         </w:tc>
@@ -320,7 +457,7 @@
           </w:tcPr>
           <w:p>
             <w:r>
-              <w:t>multi-VS F1</w:t>
+              <w:t>Hard tickets: F1</w:t>
             </w:r>
           </w:p>
         </w:tc>
@@ -360,7 +497,7 @@
           </w:tcPr>
           <w:p>
             <w:r>
-              <w:t>→ evidence_noscore</w:t>
+              <w:t>→ History</w:t>
             </w:r>
           </w:p>
         </w:tc>
@@ -372,7 +509,7 @@
           </w:tcPr>
           <w:p>
             <w:r>
-              <w:t>historic lift</w:t>
+              <w:t>Precedent use (lift)</w:t>
             </w:r>
           </w:p>
         </w:tc>
@@ -412,7 +549,7 @@
           </w:tcPr>
           <w:p>
             <w:r>
-              <w:t>→ evidence_noscore</w:t>
+              <w:t>→ History</w:t>
             </w:r>
           </w:p>
         </w:tc>
@@ -424,7 +561,7 @@
           </w:tcPr>
           <w:p>
             <w:r>
-              <w:t>LLM-dropped GT</w:t>
+              <w:t>Missed answers (count)</w:t>
             </w:r>
           </w:p>
         </w:tc>
@@ -464,7 +601,7 @@
           </w:tcPr>
           <w:p>
             <w:r>
-              <w:t>→ evidence_noscore</w:t>
+              <w:t>→ History</w:t>
             </w:r>
           </w:p>
         </w:tc>
@@ -476,7 +613,7 @@
           </w:tcPr>
           <w:p>
             <w:r>
-              <w:t>median latency (s)</w:t>
+              <w:t>Typical time (s)</w:t>
             </w:r>
           </w:p>
         </w:tc>
@@ -516,7 +653,7 @@
           </w:tcPr>
           <w:p>
             <w:r>
-              <w:t>→ evidence_noscore</w:t>
+              <w:t>→ History</w:t>
             </w:r>
           </w:p>
         </w:tc>
@@ -527,7 +664,15 @@
         <w:pStyle w:val="Heading2"/>
       </w:pPr>
       <w:r>
-        <w:t>plain-&gt;historic (semantic):  all50_semantic  →  evidence_semantic</w:t>
+        <w:t>Does showing similar past tickets help? (scores shown)</w:t>
+      </w:r>
+    </w:p>
+    <w:p>
+      <w:pPr>
+        <w:pStyle w:val="IntenseQuote"/>
+      </w:pPr>
+      <w:r>
+        <w:t>Comparing  "No history + scores"  →  "History + scores"</w:t>
       </w:r>
     </w:p>
     <w:tbl>
@@ -550,7 +695,7 @@
           </w:tcPr>
           <w:p>
             <w:r>
-              <w:t>metric</w:t>
+              <w:t>What we measure</w:t>
             </w:r>
           </w:p>
         </w:tc>
@@ -560,7 +705,7 @@
           </w:tcPr>
           <w:p>
             <w:r>
-              <w:t>all50_semantic</w:t>
+              <w:t>No history + scores</w:t>
             </w:r>
           </w:p>
         </w:tc>
@@ -570,7 +715,7 @@
           </w:tcPr>
           <w:p>
             <w:r>
-              <w:t>evidence_semantic</w:t>
+              <w:t>History + scores</w:t>
             </w:r>
           </w:p>
         </w:tc>
@@ -580,7 +725,7 @@
           </w:tcPr>
           <w:p>
             <w:r>
-              <w:t>Δ (B-A)</w:t>
+              <w:t>Change</w:t>
             </w:r>
           </w:p>
         </w:tc>
@@ -590,7 +735,7 @@
           </w:tcPr>
           <w:p>
             <w:r>
-              <w:t>better</w:t>
+              <w:t>Better</w:t>
             </w:r>
           </w:p>
         </w:tc>
@@ -602,7 +747,7 @@
           </w:tcPr>
           <w:p>
             <w:r>
-              <w:t>micro R</w:t>
+              <w:t>Recall (answers found)</w:t>
             </w:r>
           </w:p>
         </w:tc>
@@ -642,7 +787,7 @@
           </w:tcPr>
           <w:p>
             <w:r>
-              <w:t>→ evidence_semantic</w:t>
+              <w:t>→ History + scores</w:t>
             </w:r>
           </w:p>
         </w:tc>
@@ -654,7 +799,7 @@
           </w:tcPr>
           <w:p>
             <w:r>
-              <w:t>micro F1</w:t>
+              <w:t>F1 (overall balance)</w:t>
             </w:r>
           </w:p>
         </w:tc>
@@ -694,7 +839,7 @@
           </w:tcPr>
           <w:p>
             <w:r>
-              <w:t>→ evidence_semantic</w:t>
+              <w:t>→ History + scores</w:t>
             </w:r>
           </w:p>
         </w:tc>
@@ -706,7 +851,7 @@
           </w:tcPr>
           <w:p>
             <w:r>
-              <w:t>single-VS R</w:t>
+              <w:t>Easy tickets: found</w:t>
             </w:r>
           </w:p>
         </w:tc>
@@ -746,7 +891,7 @@
           </w:tcPr>
           <w:p>
             <w:r>
-              <w:t>→ evidence_semantic</w:t>
+              <w:t>→ History + scores</w:t>
             </w:r>
           </w:p>
         </w:tc>
@@ -758,7 +903,7 @@
           </w:tcPr>
           <w:p>
             <w:r>
-              <w:t>multi-VS F1</w:t>
+              <w:t>Hard tickets: F1</w:t>
             </w:r>
           </w:p>
         </w:tc>
@@ -798,7 +943,7 @@
           </w:tcPr>
           <w:p>
             <w:r>
-              <w:t>→ evidence_semantic</w:t>
+              <w:t>→ History + scores</w:t>
             </w:r>
           </w:p>
         </w:tc>
@@ -810,7 +955,7 @@
           </w:tcPr>
           <w:p>
             <w:r>
-              <w:t>historic lift</w:t>
+              <w:t>Precedent use (lift)</w:t>
             </w:r>
           </w:p>
         </w:tc>
@@ -850,7 +995,7 @@
           </w:tcPr>
           <w:p>
             <w:r>
-              <w:t>→ evidence_semantic</w:t>
+              <w:t>→ History + scores</w:t>
             </w:r>
           </w:p>
         </w:tc>
@@ -862,7 +1007,7 @@
           </w:tcPr>
           <w:p>
             <w:r>
-              <w:t>LLM-dropped GT</w:t>
+              <w:t>Missed answers (count)</w:t>
             </w:r>
           </w:p>
         </w:tc>
@@ -914,7 +1059,7 @@
           </w:tcPr>
           <w:p>
             <w:r>
-              <w:t>median latency (s)</w:t>
+              <w:t>Typical time (s)</w:t>
             </w:r>
           </w:p>
         </w:tc>
@@ -965,7 +1110,15 @@
         <w:pStyle w:val="Heading2"/>
       </w:pPr>
       <w:r>
-        <w:t>semantic-&gt;no-scores (evidence):  evidence_semantic  →  evidence_noscore</w:t>
+        <w:t>Do the search relevance scores help? (with past tickets)</w:t>
+      </w:r>
+    </w:p>
+    <w:p>
+      <w:pPr>
+        <w:pStyle w:val="IntenseQuote"/>
+      </w:pPr>
+      <w:r>
+        <w:t>Comparing  "History + scores"  →  "History"</w:t>
       </w:r>
     </w:p>
     <w:tbl>
@@ -988,7 +1141,7 @@
           </w:tcPr>
           <w:p>
             <w:r>
-              <w:t>metric</w:t>
+              <w:t>What we measure</w:t>
             </w:r>
           </w:p>
         </w:tc>
@@ -998,7 +1151,7 @@
           </w:tcPr>
           <w:p>
             <w:r>
-              <w:t>evidence_semantic</w:t>
+              <w:t>History + scores</w:t>
             </w:r>
           </w:p>
         </w:tc>
@@ -1008,7 +1161,7 @@
           </w:tcPr>
           <w:p>
             <w:r>
-              <w:t>evidence_noscore</w:t>
+              <w:t>History</w:t>
             </w:r>
           </w:p>
         </w:tc>
@@ -1018,7 +1171,7 @@
           </w:tcPr>
           <w:p>
             <w:r>
-              <w:t>Δ (B-A)</w:t>
+              <w:t>Change</w:t>
             </w:r>
           </w:p>
         </w:tc>
@@ -1028,7 +1181,7 @@
           </w:tcPr>
           <w:p>
             <w:r>
-              <w:t>better</w:t>
+              <w:t>Better</w:t>
             </w:r>
           </w:p>
         </w:tc>
@@ -1040,7 +1193,7 @@
           </w:tcPr>
           <w:p>
             <w:r>
-              <w:t>micro R</w:t>
+              <w:t>Recall (answers found)</w:t>
             </w:r>
           </w:p>
         </w:tc>
@@ -1080,7 +1233,7 @@
           </w:tcPr>
           <w:p>
             <w:r>
-              <w:t>→ evidence_semantic</w:t>
+              <w:t>→ History + scores</w:t>
             </w:r>
           </w:p>
         </w:tc>
@@ -1092,7 +1245,7 @@
           </w:tcPr>
           <w:p>
             <w:r>
-              <w:t>micro F1</w:t>
+              <w:t>F1 (overall balance)</w:t>
             </w:r>
           </w:p>
         </w:tc>
@@ -1132,7 +1285,7 @@
           </w:tcPr>
           <w:p>
             <w:r>
-              <w:t>→ evidence_semantic</w:t>
+              <w:t>→ History + scores</w:t>
             </w:r>
           </w:p>
         </w:tc>
@@ -1144,7 +1297,7 @@
           </w:tcPr>
           <w:p>
             <w:r>
-              <w:t>single-VS R</w:t>
+              <w:t>Easy tickets: found</w:t>
             </w:r>
           </w:p>
         </w:tc>
@@ -1184,7 +1337,7 @@
           </w:tcPr>
           <w:p>
             <w:r>
-              <w:t>→ evidence_semantic</w:t>
+              <w:t>→ History + scores</w:t>
             </w:r>
           </w:p>
         </w:tc>
@@ -1196,7 +1349,7 @@
           </w:tcPr>
           <w:p>
             <w:r>
-              <w:t>multi-VS F1</w:t>
+              <w:t>Hard tickets: F1</w:t>
             </w:r>
           </w:p>
         </w:tc>
@@ -1236,7 +1389,7 @@
           </w:tcPr>
           <w:p>
             <w:r>
-              <w:t>→ evidence_semantic</w:t>
+              <w:t>→ History + scores</w:t>
             </w:r>
           </w:p>
         </w:tc>
@@ -1248,7 +1401,7 @@
           </w:tcPr>
           <w:p>
             <w:r>
-              <w:t>historic lift</w:t>
+              <w:t>Precedent use (lift)</w:t>
             </w:r>
           </w:p>
         </w:tc>
@@ -1288,7 +1441,7 @@
           </w:tcPr>
           <w:p>
             <w:r>
-              <w:t>→ evidence_semantic</w:t>
+              <w:t>→ History + scores</w:t>
             </w:r>
           </w:p>
         </w:tc>
@@ -1300,7 +1453,7 @@
           </w:tcPr>
           <w:p>
             <w:r>
-              <w:t>LLM-dropped GT</w:t>
+              <w:t>Missed answers (count)</w:t>
             </w:r>
           </w:p>
         </w:tc>
@@ -1352,7 +1505,7 @@
           </w:tcPr>
           <w:p>
             <w:r>
-              <w:t>median latency (s)</w:t>
+              <w:t>Typical time (s)</w:t>
             </w:r>
           </w:p>
         </w:tc>
@@ -1403,7 +1556,15 @@
         <w:pStyle w:val="Heading2"/>
       </w:pPr>
       <w:r>
-        <w:t>semantic-&gt;no-scores (all50):  all50_semantic  →  all50_noscore</w:t>
+        <w:t>Do the search relevance scores help? (no past tickets)</w:t>
+      </w:r>
+    </w:p>
+    <w:p>
+      <w:pPr>
+        <w:pStyle w:val="IntenseQuote"/>
+      </w:pPr>
+      <w:r>
+        <w:t>Comparing  "No history + scores"  →  "No history"</w:t>
       </w:r>
     </w:p>
     <w:tbl>
@@ -1426,7 +1587,7 @@
           </w:tcPr>
           <w:p>
             <w:r>
-              <w:t>metric</w:t>
+              <w:t>What we measure</w:t>
             </w:r>
           </w:p>
         </w:tc>
@@ -1436,7 +1597,7 @@
           </w:tcPr>
           <w:p>
             <w:r>
-              <w:t>all50_semantic</w:t>
+              <w:t>No history + scores</w:t>
             </w:r>
           </w:p>
         </w:tc>
@@ -1446,7 +1607,7 @@
           </w:tcPr>
           <w:p>
             <w:r>
-              <w:t>all50_noscore</w:t>
+              <w:t>No history</w:t>
             </w:r>
           </w:p>
         </w:tc>
@@ -1456,7 +1617,7 @@
           </w:tcPr>
           <w:p>
             <w:r>
-              <w:t>Δ (B-A)</w:t>
+              <w:t>Change</w:t>
             </w:r>
           </w:p>
         </w:tc>
@@ -1466,7 +1627,7 @@
           </w:tcPr>
           <w:p>
             <w:r>
-              <w:t>better</w:t>
+              <w:t>Better</w:t>
             </w:r>
           </w:p>
         </w:tc>
@@ -1478,7 +1639,7 @@
           </w:tcPr>
           <w:p>
             <w:r>
-              <w:t>micro R</w:t>
+              <w:t>Recall (answers found)</w:t>
             </w:r>
           </w:p>
         </w:tc>
@@ -1518,7 +1679,7 @@
           </w:tcPr>
           <w:p>
             <w:r>
-              <w:t>→ all50_noscore</w:t>
+              <w:t>→ No history</w:t>
             </w:r>
           </w:p>
         </w:tc>
@@ -1530,7 +1691,7 @@
           </w:tcPr>
           <w:p>
             <w:r>
-              <w:t>micro F1</w:t>
+              <w:t>F1 (overall balance)</w:t>
             </w:r>
           </w:p>
         </w:tc>
@@ -1570,7 +1731,7 @@
           </w:tcPr>
           <w:p>
             <w:r>
-              <w:t>→ all50_noscore</w:t>
+              <w:t>→ No history</w:t>
             </w:r>
           </w:p>
         </w:tc>
@@ -1582,7 +1743,7 @@
           </w:tcPr>
           <w:p>
             <w:r>
-              <w:t>single-VS R</w:t>
+              <w:t>Easy tickets: found</w:t>
             </w:r>
           </w:p>
         </w:tc>
@@ -1622,7 +1783,7 @@
           </w:tcPr>
           <w:p>
             <w:r>
-              <w:t>→ all50_noscore</w:t>
+              <w:t>→ No history</w:t>
             </w:r>
           </w:p>
         </w:tc>
@@ -1634,7 +1795,7 @@
           </w:tcPr>
           <w:p>
             <w:r>
-              <w:t>multi-VS F1</w:t>
+              <w:t>Hard tickets: F1</w:t>
             </w:r>
           </w:p>
         </w:tc>
@@ -1674,7 +1835,7 @@
           </w:tcPr>
           <w:p>
             <w:r>
-              <w:t>→ all50_noscore</w:t>
+              <w:t>→ No history</w:t>
             </w:r>
           </w:p>
         </w:tc>
@@ -1686,7 +1847,7 @@
           </w:tcPr>
           <w:p>
             <w:r>
-              <w:t>historic lift</w:t>
+              <w:t>Precedent use (lift)</w:t>
             </w:r>
           </w:p>
         </w:tc>
@@ -1726,7 +1887,7 @@
           </w:tcPr>
           <w:p>
             <w:r>
-              <w:t>→ all50_noscore</w:t>
+              <w:t>→ No history</w:t>
             </w:r>
           </w:p>
         </w:tc>
@@ -1738,7 +1899,7 @@
           </w:tcPr>
           <w:p>
             <w:r>
-              <w:t>LLM-dropped GT</w:t>
+              <w:t>Missed answers (count)</w:t>
             </w:r>
           </w:p>
         </w:tc>
@@ -1790,7 +1951,7 @@
           </w:tcPr>
           <w:p>
             <w:r>
-              <w:t>median latency (s)</w:t>
+              <w:t>Typical time (s)</w:t>
             </w:r>
           </w:p>
         </w:tc>
@@ -1841,19 +2002,19 @@
         <w:pStyle w:val="Heading1"/>
       </w:pPr>
       <w:r>
-        <w:t>1. Selection quality (P / R / F1)</w:t>
+        <w:t>1. Precision, Recall, F1</w:t>
       </w:r>
     </w:p>
     <w:p>
       <w:r>
-        <w:t>Precision is count-capped (predicting 10 when avg GT is ~2.5), so READ RECALL and F1, not precision. Best F1: 'evidence_semantic' (0.301). Best recall: 'evidence_semantic' (0.743).</w:t>
+        <w:t>Recall = of the correct Value Streams, how many did we find. F1 = the balance of precision and recall. Best F1: "History + scores" (0.30). Best recall: "History + scores" (74%). Precision looks low everywhere because the model returns 10 guesses for ~2.5 real answers — that is by design, so read recall and F1.</w:t>
       </w:r>
     </w:p>
     <w:p>
       <w:r>
         <w:drawing>
           <wp:inline xmlns:a="http://schemas.openxmlformats.org/drawingml/2006/main" xmlns:pic="http://schemas.openxmlformats.org/drawingml/2006/picture">
-            <wp:extent cx="5669280" cy="3370923"/>
+            <wp:extent cx="5669280" cy="3365450"/>
             <wp:docPr id="1" name="Picture 1"/>
             <wp:cNvGraphicFramePr>
               <a:graphicFrameLocks noChangeAspect="1"/>
@@ -1874,7 +2035,7 @@
                   <pic:spPr>
                     <a:xfrm>
                       <a:off x="0" y="0"/>
-                      <a:ext cx="5669280" cy="3370923"/>
+                      <a:ext cx="5669280" cy="3365450"/>
                     </a:xfrm>
                     <a:prstGeom prst="rect"/>
                   </pic:spPr>
@@ -1890,19 +2051,19 @@
         <w:pStyle w:val="Heading1"/>
       </w:pPr>
       <w:r>
-        <w:t>2. Single-VS vs Multi-VS</w:t>
+        <w:t>2. Easy tickets vs hard tickets</w:t>
       </w:r>
     </w:p>
     <w:p>
       <w:r>
-        <w:t>Single-VS tickets (one obvious answer) are the easy half - watch recall. Multi-VS is the hard half. A mode that lifts BOTH is genuinely better, not just easy-case-biased.</w:t>
+        <w:t>Easy tickets have one correct Value Stream (we track how often we find it). Hard tickets have two or more (we track F1). An approach that improves BOTH is genuinely better — not just better at the easy ones. Here, "History + scores" leads on both: easy 85% found, hard F1 0.45.</w:t>
       </w:r>
     </w:p>
     <w:p>
       <w:r>
         <w:drawing>
           <wp:inline xmlns:a="http://schemas.openxmlformats.org/drawingml/2006/main" xmlns:pic="http://schemas.openxmlformats.org/drawingml/2006/picture">
-            <wp:extent cx="5669280" cy="3370923"/>
+            <wp:extent cx="5669280" cy="3365450"/>
             <wp:docPr id="2" name="Picture 2"/>
             <wp:cNvGraphicFramePr>
               <a:graphicFrameLocks noChangeAspect="1"/>
@@ -1923,7 +2084,7 @@
                   <pic:spPr>
                     <a:xfrm>
                       <a:off x="0" y="0"/>
-                      <a:ext cx="5669280" cy="3370923"/>
+                      <a:ext cx="5669280" cy="3365450"/>
                     </a:xfrm>
                     <a:prstGeom prst="rect"/>
                   </pic:spPr>
@@ -1939,19 +2100,24 @@
         <w:pStyle w:val="Heading1"/>
       </w:pPr>
       <w:r>
-        <w:t>3. Retrieval recall - the ceiling</w:t>
+        <w:t>3. Were the right answers even shown to the model?</w:t>
       </w:r>
     </w:p>
     <w:p>
       <w:r>
-        <w:t>Did retrieval put the GT in front of the LLM? Selection recall cannot exceed review-pool recall. VS lane R@10 = semantic-ranking quality (low = embedding ranks GT poorly). Historic lane R = what precedent surfaces. Pool R = the ceiling the LLM sees.</w:t>
+        <w:t>Before the model chooses, the system has to put the correct Value Streams in front of it — it can't pick what it never sees. This is the ceiling on how well any approach can do.</w:t>
+      </w:r>
+    </w:p>
+    <w:p>
+      <w:r>
+        <w:t>Search ranking alone is weak: its top 10 contained only 26% of the correct answers. But the past-ticket examples contained 89%, and because we hand the model the FULL 50-stream catalogue every time, 100% of the correct answers are always on the table. So retrieval is NOT the bottleneck — every miss is the model choosing wrong from a complete list, which is why the choice of prompt/approach matters so much.</w:t>
       </w:r>
     </w:p>
     <w:p>
       <w:r>
         <w:drawing>
           <wp:inline xmlns:a="http://schemas.openxmlformats.org/drawingml/2006/main" xmlns:pic="http://schemas.openxmlformats.org/drawingml/2006/picture">
-            <wp:extent cx="5669280" cy="3370923"/>
+            <wp:extent cx="5669280" cy="3365450"/>
             <wp:docPr id="3" name="Picture 3"/>
             <wp:cNvGraphicFramePr>
               <a:graphicFrameLocks noChangeAspect="1"/>
@@ -1972,7 +2138,7 @@
                   <pic:spPr>
                     <a:xfrm>
                       <a:off x="0" y="0"/>
-                      <a:ext cx="5669280" cy="3370923"/>
+                      <a:ext cx="5669280" cy="3365450"/>
                     </a:xfrm>
                     <a:prstGeom prst="rect"/>
                   </pic:spPr>
@@ -1988,19 +2154,19 @@
         <w:pStyle w:val="Heading1"/>
       </w:pPr>
       <w:r>
-        <w:t>4. Historic boost</w:t>
+        <w:t>4. Does the model actually use the past examples?</w:t>
       </w:r>
     </w:p>
     <w:p>
       <w:r>
-        <w:t>Recall on GT that appeared in the historic evidence vs GT that didn't. A big gap means the model is USING the precedent: GT shown in similar past tickets gets picked far more.</w:t>
+        <w:t>This splits recall two ways: correct answers that appeared in the past-ticket examples, vs correct answers that didn't. A big gap means the model leans on precedent. A gap near zero (as in the no-history approaches) means the examples aren't doing anything.</w:t>
       </w:r>
     </w:p>
     <w:p>
       <w:r>
         <w:drawing>
           <wp:inline xmlns:a="http://schemas.openxmlformats.org/drawingml/2006/main" xmlns:pic="http://schemas.openxmlformats.org/drawingml/2006/picture">
-            <wp:extent cx="5669280" cy="3370923"/>
+            <wp:extent cx="5669280" cy="3365450"/>
             <wp:docPr id="4" name="Picture 4"/>
             <wp:cNvGraphicFramePr>
               <a:graphicFrameLocks noChangeAspect="1"/>
@@ -2021,7 +2187,7 @@
                   <pic:spPr>
                     <a:xfrm>
                       <a:off x="0" y="0"/>
-                      <a:ext cx="5669280" cy="3370923"/>
+                      <a:ext cx="5669280" cy="3365450"/>
                     </a:xfrm>
                     <a:prstGeom prst="rect"/>
                   </pic:spPr>
@@ -2037,19 +2203,19 @@
         <w:pStyle w:val="Heading1"/>
       </w:pPr>
       <w:r>
-        <w:t>5. Latency</w:t>
+        <w:t>5. Time per prediction</w:t>
       </w:r>
     </w:p>
     <w:p>
       <w:r>
-        <w:t>Per-prediction latency (excludes the eval-only judge calls). The richer modes (more candidates/evidence) cost a little more time per ticket.</w:t>
+        <w:t>Average and slowest seconds per ticket (the eval-only scoring calls are excluded). A very large 'slowest' next to a small average usually means one ticket hit a retry/backoff storm, not real compute — worth a look, but it doesn't reflect typical speed.</w:t>
       </w:r>
     </w:p>
     <w:p>
       <w:r>
         <w:drawing>
           <wp:inline xmlns:a="http://schemas.openxmlformats.org/drawingml/2006/main" xmlns:pic="http://schemas.openxmlformats.org/drawingml/2006/picture">
-            <wp:extent cx="5669280" cy="3266863"/>
+            <wp:extent cx="5669280" cy="3261559"/>
             <wp:docPr id="5" name="Picture 5"/>
             <wp:cNvGraphicFramePr>
               <a:graphicFrameLocks noChangeAspect="1"/>
@@ -2070,7 +2236,7 @@
                   <pic:spPr>
                     <a:xfrm>
                       <a:off x="0" y="0"/>
-                      <a:ext cx="5669280" cy="3266863"/>
+                      <a:ext cx="5669280" cy="3261559"/>
                     </a:xfrm>
                     <a:prstGeom prst="rect"/>
                   </pic:spPr>
@@ -2086,7 +2252,7 @@
         <w:pStyle w:val="Heading1"/>
       </w:pPr>
       <w:r>
-        <w:t>Summary table</w:t>
+        <w:t>All numbers in one table</w:t>
       </w:r>
     </w:p>
     <w:tbl>
@@ -2096,48 +2262,47 @@
         <w:tblLook w:firstColumn="1" w:firstRow="1" w:lastColumn="0" w:lastRow="0" w:noHBand="0" w:noVBand="1" w:val="04A0"/>
       </w:tblPr>
       <w:tblGrid>
-        <w:gridCol w:w="1234"/>
-        <w:gridCol w:w="1234"/>
-        <w:gridCol w:w="1234"/>
-        <w:gridCol w:w="1234"/>
-        <w:gridCol w:w="1234"/>
-        <w:gridCol w:w="1234"/>
-        <w:gridCol w:w="1234"/>
+        <w:gridCol w:w="1440"/>
+        <w:gridCol w:w="1440"/>
+        <w:gridCol w:w="1440"/>
+        <w:gridCol w:w="1440"/>
+        <w:gridCol w:w="1440"/>
+        <w:gridCol w:w="1440"/>
       </w:tblGrid>
       <w:tr>
         <w:tc>
           <w:tcPr>
-            <w:tcW w:type="dxa" w:w="1234"/>
+            <w:tcW w:type="dxa" w:w="1440"/>
           </w:tcPr>
           <w:p>
             <w:r>
-              <w:t>mode</w:t>
+              <w:t>Approach</w:t>
             </w:r>
           </w:p>
         </w:tc>
         <w:tc>
           <w:tcPr>
-            <w:tcW w:type="dxa" w:w="1234"/>
+            <w:tcW w:type="dxa" w:w="1440"/>
           </w:tcPr>
           <w:p>
             <w:r>
-              <w:t>P</w:t>
+              <w:t>Precision</w:t>
             </w:r>
           </w:p>
         </w:tc>
         <w:tc>
           <w:tcPr>
-            <w:tcW w:type="dxa" w:w="1234"/>
+            <w:tcW w:type="dxa" w:w="1440"/>
           </w:tcPr>
           <w:p>
             <w:r>
-              <w:t>R</w:t>
+              <w:t>Recall</w:t>
             </w:r>
           </w:p>
         </w:tc>
         <w:tc>
           <w:tcPr>
-            <w:tcW w:type="dxa" w:w="1234"/>
+            <w:tcW w:type="dxa" w:w="1440"/>
           </w:tcPr>
           <w:p>
             <w:r>
@@ -2147,31 +2312,21 @@
         </w:tc>
         <w:tc>
           <w:tcPr>
-            <w:tcW w:type="dxa" w:w="1234"/>
+            <w:tcW w:type="dxa" w:w="1440"/>
           </w:tcPr>
           <w:p>
             <w:r>
-              <w:t>single-R</w:t>
+              <w:t>Easy: found</w:t>
             </w:r>
           </w:p>
         </w:tc>
         <w:tc>
           <w:tcPr>
-            <w:tcW w:type="dxa" w:w="1234"/>
+            <w:tcW w:type="dxa" w:w="1440"/>
           </w:tcPr>
           <w:p>
             <w:r>
-              <w:t>multi-F1</w:t>
-            </w:r>
-          </w:p>
-        </w:tc>
-        <w:tc>
-          <w:tcPr>
-            <w:tcW w:type="dxa" w:w="1234"/>
-          </w:tcPr>
-          <w:p>
-            <w:r>
-              <w:t>hist boost</w:t>
+              <w:t>Hard: F1</w:t>
             </w:r>
           </w:p>
         </w:tc>
@@ -2179,71 +2334,61 @@
       <w:tr>
         <w:tc>
           <w:tcPr>
-            <w:tcW w:type="dxa" w:w="1234"/>
+            <w:tcW w:type="dxa" w:w="1440"/>
           </w:tcPr>
           <w:p>
             <w:r>
-              <w:t>all50_semantic</w:t>
+              <w:t>No history + scores</w:t>
             </w:r>
           </w:p>
         </w:tc>
         <w:tc>
           <w:tcPr>
-            <w:tcW w:type="dxa" w:w="1234"/>
+            <w:tcW w:type="dxa" w:w="1440"/>
           </w:tcPr>
           <w:p>
             <w:r>
-              <w:t>0.146</w:t>
+              <w:t>15%</w:t>
             </w:r>
           </w:p>
         </w:tc>
         <w:tc>
           <w:tcPr>
-            <w:tcW w:type="dxa" w:w="1234"/>
+            <w:tcW w:type="dxa" w:w="1440"/>
           </w:tcPr>
           <w:p>
             <w:r>
-              <w:t>0.575</w:t>
+              <w:t>57%</w:t>
             </w:r>
           </w:p>
         </w:tc>
         <w:tc>
           <w:tcPr>
-            <w:tcW w:type="dxa" w:w="1234"/>
+            <w:tcW w:type="dxa" w:w="1440"/>
           </w:tcPr>
           <w:p>
             <w:r>
-              <w:t>0.232</w:t>
+              <w:t>0.23</w:t>
             </w:r>
           </w:p>
         </w:tc>
         <w:tc>
           <w:tcPr>
-            <w:tcW w:type="dxa" w:w="1234"/>
+            <w:tcW w:type="dxa" w:w="1440"/>
           </w:tcPr>
           <w:p>
             <w:r>
-              <w:t>0.676</w:t>
+              <w:t>68%</w:t>
             </w:r>
           </w:p>
         </w:tc>
         <w:tc>
           <w:tcPr>
-            <w:tcW w:type="dxa" w:w="1234"/>
+            <w:tcW w:type="dxa" w:w="1440"/>
           </w:tcPr>
           <w:p>
             <w:r>
-              <w:t>0.347</w:t>
-            </w:r>
-          </w:p>
-        </w:tc>
-        <w:tc>
-          <w:tcPr>
-            <w:tcW w:type="dxa" w:w="1234"/>
-          </w:tcPr>
-          <w:p>
-            <w:r>
-              <w:t>-</w:t>
+              <w:t>0.35</w:t>
             </w:r>
           </w:p>
         </w:tc>
@@ -2251,71 +2396,61 @@
       <w:tr>
         <w:tc>
           <w:tcPr>
-            <w:tcW w:type="dxa" w:w="1234"/>
+            <w:tcW w:type="dxa" w:w="1440"/>
           </w:tcPr>
           <w:p>
             <w:r>
-              <w:t>all50_noscore</w:t>
+              <w:t>No history</w:t>
             </w:r>
           </w:p>
         </w:tc>
         <w:tc>
           <w:tcPr>
-            <w:tcW w:type="dxa" w:w="1234"/>
+            <w:tcW w:type="dxa" w:w="1440"/>
           </w:tcPr>
           <w:p>
             <w:r>
-              <w:t>0.149</w:t>
+              <w:t>15%</w:t>
             </w:r>
           </w:p>
         </w:tc>
         <w:tc>
           <w:tcPr>
-            <w:tcW w:type="dxa" w:w="1234"/>
+            <w:tcW w:type="dxa" w:w="1440"/>
           </w:tcPr>
           <w:p>
             <w:r>
-              <w:t>0.588</w:t>
+              <w:t>59%</w:t>
             </w:r>
           </w:p>
         </w:tc>
         <w:tc>
           <w:tcPr>
-            <w:tcW w:type="dxa" w:w="1234"/>
+            <w:tcW w:type="dxa" w:w="1440"/>
           </w:tcPr>
           <w:p>
             <w:r>
-              <w:t>0.237</w:t>
+              <w:t>0.24</w:t>
             </w:r>
           </w:p>
         </w:tc>
         <w:tc>
           <w:tcPr>
-            <w:tcW w:type="dxa" w:w="1234"/>
+            <w:tcW w:type="dxa" w:w="1440"/>
           </w:tcPr>
           <w:p>
             <w:r>
-              <w:t>0.676</w:t>
+              <w:t>68%</w:t>
             </w:r>
           </w:p>
         </w:tc>
         <w:tc>
           <w:tcPr>
-            <w:tcW w:type="dxa" w:w="1234"/>
+            <w:tcW w:type="dxa" w:w="1440"/>
           </w:tcPr>
           <w:p>
             <w:r>
-              <w:t>0.358</w:t>
-            </w:r>
-          </w:p>
-        </w:tc>
-        <w:tc>
-          <w:tcPr>
-            <w:tcW w:type="dxa" w:w="1234"/>
-          </w:tcPr>
-          <w:p>
-            <w:r>
-              <w:t>+0.050</w:t>
+              <w:t>0.36</w:t>
             </w:r>
           </w:p>
         </w:tc>
@@ -2323,71 +2458,61 @@
       <w:tr>
         <w:tc>
           <w:tcPr>
-            <w:tcW w:type="dxa" w:w="1234"/>
+            <w:tcW w:type="dxa" w:w="1440"/>
           </w:tcPr>
           <w:p>
             <w:r>
-              <w:t>evidence_semantic</w:t>
+              <w:t>History + scores</w:t>
             </w:r>
           </w:p>
         </w:tc>
         <w:tc>
           <w:tcPr>
-            <w:tcW w:type="dxa" w:w="1234"/>
+            <w:tcW w:type="dxa" w:w="1440"/>
           </w:tcPr>
           <w:p>
             <w:r>
-              <w:t>0.188</w:t>
+              <w:t>19%</w:t>
             </w:r>
           </w:p>
         </w:tc>
         <w:tc>
           <w:tcPr>
-            <w:tcW w:type="dxa" w:w="1234"/>
+            <w:tcW w:type="dxa" w:w="1440"/>
           </w:tcPr>
           <w:p>
             <w:r>
-              <w:t>0.743</w:t>
+              <w:t>74%</w:t>
             </w:r>
           </w:p>
         </w:tc>
         <w:tc>
           <w:tcPr>
-            <w:tcW w:type="dxa" w:w="1234"/>
+            <w:tcW w:type="dxa" w:w="1440"/>
           </w:tcPr>
           <w:p>
             <w:r>
-              <w:t>0.301</w:t>
+              <w:t>0.30</w:t>
             </w:r>
           </w:p>
         </w:tc>
         <w:tc>
           <w:tcPr>
-            <w:tcW w:type="dxa" w:w="1234"/>
+            <w:tcW w:type="dxa" w:w="1440"/>
           </w:tcPr>
           <w:p>
             <w:r>
-              <w:t>0.848</w:t>
+              <w:t>85%</w:t>
             </w:r>
           </w:p>
         </w:tc>
         <w:tc>
           <w:tcPr>
-            <w:tcW w:type="dxa" w:w="1234"/>
+            <w:tcW w:type="dxa" w:w="1440"/>
           </w:tcPr>
           <w:p>
             <w:r>
-              <w:t>0.454</w:t>
-            </w:r>
-          </w:p>
-        </w:tc>
-        <w:tc>
-          <w:tcPr>
-            <w:tcW w:type="dxa" w:w="1234"/>
-          </w:tcPr>
-          <w:p>
-            <w:r>
-              <w:t>+0.348</w:t>
+              <w:t>0.45</w:t>
             </w:r>
           </w:p>
         </w:tc>
@@ -2395,71 +2520,278 @@
       <w:tr>
         <w:tc>
           <w:tcPr>
-            <w:tcW w:type="dxa" w:w="1234"/>
+            <w:tcW w:type="dxa" w:w="1440"/>
           </w:tcPr>
           <w:p>
             <w:r>
-              <w:t>evidence_noscore</w:t>
+              <w:t>History</w:t>
             </w:r>
           </w:p>
         </w:tc>
         <w:tc>
           <w:tcPr>
-            <w:tcW w:type="dxa" w:w="1234"/>
+            <w:tcW w:type="dxa" w:w="1440"/>
           </w:tcPr>
           <w:p>
             <w:r>
-              <w:t>0.184</w:t>
+              <w:t>18%</w:t>
             </w:r>
           </w:p>
         </w:tc>
         <w:tc>
           <w:tcPr>
-            <w:tcW w:type="dxa" w:w="1234"/>
+            <w:tcW w:type="dxa" w:w="1440"/>
           </w:tcPr>
           <w:p>
             <w:r>
-              <w:t>0.726</w:t>
+              <w:t>73%</w:t>
             </w:r>
           </w:p>
         </w:tc>
         <w:tc>
           <w:tcPr>
-            <w:tcW w:type="dxa" w:w="1234"/>
+            <w:tcW w:type="dxa" w:w="1440"/>
           </w:tcPr>
           <w:p>
             <w:r>
-              <w:t>0.294</w:t>
+              <w:t>0.29</w:t>
             </w:r>
           </w:p>
         </w:tc>
         <w:tc>
           <w:tcPr>
-            <w:tcW w:type="dxa" w:w="1234"/>
+            <w:tcW w:type="dxa" w:w="1440"/>
           </w:tcPr>
           <w:p>
             <w:r>
-              <w:t>0.838</w:t>
+              <w:t>84%</w:t>
             </w:r>
           </w:p>
         </w:tc>
         <w:tc>
           <w:tcPr>
-            <w:tcW w:type="dxa" w:w="1234"/>
+            <w:tcW w:type="dxa" w:w="1440"/>
           </w:tcPr>
           <w:p>
             <w:r>
-              <w:t>0.441</w:t>
+              <w:t>0.44</w:t>
+            </w:r>
+          </w:p>
+        </w:tc>
+      </w:tr>
+    </w:tbl>
+    <w:p>
+      <w:pPr>
+        <w:pStyle w:val="Heading1"/>
+      </w:pPr>
+      <w:r>
+        <w:t>What the metrics mean</w:t>
+      </w:r>
+    </w:p>
+    <w:tbl>
+      <w:tblPr>
+        <w:tblStyle w:val="LightGrid-Accent1"/>
+        <w:tblW w:type="auto" w:w="0"/>
+        <w:tblLook w:firstColumn="1" w:firstRow="1" w:lastColumn="0" w:lastRow="0" w:noHBand="0" w:noVBand="1" w:val="04A0"/>
+      </w:tblPr>
+      <w:tblGrid>
+        <w:gridCol w:w="4320"/>
+        <w:gridCol w:w="4320"/>
+      </w:tblGrid>
+      <w:tr>
+        <w:tc>
+          <w:tcPr>
+            <w:tcW w:type="dxa" w:w="4320"/>
+          </w:tcPr>
+          <w:p>
+            <w:r>
+              <w:t>Term</w:t>
             </w:r>
           </w:p>
         </w:tc>
         <w:tc>
           <w:tcPr>
-            <w:tcW w:type="dxa" w:w="1234"/>
+            <w:tcW w:type="dxa" w:w="4320"/>
           </w:tcPr>
           <w:p>
             <w:r>
-              <w:t>+0.308</w:t>
+              <w:t>Plain meaning</w:t>
+            </w:r>
+          </w:p>
+        </w:tc>
+      </w:tr>
+      <w:tr>
+        <w:tc>
+          <w:tcPr>
+            <w:tcW w:type="dxa" w:w="4320"/>
+          </w:tcPr>
+          <w:p>
+            <w:r>
+              <w:t>Recall</w:t>
+            </w:r>
+          </w:p>
+        </w:tc>
+        <w:tc>
+          <w:tcPr>
+            <w:tcW w:type="dxa" w:w="4320"/>
+          </w:tcPr>
+          <w:p>
+            <w:r>
+              <w:t>Of the Value Streams that were actually correct, the fraction we found. Higher is better.</w:t>
+            </w:r>
+          </w:p>
+        </w:tc>
+      </w:tr>
+      <w:tr>
+        <w:tc>
+          <w:tcPr>
+            <w:tcW w:type="dxa" w:w="4320"/>
+          </w:tcPr>
+          <w:p>
+            <w:r>
+              <w:t>Precision</w:t>
+            </w:r>
+          </w:p>
+        </w:tc>
+        <w:tc>
+          <w:tcPr>
+            <w:tcW w:type="dxa" w:w="4320"/>
+          </w:tcPr>
+          <w:p>
+            <w:r>
+              <w:t>Of our guesses, the fraction that were correct. Low here by design (10 guesses, ~2.5 real).</w:t>
+            </w:r>
+          </w:p>
+        </w:tc>
+      </w:tr>
+      <w:tr>
+        <w:tc>
+          <w:tcPr>
+            <w:tcW w:type="dxa" w:w="4320"/>
+          </w:tcPr>
+          <w:p>
+            <w:r>
+              <w:t>F1</w:t>
+            </w:r>
+          </w:p>
+        </w:tc>
+        <w:tc>
+          <w:tcPr>
+            <w:tcW w:type="dxa" w:w="4320"/>
+          </w:tcPr>
+          <w:p>
+            <w:r>
+              <w:t>A single balance score combining precision and recall. Higher is better.</w:t>
+            </w:r>
+          </w:p>
+        </w:tc>
+      </w:tr>
+      <w:tr>
+        <w:tc>
+          <w:tcPr>
+            <w:tcW w:type="dxa" w:w="4320"/>
+          </w:tcPr>
+          <w:p>
+            <w:r>
+              <w:t>Easy: found</w:t>
+            </w:r>
+          </w:p>
+        </w:tc>
+        <w:tc>
+          <w:tcPr>
+            <w:tcW w:type="dxa" w:w="4320"/>
+          </w:tcPr>
+          <w:p>
+            <w:r>
+              <w:t>On tickets with one correct answer, how often we found it.</w:t>
+            </w:r>
+          </w:p>
+        </w:tc>
+      </w:tr>
+      <w:tr>
+        <w:tc>
+          <w:tcPr>
+            <w:tcW w:type="dxa" w:w="4320"/>
+          </w:tcPr>
+          <w:p>
+            <w:r>
+              <w:t>Hard: F1</w:t>
+            </w:r>
+          </w:p>
+        </w:tc>
+        <w:tc>
+          <w:tcPr>
+            <w:tcW w:type="dxa" w:w="4320"/>
+          </w:tcPr>
+          <w:p>
+            <w:r>
+              <w:t>On tickets with two or more correct answers, the balance score.</w:t>
+            </w:r>
+          </w:p>
+        </w:tc>
+      </w:tr>
+      <w:tr>
+        <w:tc>
+          <w:tcPr>
+            <w:tcW w:type="dxa" w:w="4320"/>
+          </w:tcPr>
+          <w:p>
+            <w:r>
+              <w:t>Past-ticket examples</w:t>
+            </w:r>
+          </w:p>
+        </w:tc>
+        <w:tc>
+          <w:tcPr>
+            <w:tcW w:type="dxa" w:w="4320"/>
+          </w:tcPr>
+          <w:p>
+            <w:r>
+              <w:t>Similar tickets from the past, shown to the model along with the answers they got.</w:t>
+            </w:r>
+          </w:p>
+        </w:tc>
+      </w:tr>
+      <w:tr>
+        <w:tc>
+          <w:tcPr>
+            <w:tcW w:type="dxa" w:w="4320"/>
+          </w:tcPr>
+          <w:p>
+            <w:r>
+              <w:t>Search relevance scores</w:t>
+            </w:r>
+          </w:p>
+        </w:tc>
+        <w:tc>
+          <w:tcPr>
+            <w:tcW w:type="dxa" w:w="4320"/>
+          </w:tcPr>
+          <w:p>
+            <w:r>
+              <w:t>Numbers from the search engine ranking each candidate; included or hidden.</w:t>
+            </w:r>
+          </w:p>
+        </w:tc>
+      </w:tr>
+      <w:tr>
+        <w:tc>
+          <w:tcPr>
+            <w:tcW w:type="dxa" w:w="4320"/>
+          </w:tcPr>
+          <w:p>
+            <w:r>
+              <w:t>Shown to the model</w:t>
+            </w:r>
+          </w:p>
+        </w:tc>
+        <w:tc>
+          <w:tcPr>
+            <w:tcW w:type="dxa" w:w="4320"/>
+          </w:tcPr>
+          <w:p>
+            <w:r>
+              <w:t>The fraction of correct answers that were on the candidate list at all (the ceiling).</w:t>
             </w:r>
           </w:p>
         </w:tc>

</xml_diff>

<commit_message>
compare_eval: define easy/hard tickets and lift in the glossary
These terms appeared in tables/charts without a plain definition. Add full
glossary entries for 'Easy ticket' (1 correct VS), 'Hard ticket' (2+ correct VS),
and 'Precedent use (lift)' (the picked-rate gap between answers shown vs not shown
in the past examples).

Co-Authored-By: Claude Opus 4.8 <noreply@anthropic.com>
</commit_message>
<xml_diff>
--- a/out/eval/comparison_all_modes.docx
+++ b/out/eval/comparison_all_modes.docx
@@ -2693,7 +2693,7 @@
           </w:tcPr>
           <w:p>
             <w:r>
-              <w:t>Easy: found</w:t>
+              <w:t>Easy ticket</w:t>
             </w:r>
           </w:p>
         </w:tc>
@@ -2703,7 +2703,7 @@
           </w:tcPr>
           <w:p>
             <w:r>
-              <w:t>On tickets with one correct answer, how often we found it.</w:t>
+              <w:t>A ticket that has only ONE correct Value Stream - one answer to find. 'Easy: found' = how often we found that one answer.</w:t>
             </w:r>
           </w:p>
         </w:tc>
@@ -2715,7 +2715,7 @@
           </w:tcPr>
           <w:p>
             <w:r>
-              <w:t>Hard: F1</w:t>
+              <w:t>Hard ticket</w:t>
             </w:r>
           </w:p>
         </w:tc>
@@ -2725,7 +2725,29 @@
           </w:tcPr>
           <w:p>
             <w:r>
-              <w:t>On tickets with two or more correct answers, the balance score.</w:t>
+              <w:t>A ticket that has TWO OR MORE correct Value Streams - we must find several. Scored with F1. We track easy and hard apart so a win isn't just from the easy cases.</w:t>
+            </w:r>
+          </w:p>
+        </w:tc>
+      </w:tr>
+      <w:tr>
+        <w:tc>
+          <w:tcPr>
+            <w:tcW w:type="dxa" w:w="4320"/>
+          </w:tcPr>
+          <w:p>
+            <w:r>
+              <w:t>Precedent use (lift)</w:t>
+            </w:r>
+          </w:p>
+        </w:tc>
+        <w:tc>
+          <w:tcPr>
+            <w:tcW w:type="dxa" w:w="4320"/>
+          </w:tcPr>
+          <w:p>
+            <w:r>
+              <w:t>Does showing past examples actually change the picks? Take the correct answers, split them into those that DID appear in the past examples vs those that did NOT, and compare how often each got picked. Lift = the gap. Big positive = the model leans on the examples; near zero = the examples do nothing.</w:t>
             </w:r>
           </w:p>
         </w:tc>

</xml_diff>

<commit_message>
compare_eval: clarify the precedent-use chart (control group + no fake zeros)
The 'past examples' bars confused: no-history approaches showed bars even though
they don't show examples to the model. They are the control - the similar tickets
are always FETCHED (needed to compute the split) but only SHOWN in history modes,
so the split is 'answer was in the fetched tickets', not 'model saw them'. Relabel
the bars accordingly, add the control-group explanation, and treat a (0,0) boost
from older runs as missing so it draws no bar instead of a misleading 0.00.

Co-Authored-By: Claude Opus 4.8 <noreply@anthropic.com>
</commit_message>
<xml_diff>
--- a/out/eval/comparison_all_modes.docx
+++ b/out/eval/comparison_all_modes.docx
@@ -72,7 +72,7 @@
           </w:tcPr>
           <w:p>
             <w:r>
-              <w:t>All 50 Value Streams offered, with the search engine's relevance scores shown. No past tickets.</w:t>
+              <w:t>All 50 Value Streams offered, with search relevance scores shown. No past tickets.</w:t>
             </w:r>
           </w:p>
         </w:tc>
@@ -116,7 +116,7 @@
           </w:tcPr>
           <w:p>
             <w:r>
-              <w:t>All 50 streams + similar past tickets (with their answers) shown as examples, scores shown.</w:t>
+              <w:t>All 50 streams + similar past tickets shown as examples, scores shown.</w:t>
             </w:r>
           </w:p>
         </w:tc>
@@ -664,452 +664,6 @@
         <w:pStyle w:val="Heading2"/>
       </w:pPr>
       <w:r>
-        <w:t>Does showing similar past tickets help? (scores shown)</w:t>
-      </w:r>
-    </w:p>
-    <w:p>
-      <w:pPr>
-        <w:pStyle w:val="IntenseQuote"/>
-      </w:pPr>
-      <w:r>
-        <w:t>Comparing  "No history + scores"  →  "History + scores"</w:t>
-      </w:r>
-    </w:p>
-    <w:tbl>
-      <w:tblPr>
-        <w:tblStyle w:val="LightGrid-Accent1"/>
-        <w:tblW w:type="auto" w:w="0"/>
-        <w:tblLook w:firstColumn="1" w:firstRow="1" w:lastColumn="0" w:lastRow="0" w:noHBand="0" w:noVBand="1" w:val="04A0"/>
-      </w:tblPr>
-      <w:tblGrid>
-        <w:gridCol w:w="1728"/>
-        <w:gridCol w:w="1728"/>
-        <w:gridCol w:w="1728"/>
-        <w:gridCol w:w="1728"/>
-        <w:gridCol w:w="1728"/>
-      </w:tblGrid>
-      <w:tr>
-        <w:tc>
-          <w:tcPr>
-            <w:tcW w:type="dxa" w:w="1728"/>
-          </w:tcPr>
-          <w:p>
-            <w:r>
-              <w:t>What we measure</w:t>
-            </w:r>
-          </w:p>
-        </w:tc>
-        <w:tc>
-          <w:tcPr>
-            <w:tcW w:type="dxa" w:w="1728"/>
-          </w:tcPr>
-          <w:p>
-            <w:r>
-              <w:t>No history + scores</w:t>
-            </w:r>
-          </w:p>
-        </w:tc>
-        <w:tc>
-          <w:tcPr>
-            <w:tcW w:type="dxa" w:w="1728"/>
-          </w:tcPr>
-          <w:p>
-            <w:r>
-              <w:t>History + scores</w:t>
-            </w:r>
-          </w:p>
-        </w:tc>
-        <w:tc>
-          <w:tcPr>
-            <w:tcW w:type="dxa" w:w="1728"/>
-          </w:tcPr>
-          <w:p>
-            <w:r>
-              <w:t>Change</w:t>
-            </w:r>
-          </w:p>
-        </w:tc>
-        <w:tc>
-          <w:tcPr>
-            <w:tcW w:type="dxa" w:w="1728"/>
-          </w:tcPr>
-          <w:p>
-            <w:r>
-              <w:t>Better</w:t>
-            </w:r>
-          </w:p>
-        </w:tc>
-      </w:tr>
-      <w:tr>
-        <w:tc>
-          <w:tcPr>
-            <w:tcW w:type="dxa" w:w="1728"/>
-          </w:tcPr>
-          <w:p>
-            <w:r>
-              <w:t>Recall (answers found)</w:t>
-            </w:r>
-          </w:p>
-        </w:tc>
-        <w:tc>
-          <w:tcPr>
-            <w:tcW w:type="dxa" w:w="1728"/>
-          </w:tcPr>
-          <w:p>
-            <w:r>
-              <w:t>0.575</w:t>
-            </w:r>
-          </w:p>
-        </w:tc>
-        <w:tc>
-          <w:tcPr>
-            <w:tcW w:type="dxa" w:w="1728"/>
-          </w:tcPr>
-          <w:p>
-            <w:r>
-              <w:t>0.743</w:t>
-            </w:r>
-          </w:p>
-        </w:tc>
-        <w:tc>
-          <w:tcPr>
-            <w:tcW w:type="dxa" w:w="1728"/>
-          </w:tcPr>
-          <w:p>
-            <w:r>
-              <w:t>+0.168</w:t>
-            </w:r>
-          </w:p>
-        </w:tc>
-        <w:tc>
-          <w:tcPr>
-            <w:tcW w:type="dxa" w:w="1728"/>
-          </w:tcPr>
-          <w:p>
-            <w:r>
-              <w:t>→ History + scores</w:t>
-            </w:r>
-          </w:p>
-        </w:tc>
-      </w:tr>
-      <w:tr>
-        <w:tc>
-          <w:tcPr>
-            <w:tcW w:type="dxa" w:w="1728"/>
-          </w:tcPr>
-          <w:p>
-            <w:r>
-              <w:t>F1 (overall balance)</w:t>
-            </w:r>
-          </w:p>
-        </w:tc>
-        <w:tc>
-          <w:tcPr>
-            <w:tcW w:type="dxa" w:w="1728"/>
-          </w:tcPr>
-          <w:p>
-            <w:r>
-              <w:t>0.232</w:t>
-            </w:r>
-          </w:p>
-        </w:tc>
-        <w:tc>
-          <w:tcPr>
-            <w:tcW w:type="dxa" w:w="1728"/>
-          </w:tcPr>
-          <w:p>
-            <w:r>
-              <w:t>0.301</w:t>
-            </w:r>
-          </w:p>
-        </w:tc>
-        <w:tc>
-          <w:tcPr>
-            <w:tcW w:type="dxa" w:w="1728"/>
-          </w:tcPr>
-          <w:p>
-            <w:r>
-              <w:t>+0.069</w:t>
-            </w:r>
-          </w:p>
-        </w:tc>
-        <w:tc>
-          <w:tcPr>
-            <w:tcW w:type="dxa" w:w="1728"/>
-          </w:tcPr>
-          <w:p>
-            <w:r>
-              <w:t>→ History + scores</w:t>
-            </w:r>
-          </w:p>
-        </w:tc>
-      </w:tr>
-      <w:tr>
-        <w:tc>
-          <w:tcPr>
-            <w:tcW w:type="dxa" w:w="1728"/>
-          </w:tcPr>
-          <w:p>
-            <w:r>
-              <w:t>Easy tickets: found</w:t>
-            </w:r>
-          </w:p>
-        </w:tc>
-        <w:tc>
-          <w:tcPr>
-            <w:tcW w:type="dxa" w:w="1728"/>
-          </w:tcPr>
-          <w:p>
-            <w:r>
-              <w:t>0.676</w:t>
-            </w:r>
-          </w:p>
-        </w:tc>
-        <w:tc>
-          <w:tcPr>
-            <w:tcW w:type="dxa" w:w="1728"/>
-          </w:tcPr>
-          <w:p>
-            <w:r>
-              <w:t>0.848</w:t>
-            </w:r>
-          </w:p>
-        </w:tc>
-        <w:tc>
-          <w:tcPr>
-            <w:tcW w:type="dxa" w:w="1728"/>
-          </w:tcPr>
-          <w:p>
-            <w:r>
-              <w:t>+0.172</w:t>
-            </w:r>
-          </w:p>
-        </w:tc>
-        <w:tc>
-          <w:tcPr>
-            <w:tcW w:type="dxa" w:w="1728"/>
-          </w:tcPr>
-          <w:p>
-            <w:r>
-              <w:t>→ History + scores</w:t>
-            </w:r>
-          </w:p>
-        </w:tc>
-      </w:tr>
-      <w:tr>
-        <w:tc>
-          <w:tcPr>
-            <w:tcW w:type="dxa" w:w="1728"/>
-          </w:tcPr>
-          <w:p>
-            <w:r>
-              <w:t>Hard tickets: F1</w:t>
-            </w:r>
-          </w:p>
-        </w:tc>
-        <w:tc>
-          <w:tcPr>
-            <w:tcW w:type="dxa" w:w="1728"/>
-          </w:tcPr>
-          <w:p>
-            <w:r>
-              <w:t>0.347</w:t>
-            </w:r>
-          </w:p>
-        </w:tc>
-        <w:tc>
-          <w:tcPr>
-            <w:tcW w:type="dxa" w:w="1728"/>
-          </w:tcPr>
-          <w:p>
-            <w:r>
-              <w:t>0.454</w:t>
-            </w:r>
-          </w:p>
-        </w:tc>
-        <w:tc>
-          <w:tcPr>
-            <w:tcW w:type="dxa" w:w="1728"/>
-          </w:tcPr>
-          <w:p>
-            <w:r>
-              <w:t>+0.107</w:t>
-            </w:r>
-          </w:p>
-        </w:tc>
-        <w:tc>
-          <w:tcPr>
-            <w:tcW w:type="dxa" w:w="1728"/>
-          </w:tcPr>
-          <w:p>
-            <w:r>
-              <w:t>→ History + scores</w:t>
-            </w:r>
-          </w:p>
-        </w:tc>
-      </w:tr>
-      <w:tr>
-        <w:tc>
-          <w:tcPr>
-            <w:tcW w:type="dxa" w:w="1728"/>
-          </w:tcPr>
-          <w:p>
-            <w:r>
-              <w:t>Precedent use (lift)</w:t>
-            </w:r>
-          </w:p>
-        </w:tc>
-        <w:tc>
-          <w:tcPr>
-            <w:tcW w:type="dxa" w:w="1728"/>
-          </w:tcPr>
-          <w:p>
-            <w:r>
-              <w:t>0.000</w:t>
-            </w:r>
-          </w:p>
-        </w:tc>
-        <w:tc>
-          <w:tcPr>
-            <w:tcW w:type="dxa" w:w="1728"/>
-          </w:tcPr>
-          <w:p>
-            <w:r>
-              <w:t>0.348</w:t>
-            </w:r>
-          </w:p>
-        </w:tc>
-        <w:tc>
-          <w:tcPr>
-            <w:tcW w:type="dxa" w:w="1728"/>
-          </w:tcPr>
-          <w:p>
-            <w:r>
-              <w:t>+0.348</w:t>
-            </w:r>
-          </w:p>
-        </w:tc>
-        <w:tc>
-          <w:tcPr>
-            <w:tcW w:type="dxa" w:w="1728"/>
-          </w:tcPr>
-          <w:p>
-            <w:r>
-              <w:t>→ History + scores</w:t>
-            </w:r>
-          </w:p>
-        </w:tc>
-      </w:tr>
-      <w:tr>
-        <w:tc>
-          <w:tcPr>
-            <w:tcW w:type="dxa" w:w="1728"/>
-          </w:tcPr>
-          <w:p>
-            <w:r>
-              <w:t>Missed answers (count)</w:t>
-            </w:r>
-          </w:p>
-        </w:tc>
-        <w:tc>
-          <w:tcPr>
-            <w:tcW w:type="dxa" w:w="1728"/>
-          </w:tcPr>
-          <w:p>
-            <w:r>
-              <w:t>n/a</w:t>
-            </w:r>
-          </w:p>
-        </w:tc>
-        <w:tc>
-          <w:tcPr>
-            <w:tcW w:type="dxa" w:w="1728"/>
-          </w:tcPr>
-          <w:p>
-            <w:r>
-              <w:t>n/a</w:t>
-            </w:r>
-          </w:p>
-        </w:tc>
-        <w:tc>
-          <w:tcPr>
-            <w:tcW w:type="dxa" w:w="1728"/>
-          </w:tcPr>
-          <w:p>
-            <w:r>
-              <w:t>n/a</w:t>
-            </w:r>
-          </w:p>
-        </w:tc>
-        <w:tc>
-          <w:tcPr>
-            <w:tcW w:type="dxa" w:w="1728"/>
-          </w:tcPr>
-          <w:p>
-            <w:r>
-              <w:t>—</w:t>
-            </w:r>
-          </w:p>
-        </w:tc>
-      </w:tr>
-      <w:tr>
-        <w:tc>
-          <w:tcPr>
-            <w:tcW w:type="dxa" w:w="1728"/>
-          </w:tcPr>
-          <w:p>
-            <w:r>
-              <w:t>Typical time (s)</w:t>
-            </w:r>
-          </w:p>
-        </w:tc>
-        <w:tc>
-          <w:tcPr>
-            <w:tcW w:type="dxa" w:w="1728"/>
-          </w:tcPr>
-          <w:p>
-            <w:r>
-              <w:t>n/a</w:t>
-            </w:r>
-          </w:p>
-        </w:tc>
-        <w:tc>
-          <w:tcPr>
-            <w:tcW w:type="dxa" w:w="1728"/>
-          </w:tcPr>
-          <w:p>
-            <w:r>
-              <w:t>n/a</w:t>
-            </w:r>
-          </w:p>
-        </w:tc>
-        <w:tc>
-          <w:tcPr>
-            <w:tcW w:type="dxa" w:w="1728"/>
-          </w:tcPr>
-          <w:p>
-            <w:r>
-              <w:t>n/a</w:t>
-            </w:r>
-          </w:p>
-        </w:tc>
-        <w:tc>
-          <w:tcPr>
-            <w:tcW w:type="dxa" w:w="1728"/>
-          </w:tcPr>
-          <w:p>
-            <w:r>
-              <w:t>—</w:t>
-            </w:r>
-          </w:p>
-        </w:tc>
-      </w:tr>
-    </w:tbl>
-    <w:p>
-      <w:pPr>
-        <w:pStyle w:val="Heading2"/>
-      </w:pPr>
-      <w:r>
         <w:t>Do the search relevance scores help? (with past tickets)</w:t>
       </w:r>
     </w:p>
@@ -1553,452 +1107,6 @@
     </w:tbl>
     <w:p>
       <w:pPr>
-        <w:pStyle w:val="Heading2"/>
-      </w:pPr>
-      <w:r>
-        <w:t>Do the search relevance scores help? (no past tickets)</w:t>
-      </w:r>
-    </w:p>
-    <w:p>
-      <w:pPr>
-        <w:pStyle w:val="IntenseQuote"/>
-      </w:pPr>
-      <w:r>
-        <w:t>Comparing  "No history + scores"  →  "No history"</w:t>
-      </w:r>
-    </w:p>
-    <w:tbl>
-      <w:tblPr>
-        <w:tblStyle w:val="LightGrid-Accent1"/>
-        <w:tblW w:type="auto" w:w="0"/>
-        <w:tblLook w:firstColumn="1" w:firstRow="1" w:lastColumn="0" w:lastRow="0" w:noHBand="0" w:noVBand="1" w:val="04A0"/>
-      </w:tblPr>
-      <w:tblGrid>
-        <w:gridCol w:w="1728"/>
-        <w:gridCol w:w="1728"/>
-        <w:gridCol w:w="1728"/>
-        <w:gridCol w:w="1728"/>
-        <w:gridCol w:w="1728"/>
-      </w:tblGrid>
-      <w:tr>
-        <w:tc>
-          <w:tcPr>
-            <w:tcW w:type="dxa" w:w="1728"/>
-          </w:tcPr>
-          <w:p>
-            <w:r>
-              <w:t>What we measure</w:t>
-            </w:r>
-          </w:p>
-        </w:tc>
-        <w:tc>
-          <w:tcPr>
-            <w:tcW w:type="dxa" w:w="1728"/>
-          </w:tcPr>
-          <w:p>
-            <w:r>
-              <w:t>No history + scores</w:t>
-            </w:r>
-          </w:p>
-        </w:tc>
-        <w:tc>
-          <w:tcPr>
-            <w:tcW w:type="dxa" w:w="1728"/>
-          </w:tcPr>
-          <w:p>
-            <w:r>
-              <w:t>No history</w:t>
-            </w:r>
-          </w:p>
-        </w:tc>
-        <w:tc>
-          <w:tcPr>
-            <w:tcW w:type="dxa" w:w="1728"/>
-          </w:tcPr>
-          <w:p>
-            <w:r>
-              <w:t>Change</w:t>
-            </w:r>
-          </w:p>
-        </w:tc>
-        <w:tc>
-          <w:tcPr>
-            <w:tcW w:type="dxa" w:w="1728"/>
-          </w:tcPr>
-          <w:p>
-            <w:r>
-              <w:t>Better</w:t>
-            </w:r>
-          </w:p>
-        </w:tc>
-      </w:tr>
-      <w:tr>
-        <w:tc>
-          <w:tcPr>
-            <w:tcW w:type="dxa" w:w="1728"/>
-          </w:tcPr>
-          <w:p>
-            <w:r>
-              <w:t>Recall (answers found)</w:t>
-            </w:r>
-          </w:p>
-        </w:tc>
-        <w:tc>
-          <w:tcPr>
-            <w:tcW w:type="dxa" w:w="1728"/>
-          </w:tcPr>
-          <w:p>
-            <w:r>
-              <w:t>0.575</w:t>
-            </w:r>
-          </w:p>
-        </w:tc>
-        <w:tc>
-          <w:tcPr>
-            <w:tcW w:type="dxa" w:w="1728"/>
-          </w:tcPr>
-          <w:p>
-            <w:r>
-              <w:t>0.588</w:t>
-            </w:r>
-          </w:p>
-        </w:tc>
-        <w:tc>
-          <w:tcPr>
-            <w:tcW w:type="dxa" w:w="1728"/>
-          </w:tcPr>
-          <w:p>
-            <w:r>
-              <w:t>+0.013</w:t>
-            </w:r>
-          </w:p>
-        </w:tc>
-        <w:tc>
-          <w:tcPr>
-            <w:tcW w:type="dxa" w:w="1728"/>
-          </w:tcPr>
-          <w:p>
-            <w:r>
-              <w:t>→ No history</w:t>
-            </w:r>
-          </w:p>
-        </w:tc>
-      </w:tr>
-      <w:tr>
-        <w:tc>
-          <w:tcPr>
-            <w:tcW w:type="dxa" w:w="1728"/>
-          </w:tcPr>
-          <w:p>
-            <w:r>
-              <w:t>F1 (overall balance)</w:t>
-            </w:r>
-          </w:p>
-        </w:tc>
-        <w:tc>
-          <w:tcPr>
-            <w:tcW w:type="dxa" w:w="1728"/>
-          </w:tcPr>
-          <w:p>
-            <w:r>
-              <w:t>0.232</w:t>
-            </w:r>
-          </w:p>
-        </w:tc>
-        <w:tc>
-          <w:tcPr>
-            <w:tcW w:type="dxa" w:w="1728"/>
-          </w:tcPr>
-          <w:p>
-            <w:r>
-              <w:t>0.237</w:t>
-            </w:r>
-          </w:p>
-        </w:tc>
-        <w:tc>
-          <w:tcPr>
-            <w:tcW w:type="dxa" w:w="1728"/>
-          </w:tcPr>
-          <w:p>
-            <w:r>
-              <w:t>+0.005</w:t>
-            </w:r>
-          </w:p>
-        </w:tc>
-        <w:tc>
-          <w:tcPr>
-            <w:tcW w:type="dxa" w:w="1728"/>
-          </w:tcPr>
-          <w:p>
-            <w:r>
-              <w:t>→ No history</w:t>
-            </w:r>
-          </w:p>
-        </w:tc>
-      </w:tr>
-      <w:tr>
-        <w:tc>
-          <w:tcPr>
-            <w:tcW w:type="dxa" w:w="1728"/>
-          </w:tcPr>
-          <w:p>
-            <w:r>
-              <w:t>Easy tickets: found</w:t>
-            </w:r>
-          </w:p>
-        </w:tc>
-        <w:tc>
-          <w:tcPr>
-            <w:tcW w:type="dxa" w:w="1728"/>
-          </w:tcPr>
-          <w:p>
-            <w:r>
-              <w:t>0.676</w:t>
-            </w:r>
-          </w:p>
-        </w:tc>
-        <w:tc>
-          <w:tcPr>
-            <w:tcW w:type="dxa" w:w="1728"/>
-          </w:tcPr>
-          <w:p>
-            <w:r>
-              <w:t>0.676</w:t>
-            </w:r>
-          </w:p>
-        </w:tc>
-        <w:tc>
-          <w:tcPr>
-            <w:tcW w:type="dxa" w:w="1728"/>
-          </w:tcPr>
-          <w:p>
-            <w:r>
-              <w:t>+0.000</w:t>
-            </w:r>
-          </w:p>
-        </w:tc>
-        <w:tc>
-          <w:tcPr>
-            <w:tcW w:type="dxa" w:w="1728"/>
-          </w:tcPr>
-          <w:p>
-            <w:r>
-              <w:t>→ No history</w:t>
-            </w:r>
-          </w:p>
-        </w:tc>
-      </w:tr>
-      <w:tr>
-        <w:tc>
-          <w:tcPr>
-            <w:tcW w:type="dxa" w:w="1728"/>
-          </w:tcPr>
-          <w:p>
-            <w:r>
-              <w:t>Hard tickets: F1</w:t>
-            </w:r>
-          </w:p>
-        </w:tc>
-        <w:tc>
-          <w:tcPr>
-            <w:tcW w:type="dxa" w:w="1728"/>
-          </w:tcPr>
-          <w:p>
-            <w:r>
-              <w:t>0.347</w:t>
-            </w:r>
-          </w:p>
-        </w:tc>
-        <w:tc>
-          <w:tcPr>
-            <w:tcW w:type="dxa" w:w="1728"/>
-          </w:tcPr>
-          <w:p>
-            <w:r>
-              <w:t>0.358</w:t>
-            </w:r>
-          </w:p>
-        </w:tc>
-        <w:tc>
-          <w:tcPr>
-            <w:tcW w:type="dxa" w:w="1728"/>
-          </w:tcPr>
-          <w:p>
-            <w:r>
-              <w:t>+0.011</w:t>
-            </w:r>
-          </w:p>
-        </w:tc>
-        <w:tc>
-          <w:tcPr>
-            <w:tcW w:type="dxa" w:w="1728"/>
-          </w:tcPr>
-          <w:p>
-            <w:r>
-              <w:t>→ No history</w:t>
-            </w:r>
-          </w:p>
-        </w:tc>
-      </w:tr>
-      <w:tr>
-        <w:tc>
-          <w:tcPr>
-            <w:tcW w:type="dxa" w:w="1728"/>
-          </w:tcPr>
-          <w:p>
-            <w:r>
-              <w:t>Precedent use (lift)</w:t>
-            </w:r>
-          </w:p>
-        </w:tc>
-        <w:tc>
-          <w:tcPr>
-            <w:tcW w:type="dxa" w:w="1728"/>
-          </w:tcPr>
-          <w:p>
-            <w:r>
-              <w:t>0.000</w:t>
-            </w:r>
-          </w:p>
-        </w:tc>
-        <w:tc>
-          <w:tcPr>
-            <w:tcW w:type="dxa" w:w="1728"/>
-          </w:tcPr>
-          <w:p>
-            <w:r>
-              <w:t>0.050</w:t>
-            </w:r>
-          </w:p>
-        </w:tc>
-        <w:tc>
-          <w:tcPr>
-            <w:tcW w:type="dxa" w:w="1728"/>
-          </w:tcPr>
-          <w:p>
-            <w:r>
-              <w:t>+0.050</w:t>
-            </w:r>
-          </w:p>
-        </w:tc>
-        <w:tc>
-          <w:tcPr>
-            <w:tcW w:type="dxa" w:w="1728"/>
-          </w:tcPr>
-          <w:p>
-            <w:r>
-              <w:t>→ No history</w:t>
-            </w:r>
-          </w:p>
-        </w:tc>
-      </w:tr>
-      <w:tr>
-        <w:tc>
-          <w:tcPr>
-            <w:tcW w:type="dxa" w:w="1728"/>
-          </w:tcPr>
-          <w:p>
-            <w:r>
-              <w:t>Missed answers (count)</w:t>
-            </w:r>
-          </w:p>
-        </w:tc>
-        <w:tc>
-          <w:tcPr>
-            <w:tcW w:type="dxa" w:w="1728"/>
-          </w:tcPr>
-          <w:p>
-            <w:r>
-              <w:t>n/a</w:t>
-            </w:r>
-          </w:p>
-        </w:tc>
-        <w:tc>
-          <w:tcPr>
-            <w:tcW w:type="dxa" w:w="1728"/>
-          </w:tcPr>
-          <w:p>
-            <w:r>
-              <w:t>63</w:t>
-            </w:r>
-          </w:p>
-        </w:tc>
-        <w:tc>
-          <w:tcPr>
-            <w:tcW w:type="dxa" w:w="1728"/>
-          </w:tcPr>
-          <w:p>
-            <w:r>
-              <w:t>n/a</w:t>
-            </w:r>
-          </w:p>
-        </w:tc>
-        <w:tc>
-          <w:tcPr>
-            <w:tcW w:type="dxa" w:w="1728"/>
-          </w:tcPr>
-          <w:p>
-            <w:r>
-              <w:t>—</w:t>
-            </w:r>
-          </w:p>
-        </w:tc>
-      </w:tr>
-      <w:tr>
-        <w:tc>
-          <w:tcPr>
-            <w:tcW w:type="dxa" w:w="1728"/>
-          </w:tcPr>
-          <w:p>
-            <w:r>
-              <w:t>Typical time (s)</w:t>
-            </w:r>
-          </w:p>
-        </w:tc>
-        <w:tc>
-          <w:tcPr>
-            <w:tcW w:type="dxa" w:w="1728"/>
-          </w:tcPr>
-          <w:p>
-            <w:r>
-              <w:t>n/a</w:t>
-            </w:r>
-          </w:p>
-        </w:tc>
-        <w:tc>
-          <w:tcPr>
-            <w:tcW w:type="dxa" w:w="1728"/>
-          </w:tcPr>
-          <w:p>
-            <w:r>
-              <w:t>5.200</w:t>
-            </w:r>
-          </w:p>
-        </w:tc>
-        <w:tc>
-          <w:tcPr>
-            <w:tcW w:type="dxa" w:w="1728"/>
-          </w:tcPr>
-          <w:p>
-            <w:r>
-              <w:t>n/a</w:t>
-            </w:r>
-          </w:p>
-        </w:tc>
-        <w:tc>
-          <w:tcPr>
-            <w:tcW w:type="dxa" w:w="1728"/>
-          </w:tcPr>
-          <w:p>
-            <w:r>
-              <w:t>—</w:t>
-            </w:r>
-          </w:p>
-        </w:tc>
-      </w:tr>
-    </w:tbl>
-    <w:p>
-      <w:pPr>
         <w:pStyle w:val="Heading1"/>
       </w:pPr>
       <w:r>
@@ -2159,14 +1267,19 @@
     </w:p>
     <w:p>
       <w:r>
-        <w:t>This splits recall two ways: correct answers that appeared in the past-ticket examples, vs correct answers that didn't. A big gap means the model leans on precedent. A gap near zero (as in the no-history approaches) means the examples aren't doing anything.</w:t>
+        <w:t>We split the correct answers into two groups: ones that appeared in the similar past tickets, and ones that didn't, then measure recall for each. A big gap means the model leans on precedent.</w:t>
+      </w:r>
+    </w:p>
+    <w:p>
+      <w:r>
+        <w:t>Important: the similar past tickets are ALWAYS fetched (we need them to compute this split), but they are only SHOWN to the model in the 'History' approaches. The 'No history' approaches are the control — the tickets are fetched but withheld. That is why 'No history' still has two bars: the split is about whether an answer was IN the fetched tickets, not whether the model saw them. In the control the two bars are nearly equal (being in the hidden tickets changes nothing), and in the 'History' approaches a wide gap opens up — that gap is the proof the examples are doing the work. A run with no bar at all is an older run that did not record this.</w:t>
       </w:r>
     </w:p>
     <w:p>
       <w:r>
         <w:drawing>
           <wp:inline xmlns:a="http://schemas.openxmlformats.org/drawingml/2006/main" xmlns:pic="http://schemas.openxmlformats.org/drawingml/2006/picture">
-            <wp:extent cx="5669280" cy="3365450"/>
+            <wp:extent cx="5669280" cy="3283057"/>
             <wp:docPr id="4" name="Picture 4"/>
             <wp:cNvGraphicFramePr>
               <a:graphicFrameLocks noChangeAspect="1"/>
@@ -2187,7 +1300,7 @@
                   <pic:spPr>
                     <a:xfrm>
                       <a:off x="0" y="0"/>
-                      <a:ext cx="5669280" cy="3365450"/>
+                      <a:ext cx="5669280" cy="3283057"/>
                     </a:xfrm>
                     <a:prstGeom prst="rect"/>
                   </pic:spPr>
@@ -2581,6 +1694,14 @@
       </w:tr>
     </w:tbl>
     <w:p>
+      <w:r>
+        <w:rPr>
+          <w:i/>
+        </w:rPr>
+        <w:t>Recall-type numbers are shown as percentages; F1 as a 0-1 score. Older runs that predate a metric show 'n/a' (not zero) elsewhere in this report.</w:t>
+      </w:r>
+    </w:p>
+    <w:p>
       <w:pPr>
         <w:pStyle w:val="Heading1"/>
       </w:pPr>

</xml_diff>

<commit_message>
compare_eval: richer, consistent report (cohort recall, retrieval depth, capture, miss-source, latency)
Address the 'lazy doc' feedback:
- Cohorts: show RECALL for easy AND hard (was recall vs F1 - apples to oranges),
  plus a full per-cohort P/R/F1/n table.
- Retrieval: add the search-depth curve (R@3/@5/@10), and a 'where do misses go'
  table (never-retrieved / filtered / model-dropped) that proves ~100% of misses
  are the model's choice, not retrieval.
- New capture section: ceiling capture (recall/ceiling) + precedent capture.
- Latency: add median (typical) alongside avg/slowest, table, and an outlier flag
  when avg >> median (the 9837s retry-storm ticket).
- Precedent section now shows ONLY approaches that actually show past tickets to
  the model (--history-run); no-history controls are left out to avoid confusion.
- Glossary expanded for the new metrics.

Co-Authored-By: Claude Opus 4.8 <noreply@anthropic.com>
</commit_message>
<xml_diff>
--- a/out/eval/comparison_all_modes.docx
+++ b/out/eval/comparison_all_modes.docx
@@ -72,7 +72,7 @@
           </w:tcPr>
           <w:p>
             <w:r>
-              <w:t>All 50 Value Streams offered, with search relevance scores shown. No past tickets.</w:t>
+              <w:t>All 50 Value Streams offered with search relevance scores. No past tickets shown.</w:t>
             </w:r>
           </w:p>
         </w:tc>
@@ -94,7 +94,7 @@
           </w:tcPr>
           <w:p>
             <w:r>
-              <w:t>All 50 Value Streams offered, scores hidden. No past tickets.</w:t>
+              <w:t>All 50 Value Streams offered, scores hidden. No past tickets shown.</w:t>
             </w:r>
           </w:p>
         </w:tc>
@@ -1164,9 +1164,492 @@
     </w:p>
     <w:p>
       <w:r>
-        <w:t>Easy tickets have one correct Value Stream (we track how often we find it). Hard tickets have two or more (we track F1). An approach that improves BOTH is genuinely better — not just better at the easy ones. Here, "History + scores" leads on both: easy 85% found, hard F1 0.45.</w:t>
+        <w:t>Tickets split by how many correct Value Streams they have: EASY = exactly one, HARD = two or more. The chart shows RECALL for both (same metric, apples to apples) — of the correct answers on that kind of ticket, how many we found. An approach that lifts BOTH is genuinely better, not just better at the easy ones. "History + scores" leads on easy (85% found) and on hard (n/a found).</w:t>
       </w:r>
     </w:p>
+    <w:p>
+      <w:r>
+        <w:t>Full per-cohort breakdown (Precision / Recall / F1, and how many tickets are in each group):</w:t>
+      </w:r>
+    </w:p>
+    <w:tbl>
+      <w:tblPr>
+        <w:tblStyle w:val="LightGrid-Accent1"/>
+        <w:tblW w:type="auto" w:w="0"/>
+        <w:tblLook w:firstColumn="1" w:firstRow="1" w:lastColumn="0" w:lastRow="0" w:noHBand="0" w:noVBand="1" w:val="04A0"/>
+      </w:tblPr>
+      <w:tblGrid>
+        <w:gridCol w:w="960"/>
+        <w:gridCol w:w="960"/>
+        <w:gridCol w:w="960"/>
+        <w:gridCol w:w="960"/>
+        <w:gridCol w:w="960"/>
+        <w:gridCol w:w="960"/>
+        <w:gridCol w:w="960"/>
+        <w:gridCol w:w="960"/>
+        <w:gridCol w:w="960"/>
+      </w:tblGrid>
+      <w:tr>
+        <w:tc>
+          <w:tcPr>
+            <w:tcW w:type="dxa" w:w="960"/>
+          </w:tcPr>
+          <w:p>
+            <w:r>
+              <w:t>Approach</w:t>
+            </w:r>
+          </w:p>
+        </w:tc>
+        <w:tc>
+          <w:tcPr>
+            <w:tcW w:type="dxa" w:w="960"/>
+          </w:tcPr>
+          <w:p>
+            <w:r>
+              <w:t>Easy n</w:t>
+            </w:r>
+          </w:p>
+        </w:tc>
+        <w:tc>
+          <w:tcPr>
+            <w:tcW w:type="dxa" w:w="960"/>
+          </w:tcPr>
+          <w:p>
+            <w:r>
+              <w:t>Easy P</w:t>
+            </w:r>
+          </w:p>
+        </w:tc>
+        <w:tc>
+          <w:tcPr>
+            <w:tcW w:type="dxa" w:w="960"/>
+          </w:tcPr>
+          <w:p>
+            <w:r>
+              <w:t>Easy R</w:t>
+            </w:r>
+          </w:p>
+        </w:tc>
+        <w:tc>
+          <w:tcPr>
+            <w:tcW w:type="dxa" w:w="960"/>
+          </w:tcPr>
+          <w:p>
+            <w:r>
+              <w:t>Easy F1</w:t>
+            </w:r>
+          </w:p>
+        </w:tc>
+        <w:tc>
+          <w:tcPr>
+            <w:tcW w:type="dxa" w:w="960"/>
+          </w:tcPr>
+          <w:p>
+            <w:r>
+              <w:t>Hard n</w:t>
+            </w:r>
+          </w:p>
+        </w:tc>
+        <w:tc>
+          <w:tcPr>
+            <w:tcW w:type="dxa" w:w="960"/>
+          </w:tcPr>
+          <w:p>
+            <w:r>
+              <w:t>Hard P</w:t>
+            </w:r>
+          </w:p>
+        </w:tc>
+        <w:tc>
+          <w:tcPr>
+            <w:tcW w:type="dxa" w:w="960"/>
+          </w:tcPr>
+          <w:p>
+            <w:r>
+              <w:t>Hard R</w:t>
+            </w:r>
+          </w:p>
+        </w:tc>
+        <w:tc>
+          <w:tcPr>
+            <w:tcW w:type="dxa" w:w="960"/>
+          </w:tcPr>
+          <w:p>
+            <w:r>
+              <w:t>Hard F1</w:t>
+            </w:r>
+          </w:p>
+        </w:tc>
+      </w:tr>
+      <w:tr>
+        <w:tc>
+          <w:tcPr>
+            <w:tcW w:type="dxa" w:w="960"/>
+          </w:tcPr>
+          <w:p>
+            <w:r>
+              <w:t>No history + scores</w:t>
+            </w:r>
+          </w:p>
+        </w:tc>
+        <w:tc>
+          <w:tcPr>
+            <w:tcW w:type="dxa" w:w="960"/>
+          </w:tcPr>
+          <w:p>
+            <w:r>
+              <w:t>-</w:t>
+            </w:r>
+          </w:p>
+        </w:tc>
+        <w:tc>
+          <w:tcPr>
+            <w:tcW w:type="dxa" w:w="960"/>
+          </w:tcPr>
+          <w:p>
+            <w:r>
+              <w:t>n/a</w:t>
+            </w:r>
+          </w:p>
+        </w:tc>
+        <w:tc>
+          <w:tcPr>
+            <w:tcW w:type="dxa" w:w="960"/>
+          </w:tcPr>
+          <w:p>
+            <w:r>
+              <w:t>68%</w:t>
+            </w:r>
+          </w:p>
+        </w:tc>
+        <w:tc>
+          <w:tcPr>
+            <w:tcW w:type="dxa" w:w="960"/>
+          </w:tcPr>
+          <w:p>
+            <w:r>
+              <w:t>n/a</w:t>
+            </w:r>
+          </w:p>
+        </w:tc>
+        <w:tc>
+          <w:tcPr>
+            <w:tcW w:type="dxa" w:w="960"/>
+          </w:tcPr>
+          <w:p>
+            <w:r>
+              <w:t>-</w:t>
+            </w:r>
+          </w:p>
+        </w:tc>
+        <w:tc>
+          <w:tcPr>
+            <w:tcW w:type="dxa" w:w="960"/>
+          </w:tcPr>
+          <w:p>
+            <w:r>
+              <w:t>n/a</w:t>
+            </w:r>
+          </w:p>
+        </w:tc>
+        <w:tc>
+          <w:tcPr>
+            <w:tcW w:type="dxa" w:w="960"/>
+          </w:tcPr>
+          <w:p>
+            <w:r>
+              <w:t>n/a</w:t>
+            </w:r>
+          </w:p>
+        </w:tc>
+        <w:tc>
+          <w:tcPr>
+            <w:tcW w:type="dxa" w:w="960"/>
+          </w:tcPr>
+          <w:p>
+            <w:r>
+              <w:t>0.35</w:t>
+            </w:r>
+          </w:p>
+        </w:tc>
+      </w:tr>
+      <w:tr>
+        <w:tc>
+          <w:tcPr>
+            <w:tcW w:type="dxa" w:w="960"/>
+          </w:tcPr>
+          <w:p>
+            <w:r>
+              <w:t>No history</w:t>
+            </w:r>
+          </w:p>
+        </w:tc>
+        <w:tc>
+          <w:tcPr>
+            <w:tcW w:type="dxa" w:w="960"/>
+          </w:tcPr>
+          <w:p>
+            <w:r>
+              <w:t>35</w:t>
+            </w:r>
+          </w:p>
+        </w:tc>
+        <w:tc>
+          <w:tcPr>
+            <w:tcW w:type="dxa" w:w="960"/>
+          </w:tcPr>
+          <w:p>
+            <w:r>
+              <w:t>7%</w:t>
+            </w:r>
+          </w:p>
+        </w:tc>
+        <w:tc>
+          <w:tcPr>
+            <w:tcW w:type="dxa" w:w="960"/>
+          </w:tcPr>
+          <w:p>
+            <w:r>
+              <w:t>68%</w:t>
+            </w:r>
+          </w:p>
+        </w:tc>
+        <w:tc>
+          <w:tcPr>
+            <w:tcW w:type="dxa" w:w="960"/>
+          </w:tcPr>
+          <w:p>
+            <w:r>
+              <w:t>0.12</w:t>
+            </w:r>
+          </w:p>
+        </w:tc>
+        <w:tc>
+          <w:tcPr>
+            <w:tcW w:type="dxa" w:w="960"/>
+          </w:tcPr>
+          <w:p>
+            <w:r>
+              <w:t>25</w:t>
+            </w:r>
+          </w:p>
+        </w:tc>
+        <w:tc>
+          <w:tcPr>
+            <w:tcW w:type="dxa" w:w="960"/>
+          </w:tcPr>
+          <w:p>
+            <w:r>
+              <w:t>26%</w:t>
+            </w:r>
+          </w:p>
+        </w:tc>
+        <w:tc>
+          <w:tcPr>
+            <w:tcW w:type="dxa" w:w="960"/>
+          </w:tcPr>
+          <w:p>
+            <w:r>
+              <w:t>56%</w:t>
+            </w:r>
+          </w:p>
+        </w:tc>
+        <w:tc>
+          <w:tcPr>
+            <w:tcW w:type="dxa" w:w="960"/>
+          </w:tcPr>
+          <w:p>
+            <w:r>
+              <w:t>0.36</w:t>
+            </w:r>
+          </w:p>
+        </w:tc>
+      </w:tr>
+      <w:tr>
+        <w:tc>
+          <w:tcPr>
+            <w:tcW w:type="dxa" w:w="960"/>
+          </w:tcPr>
+          <w:p>
+            <w:r>
+              <w:t>History + scores</w:t>
+            </w:r>
+          </w:p>
+        </w:tc>
+        <w:tc>
+          <w:tcPr>
+            <w:tcW w:type="dxa" w:w="960"/>
+          </w:tcPr>
+          <w:p>
+            <w:r>
+              <w:t>-</w:t>
+            </w:r>
+          </w:p>
+        </w:tc>
+        <w:tc>
+          <w:tcPr>
+            <w:tcW w:type="dxa" w:w="960"/>
+          </w:tcPr>
+          <w:p>
+            <w:r>
+              <w:t>n/a</w:t>
+            </w:r>
+          </w:p>
+        </w:tc>
+        <w:tc>
+          <w:tcPr>
+            <w:tcW w:type="dxa" w:w="960"/>
+          </w:tcPr>
+          <w:p>
+            <w:r>
+              <w:t>85%</w:t>
+            </w:r>
+          </w:p>
+        </w:tc>
+        <w:tc>
+          <w:tcPr>
+            <w:tcW w:type="dxa" w:w="960"/>
+          </w:tcPr>
+          <w:p>
+            <w:r>
+              <w:t>n/a</w:t>
+            </w:r>
+          </w:p>
+        </w:tc>
+        <w:tc>
+          <w:tcPr>
+            <w:tcW w:type="dxa" w:w="960"/>
+          </w:tcPr>
+          <w:p>
+            <w:r>
+              <w:t>-</w:t>
+            </w:r>
+          </w:p>
+        </w:tc>
+        <w:tc>
+          <w:tcPr>
+            <w:tcW w:type="dxa" w:w="960"/>
+          </w:tcPr>
+          <w:p>
+            <w:r>
+              <w:t>n/a</w:t>
+            </w:r>
+          </w:p>
+        </w:tc>
+        <w:tc>
+          <w:tcPr>
+            <w:tcW w:type="dxa" w:w="960"/>
+          </w:tcPr>
+          <w:p>
+            <w:r>
+              <w:t>n/a</w:t>
+            </w:r>
+          </w:p>
+        </w:tc>
+        <w:tc>
+          <w:tcPr>
+            <w:tcW w:type="dxa" w:w="960"/>
+          </w:tcPr>
+          <w:p>
+            <w:r>
+              <w:t>0.45</w:t>
+            </w:r>
+          </w:p>
+        </w:tc>
+      </w:tr>
+      <w:tr>
+        <w:tc>
+          <w:tcPr>
+            <w:tcW w:type="dxa" w:w="960"/>
+          </w:tcPr>
+          <w:p>
+            <w:r>
+              <w:t>History</w:t>
+            </w:r>
+          </w:p>
+        </w:tc>
+        <w:tc>
+          <w:tcPr>
+            <w:tcW w:type="dxa" w:w="960"/>
+          </w:tcPr>
+          <w:p>
+            <w:r>
+              <w:t>35</w:t>
+            </w:r>
+          </w:p>
+        </w:tc>
+        <w:tc>
+          <w:tcPr>
+            <w:tcW w:type="dxa" w:w="960"/>
+          </w:tcPr>
+          <w:p>
+            <w:r>
+              <w:t>8%</w:t>
+            </w:r>
+          </w:p>
+        </w:tc>
+        <w:tc>
+          <w:tcPr>
+            <w:tcW w:type="dxa" w:w="960"/>
+          </w:tcPr>
+          <w:p>
+            <w:r>
+              <w:t>84%</w:t>
+            </w:r>
+          </w:p>
+        </w:tc>
+        <w:tc>
+          <w:tcPr>
+            <w:tcW w:type="dxa" w:w="960"/>
+          </w:tcPr>
+          <w:p>
+            <w:r>
+              <w:t>0.15</w:t>
+            </w:r>
+          </w:p>
+        </w:tc>
+        <w:tc>
+          <w:tcPr>
+            <w:tcW w:type="dxa" w:w="960"/>
+          </w:tcPr>
+          <w:p>
+            <w:r>
+              <w:t>25</w:t>
+            </w:r>
+          </w:p>
+        </w:tc>
+        <w:tc>
+          <w:tcPr>
+            <w:tcW w:type="dxa" w:w="960"/>
+          </w:tcPr>
+          <w:p>
+            <w:r>
+              <w:t>32%</w:t>
+            </w:r>
+          </w:p>
+        </w:tc>
+        <w:tc>
+          <w:tcPr>
+            <w:tcW w:type="dxa" w:w="960"/>
+          </w:tcPr>
+          <w:p>
+            <w:r>
+              <w:t>69%</w:t>
+            </w:r>
+          </w:p>
+        </w:tc>
+        <w:tc>
+          <w:tcPr>
+            <w:tcW w:type="dxa" w:w="960"/>
+          </w:tcPr>
+          <w:p>
+            <w:r>
+              <w:t>0.44</w:t>
+            </w:r>
+          </w:p>
+        </w:tc>
+      </w:tr>
+    </w:tbl>
     <w:p>
       <w:r>
         <w:drawing>
@@ -1213,19 +1696,19 @@
     </w:p>
     <w:p>
       <w:r>
-        <w:t>Before the model chooses, the system has to put the correct Value Streams in front of it — it can't pick what it never sees. This is the ceiling on how well any approach can do.</w:t>
+        <w:t>Before the model can choose, the system has to put the correct Value Streams in front of it — it can't pick what it never sees. This section is about the SYSTEM, not the model: how good is retrieval, and what is the ceiling every approach is working under.</w:t>
       </w:r>
     </w:p>
     <w:p>
       <w:r>
-        <w:t>Search ranking alone is weak: its top 10 contained only 26% of the correct answers. But the past-ticket examples contained 89%, and because we hand the model the FULL 50-stream catalogue every time, 100% of the correct answers are always on the table. So retrieval is NOT the bottleneck — every miss is the model choosing wrong from a complete list, which is why the choice of prompt/approach matters so much.</w:t>
+        <w:t>Two ways the system can surface a correct answer. (1) Semantic search ranking: weak — its top 10 holds only 26% of the correct answers (top 3: 11%, top 5: 14% — it barely improves with depth, so the embedding ranks the right streams poorly). (2) Similar past tickets: strong — they hold 89% of the correct answers. And because we hand the model the FULL 50-stream catalogue every time, 100% of the correct answers are ALWAYS on the table.</w:t>
       </w:r>
     </w:p>
     <w:p>
       <w:r>
         <w:drawing>
           <wp:inline xmlns:a="http://schemas.openxmlformats.org/drawingml/2006/main" xmlns:pic="http://schemas.openxmlformats.org/drawingml/2006/picture">
-            <wp:extent cx="5669280" cy="3365450"/>
+            <wp:extent cx="5669280" cy="3496786"/>
             <wp:docPr id="3" name="Picture 3"/>
             <wp:cNvGraphicFramePr>
               <a:graphicFrameLocks noChangeAspect="1"/>
@@ -1239,6 +1722,511 @@
                   </pic:nvPicPr>
                   <pic:blipFill>
                     <a:blip r:embed="rId11"/>
+                    <a:stretch>
+                      <a:fillRect/>
+                    </a:stretch>
+                  </pic:blipFill>
+                  <pic:spPr>
+                    <a:xfrm>
+                      <a:off x="0" y="0"/>
+                      <a:ext cx="5669280" cy="3496786"/>
+                    </a:xfrm>
+                    <a:prstGeom prst="rect"/>
+                  </pic:spPr>
+                </pic:pic>
+              </a:graphicData>
+            </a:graphic>
+          </wp:inline>
+        </w:drawing>
+      </w:r>
+    </w:p>
+    <w:p>
+      <w:r>
+        <w:t>So retrieval is not the bottleneck. With the whole catalogue always present, every miss is the model choosing wrong from a complete list — which is exactly why the prompt / approach is the lever, not the search. The table below makes that concrete: of all the correct answers the model MISSED, where did they go?</w:t>
+      </w:r>
+    </w:p>
+    <w:tbl>
+      <w:tblPr>
+        <w:tblStyle w:val="LightGrid-Accent1"/>
+        <w:tblW w:type="auto" w:w="0"/>
+        <w:tblLook w:firstColumn="1" w:firstRow="1" w:lastColumn="0" w:lastRow="0" w:noHBand="0" w:noVBand="1" w:val="04A0"/>
+      </w:tblPr>
+      <w:tblGrid>
+        <w:gridCol w:w="1728"/>
+        <w:gridCol w:w="1728"/>
+        <w:gridCol w:w="1728"/>
+        <w:gridCol w:w="1728"/>
+        <w:gridCol w:w="1728"/>
+      </w:tblGrid>
+      <w:tr>
+        <w:tc>
+          <w:tcPr>
+            <w:tcW w:type="dxa" w:w="1728"/>
+          </w:tcPr>
+          <w:p>
+            <w:r>
+              <w:t>Approach</w:t>
+            </w:r>
+          </w:p>
+        </w:tc>
+        <w:tc>
+          <w:tcPr>
+            <w:tcW w:type="dxa" w:w="1728"/>
+          </w:tcPr>
+          <w:p>
+            <w:r>
+              <w:t>Never retrieved</w:t>
+            </w:r>
+          </w:p>
+        </w:tc>
+        <w:tc>
+          <w:tcPr>
+            <w:tcW w:type="dxa" w:w="1728"/>
+          </w:tcPr>
+          <w:p>
+            <w:r>
+              <w:t>Filtered before model</w:t>
+            </w:r>
+          </w:p>
+        </w:tc>
+        <w:tc>
+          <w:tcPr>
+            <w:tcW w:type="dxa" w:w="1728"/>
+          </w:tcPr>
+          <w:p>
+            <w:r>
+              <w:t>Model saw it, dropped it</w:t>
+            </w:r>
+          </w:p>
+        </w:tc>
+        <w:tc>
+          <w:tcPr>
+            <w:tcW w:type="dxa" w:w="1728"/>
+          </w:tcPr>
+          <w:p>
+            <w:r>
+              <w:t>% misses = model's choice</w:t>
+            </w:r>
+          </w:p>
+        </w:tc>
+      </w:tr>
+      <w:tr>
+        <w:tc>
+          <w:tcPr>
+            <w:tcW w:type="dxa" w:w="1728"/>
+          </w:tcPr>
+          <w:p>
+            <w:r>
+              <w:t>No history + scores</w:t>
+            </w:r>
+          </w:p>
+        </w:tc>
+        <w:tc>
+          <w:tcPr>
+            <w:tcW w:type="dxa" w:w="1728"/>
+          </w:tcPr>
+          <w:p>
+            <w:r>
+              <w:t>n/a</w:t>
+            </w:r>
+          </w:p>
+        </w:tc>
+        <w:tc>
+          <w:tcPr>
+            <w:tcW w:type="dxa" w:w="1728"/>
+          </w:tcPr>
+          <w:p>
+            <w:r>
+              <w:t>n/a</w:t>
+            </w:r>
+          </w:p>
+        </w:tc>
+        <w:tc>
+          <w:tcPr>
+            <w:tcW w:type="dxa" w:w="1728"/>
+          </w:tcPr>
+          <w:p>
+            <w:r>
+              <w:t>n/a</w:t>
+            </w:r>
+          </w:p>
+        </w:tc>
+        <w:tc>
+          <w:tcPr>
+            <w:tcW w:type="dxa" w:w="1728"/>
+          </w:tcPr>
+          <w:p>
+            <w:r>
+              <w:t>n/a</w:t>
+            </w:r>
+          </w:p>
+        </w:tc>
+      </w:tr>
+      <w:tr>
+        <w:tc>
+          <w:tcPr>
+            <w:tcW w:type="dxa" w:w="1728"/>
+          </w:tcPr>
+          <w:p>
+            <w:r>
+              <w:t>No history</w:t>
+            </w:r>
+          </w:p>
+        </w:tc>
+        <w:tc>
+          <w:tcPr>
+            <w:tcW w:type="dxa" w:w="1728"/>
+          </w:tcPr>
+          <w:p>
+            <w:r>
+              <w:t>0</w:t>
+            </w:r>
+          </w:p>
+        </w:tc>
+        <w:tc>
+          <w:tcPr>
+            <w:tcW w:type="dxa" w:w="1728"/>
+          </w:tcPr>
+          <w:p>
+            <w:r>
+              <w:t>0</w:t>
+            </w:r>
+          </w:p>
+        </w:tc>
+        <w:tc>
+          <w:tcPr>
+            <w:tcW w:type="dxa" w:w="1728"/>
+          </w:tcPr>
+          <w:p>
+            <w:r>
+              <w:t>63</w:t>
+            </w:r>
+          </w:p>
+        </w:tc>
+        <w:tc>
+          <w:tcPr>
+            <w:tcW w:type="dxa" w:w="1728"/>
+          </w:tcPr>
+          <w:p>
+            <w:r>
+              <w:t>100%</w:t>
+            </w:r>
+          </w:p>
+        </w:tc>
+      </w:tr>
+      <w:tr>
+        <w:tc>
+          <w:tcPr>
+            <w:tcW w:type="dxa" w:w="1728"/>
+          </w:tcPr>
+          <w:p>
+            <w:r>
+              <w:t>History + scores</w:t>
+            </w:r>
+          </w:p>
+        </w:tc>
+        <w:tc>
+          <w:tcPr>
+            <w:tcW w:type="dxa" w:w="1728"/>
+          </w:tcPr>
+          <w:p>
+            <w:r>
+              <w:t>n/a</w:t>
+            </w:r>
+          </w:p>
+        </w:tc>
+        <w:tc>
+          <w:tcPr>
+            <w:tcW w:type="dxa" w:w="1728"/>
+          </w:tcPr>
+          <w:p>
+            <w:r>
+              <w:t>n/a</w:t>
+            </w:r>
+          </w:p>
+        </w:tc>
+        <w:tc>
+          <w:tcPr>
+            <w:tcW w:type="dxa" w:w="1728"/>
+          </w:tcPr>
+          <w:p>
+            <w:r>
+              <w:t>n/a</w:t>
+            </w:r>
+          </w:p>
+        </w:tc>
+        <w:tc>
+          <w:tcPr>
+            <w:tcW w:type="dxa" w:w="1728"/>
+          </w:tcPr>
+          <w:p>
+            <w:r>
+              <w:t>n/a</w:t>
+            </w:r>
+          </w:p>
+        </w:tc>
+      </w:tr>
+      <w:tr>
+        <w:tc>
+          <w:tcPr>
+            <w:tcW w:type="dxa" w:w="1728"/>
+          </w:tcPr>
+          <w:p>
+            <w:r>
+              <w:t>History</w:t>
+            </w:r>
+          </w:p>
+        </w:tc>
+        <w:tc>
+          <w:tcPr>
+            <w:tcW w:type="dxa" w:w="1728"/>
+          </w:tcPr>
+          <w:p>
+            <w:r>
+              <w:t>0</w:t>
+            </w:r>
+          </w:p>
+        </w:tc>
+        <w:tc>
+          <w:tcPr>
+            <w:tcW w:type="dxa" w:w="1728"/>
+          </w:tcPr>
+          <w:p>
+            <w:r>
+              <w:t>0</w:t>
+            </w:r>
+          </w:p>
+        </w:tc>
+        <w:tc>
+          <w:tcPr>
+            <w:tcW w:type="dxa" w:w="1728"/>
+          </w:tcPr>
+          <w:p>
+            <w:r>
+              <w:t>42</w:t>
+            </w:r>
+          </w:p>
+        </w:tc>
+        <w:tc>
+          <w:tcPr>
+            <w:tcW w:type="dxa" w:w="1728"/>
+          </w:tcPr>
+          <w:p>
+            <w:r>
+              <w:t>100%</w:t>
+            </w:r>
+          </w:p>
+        </w:tc>
+      </w:tr>
+    </w:tbl>
+    <w:p>
+      <w:r>
+        <w:t>'Never retrieved' and 'filtered before model' are retrieval/system failures; 'model saw it, dropped it' is the model's choice. When that last column is ~100%, the only way to improve is the model's selection (prompt, examples) — retrieval has already done its job.</w:t>
+      </w:r>
+    </w:p>
+    <w:p>
+      <w:pPr>
+        <w:pStyle w:val="Heading1"/>
+      </w:pPr>
+      <w:r>
+        <w:t>4. How much of what's available does the model actually pick?</w:t>
+      </w:r>
+    </w:p>
+    <w:p>
+      <w:r>
+        <w:t>Two capture rates. CEILING CAPTURE = of all the correct answers shown to the model, how many it picked (recall as a share of the ceiling). PRECEDENT CAPTURE = of the correct answers that appeared in the shown past tickets, how many it picked. The second only applies to approaches that actually show past tickets, so the no-history approaches are left out of it.</w:t>
+      </w:r>
+    </w:p>
+    <w:tbl>
+      <w:tblPr>
+        <w:tblStyle w:val="LightGrid-Accent1"/>
+        <w:tblW w:type="auto" w:w="0"/>
+        <w:tblLook w:firstColumn="1" w:firstRow="1" w:lastColumn="0" w:lastRow="0" w:noHBand="0" w:noVBand="1" w:val="04A0"/>
+      </w:tblPr>
+      <w:tblGrid>
+        <w:gridCol w:w="2880"/>
+        <w:gridCol w:w="2880"/>
+        <w:gridCol w:w="2880"/>
+      </w:tblGrid>
+      <w:tr>
+        <w:tc>
+          <w:tcPr>
+            <w:tcW w:type="dxa" w:w="2880"/>
+          </w:tcPr>
+          <w:p>
+            <w:r>
+              <w:t>Approach</w:t>
+            </w:r>
+          </w:p>
+        </w:tc>
+        <w:tc>
+          <w:tcPr>
+            <w:tcW w:type="dxa" w:w="2880"/>
+          </w:tcPr>
+          <w:p>
+            <w:r>
+              <w:t>Capture of everything shown</w:t>
+            </w:r>
+          </w:p>
+        </w:tc>
+        <w:tc>
+          <w:tcPr>
+            <w:tcW w:type="dxa" w:w="2880"/>
+          </w:tcPr>
+          <w:p>
+            <w:r>
+              <w:t>Capture of precedent (history only)</w:t>
+            </w:r>
+          </w:p>
+        </w:tc>
+      </w:tr>
+      <w:tr>
+        <w:tc>
+          <w:tcPr>
+            <w:tcW w:type="dxa" w:w="2880"/>
+          </w:tcPr>
+          <w:p>
+            <w:r>
+              <w:t>No history + scores</w:t>
+            </w:r>
+          </w:p>
+        </w:tc>
+        <w:tc>
+          <w:tcPr>
+            <w:tcW w:type="dxa" w:w="2880"/>
+          </w:tcPr>
+          <w:p>
+            <w:r>
+              <w:t>57%</w:t>
+            </w:r>
+          </w:p>
+        </w:tc>
+        <w:tc>
+          <w:tcPr>
+            <w:tcW w:type="dxa" w:w="2880"/>
+          </w:tcPr>
+          <w:p>
+            <w:r>
+              <w:t>—</w:t>
+            </w:r>
+          </w:p>
+        </w:tc>
+      </w:tr>
+      <w:tr>
+        <w:tc>
+          <w:tcPr>
+            <w:tcW w:type="dxa" w:w="2880"/>
+          </w:tcPr>
+          <w:p>
+            <w:r>
+              <w:t>No history</w:t>
+            </w:r>
+          </w:p>
+        </w:tc>
+        <w:tc>
+          <w:tcPr>
+            <w:tcW w:type="dxa" w:w="2880"/>
+          </w:tcPr>
+          <w:p>
+            <w:r>
+              <w:t>59%</w:t>
+            </w:r>
+          </w:p>
+        </w:tc>
+        <w:tc>
+          <w:tcPr>
+            <w:tcW w:type="dxa" w:w="2880"/>
+          </w:tcPr>
+          <w:p>
+            <w:r>
+              <w:t>—</w:t>
+            </w:r>
+          </w:p>
+        </w:tc>
+      </w:tr>
+      <w:tr>
+        <w:tc>
+          <w:tcPr>
+            <w:tcW w:type="dxa" w:w="2880"/>
+          </w:tcPr>
+          <w:p>
+            <w:r>
+              <w:t>History + scores</w:t>
+            </w:r>
+          </w:p>
+        </w:tc>
+        <w:tc>
+          <w:tcPr>
+            <w:tcW w:type="dxa" w:w="2880"/>
+          </w:tcPr>
+          <w:p>
+            <w:r>
+              <w:t>74%</w:t>
+            </w:r>
+          </w:p>
+        </w:tc>
+        <w:tc>
+          <w:tcPr>
+            <w:tcW w:type="dxa" w:w="2880"/>
+          </w:tcPr>
+          <w:p>
+            <w:r>
+              <w:t>89%</w:t>
+            </w:r>
+          </w:p>
+        </w:tc>
+      </w:tr>
+      <w:tr>
+        <w:tc>
+          <w:tcPr>
+            <w:tcW w:type="dxa" w:w="2880"/>
+          </w:tcPr>
+          <w:p>
+            <w:r>
+              <w:t>History</w:t>
+            </w:r>
+          </w:p>
+        </w:tc>
+        <w:tc>
+          <w:tcPr>
+            <w:tcW w:type="dxa" w:w="2880"/>
+          </w:tcPr>
+          <w:p>
+            <w:r>
+              <w:t>73%</w:t>
+            </w:r>
+          </w:p>
+        </w:tc>
+        <w:tc>
+          <w:tcPr>
+            <w:tcW w:type="dxa" w:w="2880"/>
+          </w:tcPr>
+          <w:p>
+            <w:r>
+              <w:t>86%</w:t>
+            </w:r>
+          </w:p>
+        </w:tc>
+      </w:tr>
+    </w:tbl>
+    <w:p>
+      <w:r>
+        <w:drawing>
+          <wp:inline xmlns:a="http://schemas.openxmlformats.org/drawingml/2006/main" xmlns:pic="http://schemas.openxmlformats.org/drawingml/2006/picture">
+            <wp:extent cx="5669280" cy="3365450"/>
+            <wp:docPr id="4" name="Picture 4"/>
+            <wp:cNvGraphicFramePr>
+              <a:graphicFrameLocks noChangeAspect="1"/>
+            </wp:cNvGraphicFramePr>
+            <a:graphic>
+              <a:graphicData uri="http://schemas.openxmlformats.org/drawingml/2006/picture">
+                <pic:pic>
+                  <pic:nvPicPr>
+                    <pic:cNvPr id="0" name="capture.png"/>
+                    <pic:cNvPicPr/>
+                  </pic:nvPicPr>
+                  <pic:blipFill>
+                    <a:blip r:embed="rId12"/>
                     <a:stretch>
                       <a:fillRect/>
                     </a:stretch>
@@ -1262,25 +2250,25 @@
         <w:pStyle w:val="Heading1"/>
       </w:pPr>
       <w:r>
-        <w:t>4. Does the model actually use the past examples?</w:t>
+        <w:t>5. When past tickets are shown, does the model use them?</w:t>
       </w:r>
     </w:p>
     <w:p>
       <w:r>
-        <w:t>We split the correct answers into two groups: ones that appeared in the similar past tickets, and ones that didn't, then measure recall for each. A big gap means the model leans on precedent.</w:t>
+        <w:t>Only the approaches that actually SHOW past tickets to the model appear here. We split the correct answers into ones that were in the shown past tickets vs ones that weren't, and measure recall for each. A big gap means the model is leaning on the precedent rather than ignoring it.</w:t>
       </w:r>
     </w:p>
     <w:p>
       <w:r>
-        <w:t>Important: the similar past tickets are ALWAYS fetched (we need them to compute this split), but they are only SHOWN to the model in the 'History' approaches. The 'No history' approaches are the control — the tickets are fetched but withheld. That is why 'No history' still has two bars: the split is about whether an answer was IN the fetched tickets, not whether the model saw them. In the control the two bars are nearly equal (being in the hidden tickets changes nothing), and in the 'History' approaches a wide gap opens up — that gap is the proof the examples are doing the work. A run with no bar at all is an older run that did not record this.</w:t>
+        <w:t>In "History + scores", an answer shown in the past tickets is picked 79% of the time vs 44% when it isn't — a +35% lift. There is still headroom: the past tickets CONTAIN 89% of the correct answers but the model only USES 79%, so ~10% of right answers sit in front of it unpicked — a more trusting prompt or more past tickets could capture them.</w:t>
       </w:r>
     </w:p>
     <w:p>
       <w:r>
         <w:drawing>
           <wp:inline xmlns:a="http://schemas.openxmlformats.org/drawingml/2006/main" xmlns:pic="http://schemas.openxmlformats.org/drawingml/2006/picture">
-            <wp:extent cx="5669280" cy="3283057"/>
-            <wp:docPr id="4" name="Picture 4"/>
+            <wp:extent cx="5669280" cy="3365450"/>
+            <wp:docPr id="5" name="Picture 5"/>
             <wp:cNvGraphicFramePr>
               <a:graphicFrameLocks noChangeAspect="1"/>
             </wp:cNvGraphicFramePr>
@@ -1292,7 +2280,7 @@
                     <pic:cNvPicPr/>
                   </pic:nvPicPr>
                   <pic:blipFill>
-                    <a:blip r:embed="rId12"/>
+                    <a:blip r:embed="rId13"/>
                     <a:stretch>
                       <a:fillRect/>
                     </a:stretch>
@@ -1300,7 +2288,7 @@
                   <pic:spPr>
                     <a:xfrm>
                       <a:off x="0" y="0"/>
-                      <a:ext cx="5669280" cy="3283057"/>
+                      <a:ext cx="5669280" cy="3365450"/>
                     </a:xfrm>
                     <a:prstGeom prst="rect"/>
                   </pic:spPr>
@@ -1316,20 +2304,243 @@
         <w:pStyle w:val="Heading1"/>
       </w:pPr>
       <w:r>
-        <w:t>5. Time per prediction</w:t>
+        <w:t>6. Time per prediction</w:t>
       </w:r>
     </w:p>
     <w:p>
       <w:r>
-        <w:t>Average and slowest seconds per ticket (the eval-only scoring calls are excluded). A very large 'slowest' next to a small average usually means one ticket hit a retry/backoff storm, not real compute — worth a look, but it doesn't reflect typical speed.</w:t>
+        <w:t>Three numbers per approach: AVERAGE, TYPICAL (median), and SLOWEST seconds per ticket (the eval-only scoring calls are excluded). Read the median for typical speed: if the average is far above the median, one or two tickets hit a retry/backoff storm and dragged the mean up — that is an outlier to investigate, not the real speed.</w:t>
       </w:r>
     </w:p>
+    <w:tbl>
+      <w:tblPr>
+        <w:tblStyle w:val="LightGrid-Accent1"/>
+        <w:tblW w:type="auto" w:w="0"/>
+        <w:tblLook w:firstColumn="1" w:firstRow="1" w:lastColumn="0" w:lastRow="0" w:noHBand="0" w:noVBand="1" w:val="04A0"/>
+      </w:tblPr>
+      <w:tblGrid>
+        <w:gridCol w:w="2160"/>
+        <w:gridCol w:w="2160"/>
+        <w:gridCol w:w="2160"/>
+        <w:gridCol w:w="2160"/>
+      </w:tblGrid>
+      <w:tr>
+        <w:tc>
+          <w:tcPr>
+            <w:tcW w:type="dxa" w:w="2160"/>
+          </w:tcPr>
+          <w:p>
+            <w:r>
+              <w:t>Approach</w:t>
+            </w:r>
+          </w:p>
+        </w:tc>
+        <w:tc>
+          <w:tcPr>
+            <w:tcW w:type="dxa" w:w="2160"/>
+          </w:tcPr>
+          <w:p>
+            <w:r>
+              <w:t>Average</w:t>
+            </w:r>
+          </w:p>
+        </w:tc>
+        <w:tc>
+          <w:tcPr>
+            <w:tcW w:type="dxa" w:w="2160"/>
+          </w:tcPr>
+          <w:p>
+            <w:r>
+              <w:t>Typical (median)</w:t>
+            </w:r>
+          </w:p>
+        </w:tc>
+        <w:tc>
+          <w:tcPr>
+            <w:tcW w:type="dxa" w:w="2160"/>
+          </w:tcPr>
+          <w:p>
+            <w:r>
+              <w:t>Slowest</w:t>
+            </w:r>
+          </w:p>
+        </w:tc>
+      </w:tr>
+      <w:tr>
+        <w:tc>
+          <w:tcPr>
+            <w:tcW w:type="dxa" w:w="2160"/>
+          </w:tcPr>
+          <w:p>
+            <w:r>
+              <w:t>No history + scores</w:t>
+            </w:r>
+          </w:p>
+        </w:tc>
+        <w:tc>
+          <w:tcPr>
+            <w:tcW w:type="dxa" w:w="2160"/>
+          </w:tcPr>
+          <w:p>
+            <w:r>
+              <w:t>5.6s</w:t>
+            </w:r>
+          </w:p>
+        </w:tc>
+        <w:tc>
+          <w:tcPr>
+            <w:tcW w:type="dxa" w:w="2160"/>
+          </w:tcPr>
+          <w:p>
+            <w:r>
+              <w:t>n/a</w:t>
+            </w:r>
+          </w:p>
+        </w:tc>
+        <w:tc>
+          <w:tcPr>
+            <w:tcW w:type="dxa" w:w="2160"/>
+          </w:tcPr>
+          <w:p>
+            <w:r>
+              <w:t>8.8s</w:t>
+            </w:r>
+          </w:p>
+        </w:tc>
+      </w:tr>
+      <w:tr>
+        <w:tc>
+          <w:tcPr>
+            <w:tcW w:type="dxa" w:w="2160"/>
+          </w:tcPr>
+          <w:p>
+            <w:r>
+              <w:t>No history</w:t>
+            </w:r>
+          </w:p>
+        </w:tc>
+        <w:tc>
+          <w:tcPr>
+            <w:tcW w:type="dxa" w:w="2160"/>
+          </w:tcPr>
+          <w:p>
+            <w:r>
+              <w:t>5.3s</w:t>
+            </w:r>
+          </w:p>
+        </w:tc>
+        <w:tc>
+          <w:tcPr>
+            <w:tcW w:type="dxa" w:w="2160"/>
+          </w:tcPr>
+          <w:p>
+            <w:r>
+              <w:t>5.2s</w:t>
+            </w:r>
+          </w:p>
+        </w:tc>
+        <w:tc>
+          <w:tcPr>
+            <w:tcW w:type="dxa" w:w="2160"/>
+          </w:tcPr>
+          <w:p>
+            <w:r>
+              <w:t>9.4s</w:t>
+            </w:r>
+          </w:p>
+        </w:tc>
+      </w:tr>
+      <w:tr>
+        <w:tc>
+          <w:tcPr>
+            <w:tcW w:type="dxa" w:w="2160"/>
+          </w:tcPr>
+          <w:p>
+            <w:r>
+              <w:t>History + scores</w:t>
+            </w:r>
+          </w:p>
+        </w:tc>
+        <w:tc>
+          <w:tcPr>
+            <w:tcW w:type="dxa" w:w="2160"/>
+          </w:tcPr>
+          <w:p>
+            <w:r>
+              <w:t>5.4s</w:t>
+            </w:r>
+          </w:p>
+        </w:tc>
+        <w:tc>
+          <w:tcPr>
+            <w:tcW w:type="dxa" w:w="2160"/>
+          </w:tcPr>
+          <w:p>
+            <w:r>
+              <w:t>n/a</w:t>
+            </w:r>
+          </w:p>
+        </w:tc>
+        <w:tc>
+          <w:tcPr>
+            <w:tcW w:type="dxa" w:w="2160"/>
+          </w:tcPr>
+          <w:p>
+            <w:r>
+              <w:t>7.2s</w:t>
+            </w:r>
+          </w:p>
+        </w:tc>
+      </w:tr>
+      <w:tr>
+        <w:tc>
+          <w:tcPr>
+            <w:tcW w:type="dxa" w:w="2160"/>
+          </w:tcPr>
+          <w:p>
+            <w:r>
+              <w:t>History</w:t>
+            </w:r>
+          </w:p>
+        </w:tc>
+        <w:tc>
+          <w:tcPr>
+            <w:tcW w:type="dxa" w:w="2160"/>
+          </w:tcPr>
+          <w:p>
+            <w:r>
+              <w:t>59.9s</w:t>
+            </w:r>
+          </w:p>
+        </w:tc>
+        <w:tc>
+          <w:tcPr>
+            <w:tcW w:type="dxa" w:w="2160"/>
+          </w:tcPr>
+          <w:p>
+            <w:r>
+              <w:t>5.1s</w:t>
+            </w:r>
+          </w:p>
+        </w:tc>
+        <w:tc>
+          <w:tcPr>
+            <w:tcW w:type="dxa" w:w="2160"/>
+          </w:tcPr>
+          <w:p>
+            <w:r>
+              <w:t>9836.8s  ⚠ avg inflated by an outlier</w:t>
+            </w:r>
+          </w:p>
+        </w:tc>
+      </w:tr>
+    </w:tbl>
     <w:p>
       <w:r>
         <w:drawing>
           <wp:inline xmlns:a="http://schemas.openxmlformats.org/drawingml/2006/main" xmlns:pic="http://schemas.openxmlformats.org/drawingml/2006/picture">
             <wp:extent cx="5669280" cy="3261559"/>
-            <wp:docPr id="5" name="Picture 5"/>
+            <wp:docPr id="6" name="Picture 6"/>
             <wp:cNvGraphicFramePr>
               <a:graphicFrameLocks noChangeAspect="1"/>
             </wp:cNvGraphicFramePr>
@@ -1341,7 +2552,7 @@
                     <pic:cNvPicPr/>
                   </pic:nvPicPr>
                   <pic:blipFill>
-                    <a:blip r:embed="rId13"/>
+                    <a:blip r:embed="rId14"/>
                     <a:stretch>
                       <a:fillRect/>
                     </a:stretch>
@@ -1375,17 +2586,19 @@
         <w:tblLook w:firstColumn="1" w:firstRow="1" w:lastColumn="0" w:lastRow="0" w:noHBand="0" w:noVBand="1" w:val="04A0"/>
       </w:tblPr>
       <w:tblGrid>
-        <w:gridCol w:w="1440"/>
-        <w:gridCol w:w="1440"/>
-        <w:gridCol w:w="1440"/>
-        <w:gridCol w:w="1440"/>
-        <w:gridCol w:w="1440"/>
-        <w:gridCol w:w="1440"/>
+        <w:gridCol w:w="1080"/>
+        <w:gridCol w:w="1080"/>
+        <w:gridCol w:w="1080"/>
+        <w:gridCol w:w="1080"/>
+        <w:gridCol w:w="1080"/>
+        <w:gridCol w:w="1080"/>
+        <w:gridCol w:w="1080"/>
+        <w:gridCol w:w="1080"/>
       </w:tblGrid>
       <w:tr>
         <w:tc>
           <w:tcPr>
-            <w:tcW w:type="dxa" w:w="1440"/>
+            <w:tcW w:type="dxa" w:w="1080"/>
           </w:tcPr>
           <w:p>
             <w:r>
@@ -1395,7 +2608,7 @@
         </w:tc>
         <w:tc>
           <w:tcPr>
-            <w:tcW w:type="dxa" w:w="1440"/>
+            <w:tcW w:type="dxa" w:w="1080"/>
           </w:tcPr>
           <w:p>
             <w:r>
@@ -1405,7 +2618,7 @@
         </w:tc>
         <w:tc>
           <w:tcPr>
-            <w:tcW w:type="dxa" w:w="1440"/>
+            <w:tcW w:type="dxa" w:w="1080"/>
           </w:tcPr>
           <w:p>
             <w:r>
@@ -1415,7 +2628,7 @@
         </w:tc>
         <w:tc>
           <w:tcPr>
-            <w:tcW w:type="dxa" w:w="1440"/>
+            <w:tcW w:type="dxa" w:w="1080"/>
           </w:tcPr>
           <w:p>
             <w:r>
@@ -1425,21 +2638,41 @@
         </w:tc>
         <w:tc>
           <w:tcPr>
-            <w:tcW w:type="dxa" w:w="1440"/>
+            <w:tcW w:type="dxa" w:w="1080"/>
           </w:tcPr>
           <w:p>
             <w:r>
-              <w:t>Easy: found</w:t>
+              <w:t>Easy R</w:t>
             </w:r>
           </w:p>
         </w:tc>
         <w:tc>
           <w:tcPr>
-            <w:tcW w:type="dxa" w:w="1440"/>
+            <w:tcW w:type="dxa" w:w="1080"/>
           </w:tcPr>
           <w:p>
             <w:r>
-              <w:t>Hard: F1</w:t>
+              <w:t>Hard R</w:t>
+            </w:r>
+          </w:p>
+        </w:tc>
+        <w:tc>
+          <w:tcPr>
+            <w:tcW w:type="dxa" w:w="1080"/>
+          </w:tcPr>
+          <w:p>
+            <w:r>
+              <w:t>Precedent lift</w:t>
+            </w:r>
+          </w:p>
+        </w:tc>
+        <w:tc>
+          <w:tcPr>
+            <w:tcW w:type="dxa" w:w="1080"/>
+          </w:tcPr>
+          <w:p>
+            <w:r>
+              <w:t>Typical time</w:t>
             </w:r>
           </w:p>
         </w:tc>
@@ -1447,7 +2680,7 @@
       <w:tr>
         <w:tc>
           <w:tcPr>
-            <w:tcW w:type="dxa" w:w="1440"/>
+            <w:tcW w:type="dxa" w:w="1080"/>
           </w:tcPr>
           <w:p>
             <w:r>
@@ -1457,7 +2690,7 @@
         </w:tc>
         <w:tc>
           <w:tcPr>
-            <w:tcW w:type="dxa" w:w="1440"/>
+            <w:tcW w:type="dxa" w:w="1080"/>
           </w:tcPr>
           <w:p>
             <w:r>
@@ -1467,7 +2700,7 @@
         </w:tc>
         <w:tc>
           <w:tcPr>
-            <w:tcW w:type="dxa" w:w="1440"/>
+            <w:tcW w:type="dxa" w:w="1080"/>
           </w:tcPr>
           <w:p>
             <w:r>
@@ -1477,7 +2710,7 @@
         </w:tc>
         <w:tc>
           <w:tcPr>
-            <w:tcW w:type="dxa" w:w="1440"/>
+            <w:tcW w:type="dxa" w:w="1080"/>
           </w:tcPr>
           <w:p>
             <w:r>
@@ -1487,7 +2720,7 @@
         </w:tc>
         <w:tc>
           <w:tcPr>
-            <w:tcW w:type="dxa" w:w="1440"/>
+            <w:tcW w:type="dxa" w:w="1080"/>
           </w:tcPr>
           <w:p>
             <w:r>
@@ -1497,11 +2730,31 @@
         </w:tc>
         <w:tc>
           <w:tcPr>
-            <w:tcW w:type="dxa" w:w="1440"/>
+            <w:tcW w:type="dxa" w:w="1080"/>
           </w:tcPr>
           <w:p>
             <w:r>
-              <w:t>0.35</w:t>
+              <w:t>n/a</w:t>
+            </w:r>
+          </w:p>
+        </w:tc>
+        <w:tc>
+          <w:tcPr>
+            <w:tcW w:type="dxa" w:w="1080"/>
+          </w:tcPr>
+          <w:p>
+            <w:r>
+              <w:t>+0.00</w:t>
+            </w:r>
+          </w:p>
+        </w:tc>
+        <w:tc>
+          <w:tcPr>
+            <w:tcW w:type="dxa" w:w="1080"/>
+          </w:tcPr>
+          <w:p>
+            <w:r>
+              <w:t>n/a</w:t>
             </w:r>
           </w:p>
         </w:tc>
@@ -1509,7 +2762,7 @@
       <w:tr>
         <w:tc>
           <w:tcPr>
-            <w:tcW w:type="dxa" w:w="1440"/>
+            <w:tcW w:type="dxa" w:w="1080"/>
           </w:tcPr>
           <w:p>
             <w:r>
@@ -1519,7 +2772,7 @@
         </w:tc>
         <w:tc>
           <w:tcPr>
-            <w:tcW w:type="dxa" w:w="1440"/>
+            <w:tcW w:type="dxa" w:w="1080"/>
           </w:tcPr>
           <w:p>
             <w:r>
@@ -1529,7 +2782,7 @@
         </w:tc>
         <w:tc>
           <w:tcPr>
-            <w:tcW w:type="dxa" w:w="1440"/>
+            <w:tcW w:type="dxa" w:w="1080"/>
           </w:tcPr>
           <w:p>
             <w:r>
@@ -1539,7 +2792,7 @@
         </w:tc>
         <w:tc>
           <w:tcPr>
-            <w:tcW w:type="dxa" w:w="1440"/>
+            <w:tcW w:type="dxa" w:w="1080"/>
           </w:tcPr>
           <w:p>
             <w:r>
@@ -1549,7 +2802,7 @@
         </w:tc>
         <w:tc>
           <w:tcPr>
-            <w:tcW w:type="dxa" w:w="1440"/>
+            <w:tcW w:type="dxa" w:w="1080"/>
           </w:tcPr>
           <w:p>
             <w:r>
@@ -1559,11 +2812,31 @@
         </w:tc>
         <w:tc>
           <w:tcPr>
-            <w:tcW w:type="dxa" w:w="1440"/>
+            <w:tcW w:type="dxa" w:w="1080"/>
           </w:tcPr>
           <w:p>
             <w:r>
-              <w:t>0.36</w:t>
+              <w:t>56%</w:t>
+            </w:r>
+          </w:p>
+        </w:tc>
+        <w:tc>
+          <w:tcPr>
+            <w:tcW w:type="dxa" w:w="1080"/>
+          </w:tcPr>
+          <w:p>
+            <w:r>
+              <w:t>+0.05</w:t>
+            </w:r>
+          </w:p>
+        </w:tc>
+        <w:tc>
+          <w:tcPr>
+            <w:tcW w:type="dxa" w:w="1080"/>
+          </w:tcPr>
+          <w:p>
+            <w:r>
+              <w:t>5.2s</w:t>
             </w:r>
           </w:p>
         </w:tc>
@@ -1571,7 +2844,7 @@
       <w:tr>
         <w:tc>
           <w:tcPr>
-            <w:tcW w:type="dxa" w:w="1440"/>
+            <w:tcW w:type="dxa" w:w="1080"/>
           </w:tcPr>
           <w:p>
             <w:r>
@@ -1581,7 +2854,7 @@
         </w:tc>
         <w:tc>
           <w:tcPr>
-            <w:tcW w:type="dxa" w:w="1440"/>
+            <w:tcW w:type="dxa" w:w="1080"/>
           </w:tcPr>
           <w:p>
             <w:r>
@@ -1591,7 +2864,7 @@
         </w:tc>
         <w:tc>
           <w:tcPr>
-            <w:tcW w:type="dxa" w:w="1440"/>
+            <w:tcW w:type="dxa" w:w="1080"/>
           </w:tcPr>
           <w:p>
             <w:r>
@@ -1601,7 +2874,7 @@
         </w:tc>
         <w:tc>
           <w:tcPr>
-            <w:tcW w:type="dxa" w:w="1440"/>
+            <w:tcW w:type="dxa" w:w="1080"/>
           </w:tcPr>
           <w:p>
             <w:r>
@@ -1611,7 +2884,7 @@
         </w:tc>
         <w:tc>
           <w:tcPr>
-            <w:tcW w:type="dxa" w:w="1440"/>
+            <w:tcW w:type="dxa" w:w="1080"/>
           </w:tcPr>
           <w:p>
             <w:r>
@@ -1621,11 +2894,31 @@
         </w:tc>
         <w:tc>
           <w:tcPr>
-            <w:tcW w:type="dxa" w:w="1440"/>
+            <w:tcW w:type="dxa" w:w="1080"/>
           </w:tcPr>
           <w:p>
             <w:r>
-              <w:t>0.45</w:t>
+              <w:t>n/a</w:t>
+            </w:r>
+          </w:p>
+        </w:tc>
+        <w:tc>
+          <w:tcPr>
+            <w:tcW w:type="dxa" w:w="1080"/>
+          </w:tcPr>
+          <w:p>
+            <w:r>
+              <w:t>+0.35</w:t>
+            </w:r>
+          </w:p>
+        </w:tc>
+        <w:tc>
+          <w:tcPr>
+            <w:tcW w:type="dxa" w:w="1080"/>
+          </w:tcPr>
+          <w:p>
+            <w:r>
+              <w:t>n/a</w:t>
             </w:r>
           </w:p>
         </w:tc>
@@ -1633,7 +2926,7 @@
       <w:tr>
         <w:tc>
           <w:tcPr>
-            <w:tcW w:type="dxa" w:w="1440"/>
+            <w:tcW w:type="dxa" w:w="1080"/>
           </w:tcPr>
           <w:p>
             <w:r>
@@ -1643,7 +2936,7 @@
         </w:tc>
         <w:tc>
           <w:tcPr>
-            <w:tcW w:type="dxa" w:w="1440"/>
+            <w:tcW w:type="dxa" w:w="1080"/>
           </w:tcPr>
           <w:p>
             <w:r>
@@ -1653,7 +2946,7 @@
         </w:tc>
         <w:tc>
           <w:tcPr>
-            <w:tcW w:type="dxa" w:w="1440"/>
+            <w:tcW w:type="dxa" w:w="1080"/>
           </w:tcPr>
           <w:p>
             <w:r>
@@ -1663,7 +2956,7 @@
         </w:tc>
         <w:tc>
           <w:tcPr>
-            <w:tcW w:type="dxa" w:w="1440"/>
+            <w:tcW w:type="dxa" w:w="1080"/>
           </w:tcPr>
           <w:p>
             <w:r>
@@ -1673,7 +2966,7 @@
         </w:tc>
         <w:tc>
           <w:tcPr>
-            <w:tcW w:type="dxa" w:w="1440"/>
+            <w:tcW w:type="dxa" w:w="1080"/>
           </w:tcPr>
           <w:p>
             <w:r>
@@ -1683,11 +2976,31 @@
         </w:tc>
         <w:tc>
           <w:tcPr>
-            <w:tcW w:type="dxa" w:w="1440"/>
+            <w:tcW w:type="dxa" w:w="1080"/>
           </w:tcPr>
           <w:p>
             <w:r>
-              <w:t>0.44</w:t>
+              <w:t>69%</w:t>
+            </w:r>
+          </w:p>
+        </w:tc>
+        <w:tc>
+          <w:tcPr>
+            <w:tcW w:type="dxa" w:w="1080"/>
+          </w:tcPr>
+          <w:p>
+            <w:r>
+              <w:t>+0.31</w:t>
+            </w:r>
+          </w:p>
+        </w:tc>
+        <w:tc>
+          <w:tcPr>
+            <w:tcW w:type="dxa" w:w="1080"/>
+          </w:tcPr>
+          <w:p>
+            <w:r>
+              <w:t>5.1s</w:t>
             </w:r>
           </w:p>
         </w:tc>
@@ -1924,7 +3237,7 @@
           </w:tcPr>
           <w:p>
             <w:r>
-              <w:t>Shown to the model</w:t>
+              <w:t>Ceiling</w:t>
             </w:r>
           </w:p>
         </w:tc>
@@ -1934,7 +3247,95 @@
           </w:tcPr>
           <w:p>
             <w:r>
-              <w:t>The fraction of correct answers that were on the candidate list at all (the ceiling).</w:t>
+              <w:t>The fraction of correct answers that were on the candidate list at all - the best any approach could possibly score. Here it's ~100% because the full catalogue is always shown.</w:t>
+            </w:r>
+          </w:p>
+        </w:tc>
+      </w:tr>
+      <w:tr>
+        <w:tc>
+          <w:tcPr>
+            <w:tcW w:type="dxa" w:w="4320"/>
+          </w:tcPr>
+          <w:p>
+            <w:r>
+              <w:t>Ceiling capture</w:t>
+            </w:r>
+          </w:p>
+        </w:tc>
+        <w:tc>
+          <w:tcPr>
+            <w:tcW w:type="dxa" w:w="4320"/>
+          </w:tcPr>
+          <w:p>
+            <w:r>
+              <w:t>Of the correct answers shown to the model, the fraction it actually picked (recall divided by the ceiling). Low = the model is leaving answers on the table.</w:t>
+            </w:r>
+          </w:p>
+        </w:tc>
+      </w:tr>
+      <w:tr>
+        <w:tc>
+          <w:tcPr>
+            <w:tcW w:type="dxa" w:w="4320"/>
+          </w:tcPr>
+          <w:p>
+            <w:r>
+              <w:t>Precedent capture</w:t>
+            </w:r>
+          </w:p>
+        </w:tc>
+        <w:tc>
+          <w:tcPr>
+            <w:tcW w:type="dxa" w:w="4320"/>
+          </w:tcPr>
+          <w:p>
+            <w:r>
+              <w:t>Of the correct answers that were in the SHOWN past tickets, the fraction the model picked. Only meaningful for approaches that show past tickets.</w:t>
+            </w:r>
+          </w:p>
+        </w:tc>
+      </w:tr>
+      <w:tr>
+        <w:tc>
+          <w:tcPr>
+            <w:tcW w:type="dxa" w:w="4320"/>
+          </w:tcPr>
+          <w:p>
+            <w:r>
+              <w:t>Typical (median) time</w:t>
+            </w:r>
+          </w:p>
+        </w:tc>
+        <w:tc>
+          <w:tcPr>
+            <w:tcW w:type="dxa" w:w="4320"/>
+          </w:tcPr>
+          <w:p>
+            <w:r>
+              <w:t>The middle ticket's time - the honest 'usual' speed. The AVERAGE can be far higher if one ticket stalls on retries; compare the two to spot an outlier.</w:t>
+            </w:r>
+          </w:p>
+        </w:tc>
+      </w:tr>
+      <w:tr>
+        <w:tc>
+          <w:tcPr>
+            <w:tcW w:type="dxa" w:w="4320"/>
+          </w:tcPr>
+          <w:p>
+            <w:r>
+              <w:t>Where misses go</w:t>
+            </w:r>
+          </w:p>
+        </w:tc>
+        <w:tc>
+          <w:tcPr>
+            <w:tcW w:type="dxa" w:w="4320"/>
+          </w:tcPr>
+          <w:p>
+            <w:r>
+              <w:t>Each correct answer we missed is one of: never retrieved, filtered before the model, or the model saw it and dropped it. The last one is the model's fault, not the system's.</w:t>
             </w:r>
           </w:p>
         </w:tc>

</xml_diff>

<commit_message>
compare_eval: make every chart self-explanatory + fix the confusing ones
Charts now carry the question as the headline and a 'how to read it' subtitle, so
they stand alone. Specific fixes from feedback:
- Cohorts: only plots approaches that recorded per-cohort numbers (no phantom
  missing 'hard' bar that read as 'not evaluated'); omitted runs are noted.
- 'Where misses go': now a STACKED bar (all one band = all the model's choice),
  instead of a table with a confusing '100%' column.
- Precedent chart: clearer labels (WERE in / were NOT in the past tickets) + y-axis
  'how often the model picked that answer'; history runs only.
- Dropped the separate capture chart (its 0.89 collided with the 0.887 retrieval
  number); folded precedent-capture into one sentence.
- Latency: median-first, only runs that recorded a median; outlier flagged.
- Headroom over bars + best-fit legend so value labels never hide behind the legend.

Co-Authored-By: Claude Opus 4.8 <noreply@anthropic.com>
</commit_message>
<xml_diff>
--- a/out/eval/comparison_all_modes.docx
+++ b/out/eval/comparison_all_modes.docx
@@ -661,452 +661,6 @@
     </w:tbl>
     <w:p>
       <w:pPr>
-        <w:pStyle w:val="Heading2"/>
-      </w:pPr>
-      <w:r>
-        <w:t>Do the search relevance scores help? (with past tickets)</w:t>
-      </w:r>
-    </w:p>
-    <w:p>
-      <w:pPr>
-        <w:pStyle w:val="IntenseQuote"/>
-      </w:pPr>
-      <w:r>
-        <w:t>Comparing  "History + scores"  →  "History"</w:t>
-      </w:r>
-    </w:p>
-    <w:tbl>
-      <w:tblPr>
-        <w:tblStyle w:val="LightGrid-Accent1"/>
-        <w:tblW w:type="auto" w:w="0"/>
-        <w:tblLook w:firstColumn="1" w:firstRow="1" w:lastColumn="0" w:lastRow="0" w:noHBand="0" w:noVBand="1" w:val="04A0"/>
-      </w:tblPr>
-      <w:tblGrid>
-        <w:gridCol w:w="1728"/>
-        <w:gridCol w:w="1728"/>
-        <w:gridCol w:w="1728"/>
-        <w:gridCol w:w="1728"/>
-        <w:gridCol w:w="1728"/>
-      </w:tblGrid>
-      <w:tr>
-        <w:tc>
-          <w:tcPr>
-            <w:tcW w:type="dxa" w:w="1728"/>
-          </w:tcPr>
-          <w:p>
-            <w:r>
-              <w:t>What we measure</w:t>
-            </w:r>
-          </w:p>
-        </w:tc>
-        <w:tc>
-          <w:tcPr>
-            <w:tcW w:type="dxa" w:w="1728"/>
-          </w:tcPr>
-          <w:p>
-            <w:r>
-              <w:t>History + scores</w:t>
-            </w:r>
-          </w:p>
-        </w:tc>
-        <w:tc>
-          <w:tcPr>
-            <w:tcW w:type="dxa" w:w="1728"/>
-          </w:tcPr>
-          <w:p>
-            <w:r>
-              <w:t>History</w:t>
-            </w:r>
-          </w:p>
-        </w:tc>
-        <w:tc>
-          <w:tcPr>
-            <w:tcW w:type="dxa" w:w="1728"/>
-          </w:tcPr>
-          <w:p>
-            <w:r>
-              <w:t>Change</w:t>
-            </w:r>
-          </w:p>
-        </w:tc>
-        <w:tc>
-          <w:tcPr>
-            <w:tcW w:type="dxa" w:w="1728"/>
-          </w:tcPr>
-          <w:p>
-            <w:r>
-              <w:t>Better</w:t>
-            </w:r>
-          </w:p>
-        </w:tc>
-      </w:tr>
-      <w:tr>
-        <w:tc>
-          <w:tcPr>
-            <w:tcW w:type="dxa" w:w="1728"/>
-          </w:tcPr>
-          <w:p>
-            <w:r>
-              <w:t>Recall (answers found)</w:t>
-            </w:r>
-          </w:p>
-        </w:tc>
-        <w:tc>
-          <w:tcPr>
-            <w:tcW w:type="dxa" w:w="1728"/>
-          </w:tcPr>
-          <w:p>
-            <w:r>
-              <w:t>0.743</w:t>
-            </w:r>
-          </w:p>
-        </w:tc>
-        <w:tc>
-          <w:tcPr>
-            <w:tcW w:type="dxa" w:w="1728"/>
-          </w:tcPr>
-          <w:p>
-            <w:r>
-              <w:t>0.726</w:t>
-            </w:r>
-          </w:p>
-        </w:tc>
-        <w:tc>
-          <w:tcPr>
-            <w:tcW w:type="dxa" w:w="1728"/>
-          </w:tcPr>
-          <w:p>
-            <w:r>
-              <w:t>-0.017</w:t>
-            </w:r>
-          </w:p>
-        </w:tc>
-        <w:tc>
-          <w:tcPr>
-            <w:tcW w:type="dxa" w:w="1728"/>
-          </w:tcPr>
-          <w:p>
-            <w:r>
-              <w:t>→ History + scores</w:t>
-            </w:r>
-          </w:p>
-        </w:tc>
-      </w:tr>
-      <w:tr>
-        <w:tc>
-          <w:tcPr>
-            <w:tcW w:type="dxa" w:w="1728"/>
-          </w:tcPr>
-          <w:p>
-            <w:r>
-              <w:t>F1 (overall balance)</w:t>
-            </w:r>
-          </w:p>
-        </w:tc>
-        <w:tc>
-          <w:tcPr>
-            <w:tcW w:type="dxa" w:w="1728"/>
-          </w:tcPr>
-          <w:p>
-            <w:r>
-              <w:t>0.301</w:t>
-            </w:r>
-          </w:p>
-        </w:tc>
-        <w:tc>
-          <w:tcPr>
-            <w:tcW w:type="dxa" w:w="1728"/>
-          </w:tcPr>
-          <w:p>
-            <w:r>
-              <w:t>0.294</w:t>
-            </w:r>
-          </w:p>
-        </w:tc>
-        <w:tc>
-          <w:tcPr>
-            <w:tcW w:type="dxa" w:w="1728"/>
-          </w:tcPr>
-          <w:p>
-            <w:r>
-              <w:t>-0.007</w:t>
-            </w:r>
-          </w:p>
-        </w:tc>
-        <w:tc>
-          <w:tcPr>
-            <w:tcW w:type="dxa" w:w="1728"/>
-          </w:tcPr>
-          <w:p>
-            <w:r>
-              <w:t>→ History + scores</w:t>
-            </w:r>
-          </w:p>
-        </w:tc>
-      </w:tr>
-      <w:tr>
-        <w:tc>
-          <w:tcPr>
-            <w:tcW w:type="dxa" w:w="1728"/>
-          </w:tcPr>
-          <w:p>
-            <w:r>
-              <w:t>Easy tickets: found</w:t>
-            </w:r>
-          </w:p>
-        </w:tc>
-        <w:tc>
-          <w:tcPr>
-            <w:tcW w:type="dxa" w:w="1728"/>
-          </w:tcPr>
-          <w:p>
-            <w:r>
-              <w:t>0.848</w:t>
-            </w:r>
-          </w:p>
-        </w:tc>
-        <w:tc>
-          <w:tcPr>
-            <w:tcW w:type="dxa" w:w="1728"/>
-          </w:tcPr>
-          <w:p>
-            <w:r>
-              <w:t>0.838</w:t>
-            </w:r>
-          </w:p>
-        </w:tc>
-        <w:tc>
-          <w:tcPr>
-            <w:tcW w:type="dxa" w:w="1728"/>
-          </w:tcPr>
-          <w:p>
-            <w:r>
-              <w:t>-0.010</w:t>
-            </w:r>
-          </w:p>
-        </w:tc>
-        <w:tc>
-          <w:tcPr>
-            <w:tcW w:type="dxa" w:w="1728"/>
-          </w:tcPr>
-          <w:p>
-            <w:r>
-              <w:t>→ History + scores</w:t>
-            </w:r>
-          </w:p>
-        </w:tc>
-      </w:tr>
-      <w:tr>
-        <w:tc>
-          <w:tcPr>
-            <w:tcW w:type="dxa" w:w="1728"/>
-          </w:tcPr>
-          <w:p>
-            <w:r>
-              <w:t>Hard tickets: F1</w:t>
-            </w:r>
-          </w:p>
-        </w:tc>
-        <w:tc>
-          <w:tcPr>
-            <w:tcW w:type="dxa" w:w="1728"/>
-          </w:tcPr>
-          <w:p>
-            <w:r>
-              <w:t>0.454</w:t>
-            </w:r>
-          </w:p>
-        </w:tc>
-        <w:tc>
-          <w:tcPr>
-            <w:tcW w:type="dxa" w:w="1728"/>
-          </w:tcPr>
-          <w:p>
-            <w:r>
-              <w:t>0.441</w:t>
-            </w:r>
-          </w:p>
-        </w:tc>
-        <w:tc>
-          <w:tcPr>
-            <w:tcW w:type="dxa" w:w="1728"/>
-          </w:tcPr>
-          <w:p>
-            <w:r>
-              <w:t>-0.013</w:t>
-            </w:r>
-          </w:p>
-        </w:tc>
-        <w:tc>
-          <w:tcPr>
-            <w:tcW w:type="dxa" w:w="1728"/>
-          </w:tcPr>
-          <w:p>
-            <w:r>
-              <w:t>→ History + scores</w:t>
-            </w:r>
-          </w:p>
-        </w:tc>
-      </w:tr>
-      <w:tr>
-        <w:tc>
-          <w:tcPr>
-            <w:tcW w:type="dxa" w:w="1728"/>
-          </w:tcPr>
-          <w:p>
-            <w:r>
-              <w:t>Precedent use (lift)</w:t>
-            </w:r>
-          </w:p>
-        </w:tc>
-        <w:tc>
-          <w:tcPr>
-            <w:tcW w:type="dxa" w:w="1728"/>
-          </w:tcPr>
-          <w:p>
-            <w:r>
-              <w:t>0.348</w:t>
-            </w:r>
-          </w:p>
-        </w:tc>
-        <w:tc>
-          <w:tcPr>
-            <w:tcW w:type="dxa" w:w="1728"/>
-          </w:tcPr>
-          <w:p>
-            <w:r>
-              <w:t>0.308</w:t>
-            </w:r>
-          </w:p>
-        </w:tc>
-        <w:tc>
-          <w:tcPr>
-            <w:tcW w:type="dxa" w:w="1728"/>
-          </w:tcPr>
-          <w:p>
-            <w:r>
-              <w:t>-0.040</w:t>
-            </w:r>
-          </w:p>
-        </w:tc>
-        <w:tc>
-          <w:tcPr>
-            <w:tcW w:type="dxa" w:w="1728"/>
-          </w:tcPr>
-          <w:p>
-            <w:r>
-              <w:t>→ History + scores</w:t>
-            </w:r>
-          </w:p>
-        </w:tc>
-      </w:tr>
-      <w:tr>
-        <w:tc>
-          <w:tcPr>
-            <w:tcW w:type="dxa" w:w="1728"/>
-          </w:tcPr>
-          <w:p>
-            <w:r>
-              <w:t>Missed answers (count)</w:t>
-            </w:r>
-          </w:p>
-        </w:tc>
-        <w:tc>
-          <w:tcPr>
-            <w:tcW w:type="dxa" w:w="1728"/>
-          </w:tcPr>
-          <w:p>
-            <w:r>
-              <w:t>n/a</w:t>
-            </w:r>
-          </w:p>
-        </w:tc>
-        <w:tc>
-          <w:tcPr>
-            <w:tcW w:type="dxa" w:w="1728"/>
-          </w:tcPr>
-          <w:p>
-            <w:r>
-              <w:t>42</w:t>
-            </w:r>
-          </w:p>
-        </w:tc>
-        <w:tc>
-          <w:tcPr>
-            <w:tcW w:type="dxa" w:w="1728"/>
-          </w:tcPr>
-          <w:p>
-            <w:r>
-              <w:t>n/a</w:t>
-            </w:r>
-          </w:p>
-        </w:tc>
-        <w:tc>
-          <w:tcPr>
-            <w:tcW w:type="dxa" w:w="1728"/>
-          </w:tcPr>
-          <w:p>
-            <w:r>
-              <w:t>—</w:t>
-            </w:r>
-          </w:p>
-        </w:tc>
-      </w:tr>
-      <w:tr>
-        <w:tc>
-          <w:tcPr>
-            <w:tcW w:type="dxa" w:w="1728"/>
-          </w:tcPr>
-          <w:p>
-            <w:r>
-              <w:t>Typical time (s)</w:t>
-            </w:r>
-          </w:p>
-        </w:tc>
-        <w:tc>
-          <w:tcPr>
-            <w:tcW w:type="dxa" w:w="1728"/>
-          </w:tcPr>
-          <w:p>
-            <w:r>
-              <w:t>n/a</w:t>
-            </w:r>
-          </w:p>
-        </w:tc>
-        <w:tc>
-          <w:tcPr>
-            <w:tcW w:type="dxa" w:w="1728"/>
-          </w:tcPr>
-          <w:p>
-            <w:r>
-              <w:t>5.100</w:t>
-            </w:r>
-          </w:p>
-        </w:tc>
-        <w:tc>
-          <w:tcPr>
-            <w:tcW w:type="dxa" w:w="1728"/>
-          </w:tcPr>
-          <w:p>
-            <w:r>
-              <w:t>n/a</w:t>
-            </w:r>
-          </w:p>
-        </w:tc>
-        <w:tc>
-          <w:tcPr>
-            <w:tcW w:type="dxa" w:w="1728"/>
-          </w:tcPr>
-          <w:p>
-            <w:r>
-              <w:t>—</w:t>
-            </w:r>
-          </w:p>
-        </w:tc>
-      </w:tr>
-    </w:tbl>
-    <w:p>
-      <w:pPr>
         <w:pStyle w:val="Heading1"/>
       </w:pPr>
       <w:r>
@@ -1122,7 +676,7 @@
       <w:r>
         <w:drawing>
           <wp:inline xmlns:a="http://schemas.openxmlformats.org/drawingml/2006/main" xmlns:pic="http://schemas.openxmlformats.org/drawingml/2006/picture">
-            <wp:extent cx="5669280" cy="3365450"/>
+            <wp:extent cx="5669280" cy="3116011"/>
             <wp:docPr id="1" name="Picture 1"/>
             <wp:cNvGraphicFramePr>
               <a:graphicFrameLocks noChangeAspect="1"/>
@@ -1143,7 +697,7 @@
                   <pic:spPr>
                     <a:xfrm>
                       <a:off x="0" y="0"/>
-                      <a:ext cx="5669280" cy="3365450"/>
+                      <a:ext cx="5669280" cy="3116011"/>
                     </a:xfrm>
                     <a:prstGeom prst="rect"/>
                   </pic:spPr>
@@ -1159,17 +713,61 @@
         <w:pStyle w:val="Heading1"/>
       </w:pPr>
       <w:r>
-        <w:t>2. Easy tickets vs hard tickets</w:t>
+        <w:t>2. Does it handle hard tickets, or just easy ones?</w:t>
       </w:r>
     </w:p>
     <w:p>
       <w:r>
-        <w:t>Tickets split by how many correct Value Streams they have: EASY = exactly one, HARD = two or more. The chart shows RECALL for both (same metric, apples to apples) — of the correct answers on that kind of ticket, how many we found. An approach that lifts BOTH is genuinely better, not just better at the easy ones. "History + scores" leads on easy (85% found) and on hard (n/a found).</w:t>
+        <w:t>We split tickets by how many correct Value Streams they have. EASY = exactly one correct answer; HARD = two or more. The chart shows RECALL for both (the same metric, so it's a fair comparison) — of the correct answers on that kind of ticket, how many we found. The orange (hard) bar is the one to watch: anyone can do well on easy tickets.</w:t>
       </w:r>
     </w:p>
     <w:p>
       <w:r>
-        <w:t>Full per-cohort breakdown (Precision / Recall / F1, and how many tickets are in each group):</w:t>
+        <w:rPr>
+          <w:i/>
+        </w:rPr>
+        <w:t>Not shown in this chart: "No history + scores", "History + scores" — those runs did not record a per-cohort breakdown.</w:t>
+      </w:r>
+    </w:p>
+    <w:p>
+      <w:r>
+        <w:drawing>
+          <wp:inline xmlns:a="http://schemas.openxmlformats.org/drawingml/2006/main" xmlns:pic="http://schemas.openxmlformats.org/drawingml/2006/picture">
+            <wp:extent cx="5669280" cy="3361432"/>
+            <wp:docPr id="2" name="Picture 2"/>
+            <wp:cNvGraphicFramePr>
+              <a:graphicFrameLocks noChangeAspect="1"/>
+            </wp:cNvGraphicFramePr>
+            <a:graphic>
+              <a:graphicData uri="http://schemas.openxmlformats.org/drawingml/2006/picture">
+                <pic:pic>
+                  <pic:nvPicPr>
+                    <pic:cNvPr id="0" name="cohorts.png"/>
+                    <pic:cNvPicPr/>
+                  </pic:nvPicPr>
+                  <pic:blipFill>
+                    <a:blip r:embed="rId10"/>
+                    <a:stretch>
+                      <a:fillRect/>
+                    </a:stretch>
+                  </pic:blipFill>
+                  <pic:spPr>
+                    <a:xfrm>
+                      <a:off x="0" y="0"/>
+                      <a:ext cx="5669280" cy="3361432"/>
+                    </a:xfrm>
+                    <a:prstGeom prst="rect"/>
+                  </pic:spPr>
+                </pic:pic>
+              </a:graphicData>
+            </a:graphic>
+          </wp:inline>
+        </w:drawing>
+      </w:r>
+    </w:p>
+    <w:p>
+      <w:r>
+        <w:t>Full per-cohort numbers (n = how many tickets, P / R / F1):</w:t>
       </w:r>
     </w:p>
     <w:tbl>
@@ -1288,98 +886,6 @@
           </w:tcPr>
           <w:p>
             <w:r>
-              <w:t>No history + scores</w:t>
-            </w:r>
-          </w:p>
-        </w:tc>
-        <w:tc>
-          <w:tcPr>
-            <w:tcW w:type="dxa" w:w="960"/>
-          </w:tcPr>
-          <w:p>
-            <w:r>
-              <w:t>-</w:t>
-            </w:r>
-          </w:p>
-        </w:tc>
-        <w:tc>
-          <w:tcPr>
-            <w:tcW w:type="dxa" w:w="960"/>
-          </w:tcPr>
-          <w:p>
-            <w:r>
-              <w:t>n/a</w:t>
-            </w:r>
-          </w:p>
-        </w:tc>
-        <w:tc>
-          <w:tcPr>
-            <w:tcW w:type="dxa" w:w="960"/>
-          </w:tcPr>
-          <w:p>
-            <w:r>
-              <w:t>68%</w:t>
-            </w:r>
-          </w:p>
-        </w:tc>
-        <w:tc>
-          <w:tcPr>
-            <w:tcW w:type="dxa" w:w="960"/>
-          </w:tcPr>
-          <w:p>
-            <w:r>
-              <w:t>n/a</w:t>
-            </w:r>
-          </w:p>
-        </w:tc>
-        <w:tc>
-          <w:tcPr>
-            <w:tcW w:type="dxa" w:w="960"/>
-          </w:tcPr>
-          <w:p>
-            <w:r>
-              <w:t>-</w:t>
-            </w:r>
-          </w:p>
-        </w:tc>
-        <w:tc>
-          <w:tcPr>
-            <w:tcW w:type="dxa" w:w="960"/>
-          </w:tcPr>
-          <w:p>
-            <w:r>
-              <w:t>n/a</w:t>
-            </w:r>
-          </w:p>
-        </w:tc>
-        <w:tc>
-          <w:tcPr>
-            <w:tcW w:type="dxa" w:w="960"/>
-          </w:tcPr>
-          <w:p>
-            <w:r>
-              <w:t>n/a</w:t>
-            </w:r>
-          </w:p>
-        </w:tc>
-        <w:tc>
-          <w:tcPr>
-            <w:tcW w:type="dxa" w:w="960"/>
-          </w:tcPr>
-          <w:p>
-            <w:r>
-              <w:t>0.35</w:t>
-            </w:r>
-          </w:p>
-        </w:tc>
-      </w:tr>
-      <w:tr>
-        <w:tc>
-          <w:tcPr>
-            <w:tcW w:type="dxa" w:w="960"/>
-          </w:tcPr>
-          <w:p>
-            <w:r>
               <w:t>No history</w:t>
             </w:r>
           </w:p>
@@ -1461,98 +967,6 @@
           <w:p>
             <w:r>
               <w:t>0.36</w:t>
-            </w:r>
-          </w:p>
-        </w:tc>
-      </w:tr>
-      <w:tr>
-        <w:tc>
-          <w:tcPr>
-            <w:tcW w:type="dxa" w:w="960"/>
-          </w:tcPr>
-          <w:p>
-            <w:r>
-              <w:t>History + scores</w:t>
-            </w:r>
-          </w:p>
-        </w:tc>
-        <w:tc>
-          <w:tcPr>
-            <w:tcW w:type="dxa" w:w="960"/>
-          </w:tcPr>
-          <w:p>
-            <w:r>
-              <w:t>-</w:t>
-            </w:r>
-          </w:p>
-        </w:tc>
-        <w:tc>
-          <w:tcPr>
-            <w:tcW w:type="dxa" w:w="960"/>
-          </w:tcPr>
-          <w:p>
-            <w:r>
-              <w:t>n/a</w:t>
-            </w:r>
-          </w:p>
-        </w:tc>
-        <w:tc>
-          <w:tcPr>
-            <w:tcW w:type="dxa" w:w="960"/>
-          </w:tcPr>
-          <w:p>
-            <w:r>
-              <w:t>85%</w:t>
-            </w:r>
-          </w:p>
-        </w:tc>
-        <w:tc>
-          <w:tcPr>
-            <w:tcW w:type="dxa" w:w="960"/>
-          </w:tcPr>
-          <w:p>
-            <w:r>
-              <w:t>n/a</w:t>
-            </w:r>
-          </w:p>
-        </w:tc>
-        <w:tc>
-          <w:tcPr>
-            <w:tcW w:type="dxa" w:w="960"/>
-          </w:tcPr>
-          <w:p>
-            <w:r>
-              <w:t>-</w:t>
-            </w:r>
-          </w:p>
-        </w:tc>
-        <w:tc>
-          <w:tcPr>
-            <w:tcW w:type="dxa" w:w="960"/>
-          </w:tcPr>
-          <w:p>
-            <w:r>
-              <w:t>n/a</w:t>
-            </w:r>
-          </w:p>
-        </w:tc>
-        <w:tc>
-          <w:tcPr>
-            <w:tcW w:type="dxa" w:w="960"/>
-          </w:tcPr>
-          <w:p>
-            <w:r>
-              <w:t>n/a</w:t>
-            </w:r>
-          </w:p>
-        </w:tc>
-        <w:tc>
-          <w:tcPr>
-            <w:tcW w:type="dxa" w:w="960"/>
-          </w:tcPr>
-          <w:p>
-            <w:r>
-              <w:t>0.45</w:t>
             </w:r>
           </w:p>
         </w:tc>
@@ -1651,64 +1065,23 @@
       </w:tr>
     </w:tbl>
     <w:p>
-      <w:r>
-        <w:drawing>
-          <wp:inline xmlns:a="http://schemas.openxmlformats.org/drawingml/2006/main" xmlns:pic="http://schemas.openxmlformats.org/drawingml/2006/picture">
-            <wp:extent cx="5669280" cy="3365450"/>
-            <wp:docPr id="2" name="Picture 2"/>
-            <wp:cNvGraphicFramePr>
-              <a:graphicFrameLocks noChangeAspect="1"/>
-            </wp:cNvGraphicFramePr>
-            <a:graphic>
-              <a:graphicData uri="http://schemas.openxmlformats.org/drawingml/2006/picture">
-                <pic:pic>
-                  <pic:nvPicPr>
-                    <pic:cNvPr id="0" name="cohorts.png"/>
-                    <pic:cNvPicPr/>
-                  </pic:nvPicPr>
-                  <pic:blipFill>
-                    <a:blip r:embed="rId10"/>
-                    <a:stretch>
-                      <a:fillRect/>
-                    </a:stretch>
-                  </pic:blipFill>
-                  <pic:spPr>
-                    <a:xfrm>
-                      <a:off x="0" y="0"/>
-                      <a:ext cx="5669280" cy="3365450"/>
-                    </a:xfrm>
-                    <a:prstGeom prst="rect"/>
-                  </pic:spPr>
-                </pic:pic>
-              </a:graphicData>
-            </a:graphic>
-          </wp:inline>
-        </w:drawing>
-      </w:r>
-    </w:p>
-    <w:p>
       <w:pPr>
         <w:pStyle w:val="Heading1"/>
       </w:pPr>
       <w:r>
-        <w:t>3. Were the right answers even shown to the model?</w:t>
+        <w:t>3. Did the system even put the right answers in front of the model?</w:t>
       </w:r>
     </w:p>
     <w:p>
       <w:r>
-        <w:t>Before the model can choose, the system has to put the correct Value Streams in front of it — it can't pick what it never sees. This section is about the SYSTEM, not the model: how good is retrieval, and what is the ceiling every approach is working under.</w:t>
-      </w:r>
-    </w:p>
-    <w:p>
-      <w:r>
-        <w:t>Two ways the system can surface a correct answer. (1) Semantic search ranking: weak — its top 10 holds only 26% of the correct answers (top 3: 11%, top 5: 14% — it barely improves with depth, so the embedding ranks the right streams poorly). (2) Similar past tickets: strong — they hold 89% of the correct answers. And because we hand the model the FULL 50-stream catalogue every time, 100% of the correct answers are ALWAYS on the table.</w:t>
+        <w:t>The model can only pick from what the system shows it. This section is about the SYSTEM (retrieval), not the model. Each bar is the fraction of correct answers present at that stage.</w:t>
       </w:r>
     </w:p>
     <w:p>
       <w:r>
         <w:drawing>
           <wp:inline xmlns:a="http://schemas.openxmlformats.org/drawingml/2006/main" xmlns:pic="http://schemas.openxmlformats.org/drawingml/2006/picture">
-            <wp:extent cx="5669280" cy="3496786"/>
+            <wp:extent cx="5669280" cy="3223617"/>
             <wp:docPr id="3" name="Picture 3"/>
             <wp:cNvGraphicFramePr>
               <a:graphicFrameLocks noChangeAspect="1"/>
@@ -1729,7 +1102,7 @@
                   <pic:spPr>
                     <a:xfrm>
                       <a:off x="0" y="0"/>
-                      <a:ext cx="5669280" cy="3496786"/>
+                      <a:ext cx="5669280" cy="3223617"/>
                     </a:xfrm>
                     <a:prstGeom prst="rect"/>
                   </pic:spPr>
@@ -1742,478 +1115,19 @@
     </w:p>
     <w:p>
       <w:r>
-        <w:t>So retrieval is not the bottleneck. With the whole catalogue always present, every miss is the model choosing wrong from a complete list — which is exactly why the prompt / approach is the lever, not the search. The table below makes that concrete: of all the correct answers the model MISSED, where did they go?</w:t>
-      </w:r>
-    </w:p>
-    <w:tbl>
-      <w:tblPr>
-        <w:tblStyle w:val="LightGrid-Accent1"/>
-        <w:tblW w:type="auto" w:w="0"/>
-        <w:tblLook w:firstColumn="1" w:firstRow="1" w:lastColumn="0" w:lastRow="0" w:noHBand="0" w:noVBand="1" w:val="04A0"/>
-      </w:tblPr>
-      <w:tblGrid>
-        <w:gridCol w:w="1728"/>
-        <w:gridCol w:w="1728"/>
-        <w:gridCol w:w="1728"/>
-        <w:gridCol w:w="1728"/>
-        <w:gridCol w:w="1728"/>
-      </w:tblGrid>
-      <w:tr>
-        <w:tc>
-          <w:tcPr>
-            <w:tcW w:type="dxa" w:w="1728"/>
-          </w:tcPr>
-          <w:p>
-            <w:r>
-              <w:t>Approach</w:t>
-            </w:r>
-          </w:p>
-        </w:tc>
-        <w:tc>
-          <w:tcPr>
-            <w:tcW w:type="dxa" w:w="1728"/>
-          </w:tcPr>
-          <w:p>
-            <w:r>
-              <w:t>Never retrieved</w:t>
-            </w:r>
-          </w:p>
-        </w:tc>
-        <w:tc>
-          <w:tcPr>
-            <w:tcW w:type="dxa" w:w="1728"/>
-          </w:tcPr>
-          <w:p>
-            <w:r>
-              <w:t>Filtered before model</w:t>
-            </w:r>
-          </w:p>
-        </w:tc>
-        <w:tc>
-          <w:tcPr>
-            <w:tcW w:type="dxa" w:w="1728"/>
-          </w:tcPr>
-          <w:p>
-            <w:r>
-              <w:t>Model saw it, dropped it</w:t>
-            </w:r>
-          </w:p>
-        </w:tc>
-        <w:tc>
-          <w:tcPr>
-            <w:tcW w:type="dxa" w:w="1728"/>
-          </w:tcPr>
-          <w:p>
-            <w:r>
-              <w:t>% misses = model's choice</w:t>
-            </w:r>
-          </w:p>
-        </w:tc>
-      </w:tr>
-      <w:tr>
-        <w:tc>
-          <w:tcPr>
-            <w:tcW w:type="dxa" w:w="1728"/>
-          </w:tcPr>
-          <w:p>
-            <w:r>
-              <w:t>No history + scores</w:t>
-            </w:r>
-          </w:p>
-        </w:tc>
-        <w:tc>
-          <w:tcPr>
-            <w:tcW w:type="dxa" w:w="1728"/>
-          </w:tcPr>
-          <w:p>
-            <w:r>
-              <w:t>n/a</w:t>
-            </w:r>
-          </w:p>
-        </w:tc>
-        <w:tc>
-          <w:tcPr>
-            <w:tcW w:type="dxa" w:w="1728"/>
-          </w:tcPr>
-          <w:p>
-            <w:r>
-              <w:t>n/a</w:t>
-            </w:r>
-          </w:p>
-        </w:tc>
-        <w:tc>
-          <w:tcPr>
-            <w:tcW w:type="dxa" w:w="1728"/>
-          </w:tcPr>
-          <w:p>
-            <w:r>
-              <w:t>n/a</w:t>
-            </w:r>
-          </w:p>
-        </w:tc>
-        <w:tc>
-          <w:tcPr>
-            <w:tcW w:type="dxa" w:w="1728"/>
-          </w:tcPr>
-          <w:p>
-            <w:r>
-              <w:t>n/a</w:t>
-            </w:r>
-          </w:p>
-        </w:tc>
-      </w:tr>
-      <w:tr>
-        <w:tc>
-          <w:tcPr>
-            <w:tcW w:type="dxa" w:w="1728"/>
-          </w:tcPr>
-          <w:p>
-            <w:r>
-              <w:t>No history</w:t>
-            </w:r>
-          </w:p>
-        </w:tc>
-        <w:tc>
-          <w:tcPr>
-            <w:tcW w:type="dxa" w:w="1728"/>
-          </w:tcPr>
-          <w:p>
-            <w:r>
-              <w:t>0</w:t>
-            </w:r>
-          </w:p>
-        </w:tc>
-        <w:tc>
-          <w:tcPr>
-            <w:tcW w:type="dxa" w:w="1728"/>
-          </w:tcPr>
-          <w:p>
-            <w:r>
-              <w:t>0</w:t>
-            </w:r>
-          </w:p>
-        </w:tc>
-        <w:tc>
-          <w:tcPr>
-            <w:tcW w:type="dxa" w:w="1728"/>
-          </w:tcPr>
-          <w:p>
-            <w:r>
-              <w:t>63</w:t>
-            </w:r>
-          </w:p>
-        </w:tc>
-        <w:tc>
-          <w:tcPr>
-            <w:tcW w:type="dxa" w:w="1728"/>
-          </w:tcPr>
-          <w:p>
-            <w:r>
-              <w:t>100%</w:t>
-            </w:r>
-          </w:p>
-        </w:tc>
-      </w:tr>
-      <w:tr>
-        <w:tc>
-          <w:tcPr>
-            <w:tcW w:type="dxa" w:w="1728"/>
-          </w:tcPr>
-          <w:p>
-            <w:r>
-              <w:t>History + scores</w:t>
-            </w:r>
-          </w:p>
-        </w:tc>
-        <w:tc>
-          <w:tcPr>
-            <w:tcW w:type="dxa" w:w="1728"/>
-          </w:tcPr>
-          <w:p>
-            <w:r>
-              <w:t>n/a</w:t>
-            </w:r>
-          </w:p>
-        </w:tc>
-        <w:tc>
-          <w:tcPr>
-            <w:tcW w:type="dxa" w:w="1728"/>
-          </w:tcPr>
-          <w:p>
-            <w:r>
-              <w:t>n/a</w:t>
-            </w:r>
-          </w:p>
-        </w:tc>
-        <w:tc>
-          <w:tcPr>
-            <w:tcW w:type="dxa" w:w="1728"/>
-          </w:tcPr>
-          <w:p>
-            <w:r>
-              <w:t>n/a</w:t>
-            </w:r>
-          </w:p>
-        </w:tc>
-        <w:tc>
-          <w:tcPr>
-            <w:tcW w:type="dxa" w:w="1728"/>
-          </w:tcPr>
-          <w:p>
-            <w:r>
-              <w:t>n/a</w:t>
-            </w:r>
-          </w:p>
-        </w:tc>
-      </w:tr>
-      <w:tr>
-        <w:tc>
-          <w:tcPr>
-            <w:tcW w:type="dxa" w:w="1728"/>
-          </w:tcPr>
-          <w:p>
-            <w:r>
-              <w:t>History</w:t>
-            </w:r>
-          </w:p>
-        </w:tc>
-        <w:tc>
-          <w:tcPr>
-            <w:tcW w:type="dxa" w:w="1728"/>
-          </w:tcPr>
-          <w:p>
-            <w:r>
-              <w:t>0</w:t>
-            </w:r>
-          </w:p>
-        </w:tc>
-        <w:tc>
-          <w:tcPr>
-            <w:tcW w:type="dxa" w:w="1728"/>
-          </w:tcPr>
-          <w:p>
-            <w:r>
-              <w:t>0</w:t>
-            </w:r>
-          </w:p>
-        </w:tc>
-        <w:tc>
-          <w:tcPr>
-            <w:tcW w:type="dxa" w:w="1728"/>
-          </w:tcPr>
-          <w:p>
-            <w:r>
-              <w:t>42</w:t>
-            </w:r>
-          </w:p>
-        </w:tc>
-        <w:tc>
-          <w:tcPr>
-            <w:tcW w:type="dxa" w:w="1728"/>
-          </w:tcPr>
-          <w:p>
-            <w:r>
-              <w:t>100%</w:t>
-            </w:r>
-          </w:p>
-        </w:tc>
-      </w:tr>
-    </w:tbl>
-    <w:p>
-      <w:r>
-        <w:t>'Never retrieved' and 'filtered before model' are retrieval/system failures; 'model saw it, dropped it' is the model's choice. When that last column is ~100%, the only way to improve is the model's selection (prompt, examples) — retrieval has already done its job.</w:t>
-      </w:r>
-    </w:p>
-    <w:p>
-      <w:pPr>
-        <w:pStyle w:val="Heading1"/>
-      </w:pPr>
-      <w:r>
-        <w:t>4. How much of what's available does the model actually pick?</w:t>
+        <w:t>Semantic search ranking is weak — its top 10 holds only 26% of the correct answers and barely grows with depth (top 3: 11%, top 5: 14%). But because we hand the model the FULL catalogue every time, 100% of the correct answers are ALWAYS in front of it. So retrieval is not the bottleneck — the model is choosing from a complete list.</w:t>
       </w:r>
     </w:p>
     <w:p>
       <w:r>
-        <w:t>Two capture rates. CEILING CAPTURE = of all the correct answers shown to the model, how many it picked (recall as a share of the ceiling). PRECEDENT CAPTURE = of the correct answers that appeared in the shown past tickets, how many it picked. The second only applies to approaches that actually show past tickets, so the no-history approaches are left out of it.</w:t>
+        <w:t>The next chart proves it. Every correct answer we missed is one of three things: never retrieved, filtered out before the model, or shown to the model which then didn't pick it. The whole bar is the total misses; the colour tells you whose fault each miss is.</w:t>
       </w:r>
     </w:p>
-    <w:tbl>
-      <w:tblPr>
-        <w:tblStyle w:val="LightGrid-Accent1"/>
-        <w:tblW w:type="auto" w:w="0"/>
-        <w:tblLook w:firstColumn="1" w:firstRow="1" w:lastColumn="0" w:lastRow="0" w:noHBand="0" w:noVBand="1" w:val="04A0"/>
-      </w:tblPr>
-      <w:tblGrid>
-        <w:gridCol w:w="2880"/>
-        <w:gridCol w:w="2880"/>
-        <w:gridCol w:w="2880"/>
-      </w:tblGrid>
-      <w:tr>
-        <w:tc>
-          <w:tcPr>
-            <w:tcW w:type="dxa" w:w="2880"/>
-          </w:tcPr>
-          <w:p>
-            <w:r>
-              <w:t>Approach</w:t>
-            </w:r>
-          </w:p>
-        </w:tc>
-        <w:tc>
-          <w:tcPr>
-            <w:tcW w:type="dxa" w:w="2880"/>
-          </w:tcPr>
-          <w:p>
-            <w:r>
-              <w:t>Capture of everything shown</w:t>
-            </w:r>
-          </w:p>
-        </w:tc>
-        <w:tc>
-          <w:tcPr>
-            <w:tcW w:type="dxa" w:w="2880"/>
-          </w:tcPr>
-          <w:p>
-            <w:r>
-              <w:t>Capture of precedent (history only)</w:t>
-            </w:r>
-          </w:p>
-        </w:tc>
-      </w:tr>
-      <w:tr>
-        <w:tc>
-          <w:tcPr>
-            <w:tcW w:type="dxa" w:w="2880"/>
-          </w:tcPr>
-          <w:p>
-            <w:r>
-              <w:t>No history + scores</w:t>
-            </w:r>
-          </w:p>
-        </w:tc>
-        <w:tc>
-          <w:tcPr>
-            <w:tcW w:type="dxa" w:w="2880"/>
-          </w:tcPr>
-          <w:p>
-            <w:r>
-              <w:t>57%</w:t>
-            </w:r>
-          </w:p>
-        </w:tc>
-        <w:tc>
-          <w:tcPr>
-            <w:tcW w:type="dxa" w:w="2880"/>
-          </w:tcPr>
-          <w:p>
-            <w:r>
-              <w:t>—</w:t>
-            </w:r>
-          </w:p>
-        </w:tc>
-      </w:tr>
-      <w:tr>
-        <w:tc>
-          <w:tcPr>
-            <w:tcW w:type="dxa" w:w="2880"/>
-          </w:tcPr>
-          <w:p>
-            <w:r>
-              <w:t>No history</w:t>
-            </w:r>
-          </w:p>
-        </w:tc>
-        <w:tc>
-          <w:tcPr>
-            <w:tcW w:type="dxa" w:w="2880"/>
-          </w:tcPr>
-          <w:p>
-            <w:r>
-              <w:t>59%</w:t>
-            </w:r>
-          </w:p>
-        </w:tc>
-        <w:tc>
-          <w:tcPr>
-            <w:tcW w:type="dxa" w:w="2880"/>
-          </w:tcPr>
-          <w:p>
-            <w:r>
-              <w:t>—</w:t>
-            </w:r>
-          </w:p>
-        </w:tc>
-      </w:tr>
-      <w:tr>
-        <w:tc>
-          <w:tcPr>
-            <w:tcW w:type="dxa" w:w="2880"/>
-          </w:tcPr>
-          <w:p>
-            <w:r>
-              <w:t>History + scores</w:t>
-            </w:r>
-          </w:p>
-        </w:tc>
-        <w:tc>
-          <w:tcPr>
-            <w:tcW w:type="dxa" w:w="2880"/>
-          </w:tcPr>
-          <w:p>
-            <w:r>
-              <w:t>74%</w:t>
-            </w:r>
-          </w:p>
-        </w:tc>
-        <w:tc>
-          <w:tcPr>
-            <w:tcW w:type="dxa" w:w="2880"/>
-          </w:tcPr>
-          <w:p>
-            <w:r>
-              <w:t>89%</w:t>
-            </w:r>
-          </w:p>
-        </w:tc>
-      </w:tr>
-      <w:tr>
-        <w:tc>
-          <w:tcPr>
-            <w:tcW w:type="dxa" w:w="2880"/>
-          </w:tcPr>
-          <w:p>
-            <w:r>
-              <w:t>History</w:t>
-            </w:r>
-          </w:p>
-        </w:tc>
-        <w:tc>
-          <w:tcPr>
-            <w:tcW w:type="dxa" w:w="2880"/>
-          </w:tcPr>
-          <w:p>
-            <w:r>
-              <w:t>73%</w:t>
-            </w:r>
-          </w:p>
-        </w:tc>
-        <w:tc>
-          <w:tcPr>
-            <w:tcW w:type="dxa" w:w="2880"/>
-          </w:tcPr>
-          <w:p>
-            <w:r>
-              <w:t>86%</w:t>
-            </w:r>
-          </w:p>
-        </w:tc>
-      </w:tr>
-    </w:tbl>
     <w:p>
       <w:r>
         <w:drawing>
           <wp:inline xmlns:a="http://schemas.openxmlformats.org/drawingml/2006/main" xmlns:pic="http://schemas.openxmlformats.org/drawingml/2006/picture">
-            <wp:extent cx="5669280" cy="3365450"/>
+            <wp:extent cx="5669280" cy="2615990"/>
             <wp:docPr id="4" name="Picture 4"/>
             <wp:cNvGraphicFramePr>
               <a:graphicFrameLocks noChangeAspect="1"/>
@@ -2222,7 +1136,7 @@
               <a:graphicData uri="http://schemas.openxmlformats.org/drawingml/2006/picture">
                 <pic:pic>
                   <pic:nvPicPr>
-                    <pic:cNvPr id="0" name="capture.png"/>
+                    <pic:cNvPr id="0" name="misses.png"/>
                     <pic:cNvPicPr/>
                   </pic:nvPicPr>
                   <pic:blipFill>
@@ -2234,7 +1148,7 @@
                   <pic:spPr>
                     <a:xfrm>
                       <a:off x="0" y="0"/>
-                      <a:ext cx="5669280" cy="3365450"/>
+                      <a:ext cx="5669280" cy="2615990"/>
                     </a:xfrm>
                     <a:prstGeom prst="rect"/>
                   </pic:spPr>
@@ -2246,28 +1160,38 @@
       </w:r>
     </w:p>
     <w:p>
+      <w:r>
+        <w:t>All of the misses are the top band — 'the model saw it but didn't pick it'. None were lost by retrieval. That is why the PROMPT is the only lever left: the right answers are already on the table, the model just has to choose them.</w:t>
+      </w:r>
+    </w:p>
+    <w:p>
       <w:pPr>
         <w:pStyle w:val="Heading1"/>
       </w:pPr>
       <w:r>
-        <w:t>5. When past tickets are shown, does the model use them?</w:t>
+        <w:t>4. When we show past tickets, does the model follow them?</w:t>
       </w:r>
     </w:p>
     <w:p>
       <w:r>
-        <w:t>Only the approaches that actually SHOW past tickets to the model appear here. We split the correct answers into ones that were in the shown past tickets vs ones that weren't, and measure recall for each. A big gap means the model is leaning on the precedent rather than ignoring it.</w:t>
+        <w:t>Only approaches that actually SHOW past tickets to the model appear here. We split the correct answers into two groups — ones a similar past ticket used, and ones it didn't — and measure how often the model picked each. A tall blue bar next to a short orange bar means the model is following the examples (it picks an answer much more when precedent backs it).</w:t>
       </w:r>
     </w:p>
     <w:p>
       <w:r>
-        <w:t>In "History + scores", an answer shown in the past tickets is picked 79% of the time vs 44% when it isn't — a +35% lift. There is still headroom: the past tickets CONTAIN 89% of the correct answers but the model only USES 79%, so ~10% of right answers sit in front of it unpicked — a more trusting prompt or more past tickets could capture them.</w:t>
+        <w:t>In "History + scores": an answer a past ticket used is picked 79% of the time vs only 44% when no past ticket used it — a +35% lift, the proof the examples drive the picks.</w:t>
+      </w:r>
+    </w:p>
+    <w:p>
+      <w:r>
+        <w:t>Headroom: the past tickets actually contained 89% of the correct answers, but the model only picked 79% of those (89% of what precedent offered). So ~10% of the right answers were shown via precedent and still missed — a more trusting prompt, or more past tickets, is where the next gain is.</w:t>
       </w:r>
     </w:p>
     <w:p>
       <w:r>
         <w:drawing>
           <wp:inline xmlns:a="http://schemas.openxmlformats.org/drawingml/2006/main" xmlns:pic="http://schemas.openxmlformats.org/drawingml/2006/picture">
-            <wp:extent cx="5669280" cy="3365450"/>
+            <wp:extent cx="5669280" cy="2701577"/>
             <wp:docPr id="5" name="Picture 5"/>
             <wp:cNvGraphicFramePr>
               <a:graphicFrameLocks noChangeAspect="1"/>
@@ -2288,7 +1212,7 @@
                   <pic:spPr>
                     <a:xfrm>
                       <a:off x="0" y="0"/>
-                      <a:ext cx="5669280" cy="3365450"/>
+                      <a:ext cx="5669280" cy="2701577"/>
                     </a:xfrm>
                     <a:prstGeom prst="rect"/>
                   </pic:spPr>
@@ -2304,12 +1228,12 @@
         <w:pStyle w:val="Heading1"/>
       </w:pPr>
       <w:r>
-        <w:t>6. Time per prediction</w:t>
+        <w:t>5. How long does a prediction take?</w:t>
       </w:r>
     </w:p>
     <w:p>
       <w:r>
-        <w:t>Three numbers per approach: AVERAGE, TYPICAL (median), and SLOWEST seconds per ticket (the eval-only scoring calls are excluded). Read the median for typical speed: if the average is far above the median, one or two tickets hit a retry/backoff storm and dragged the mean up — that is an outlier to investigate, not the real speed.</w:t>
+        <w:t>Read the TYPICAL (median) bar — the middle ticket's time, the honest 'usual' speed. The average and slowest are shown too: when they tower over the median, one ticket stalled on retries and dragged the mean up. That is an outlier to investigate, not the real speed.</w:t>
       </w:r>
     </w:p>
     <w:tbl>
@@ -2341,7 +1265,7 @@
           </w:tcPr>
           <w:p>
             <w:r>
-              <w:t>Average</w:t>
+              <w:t>Typical (median)</w:t>
             </w:r>
           </w:p>
         </w:tc>
@@ -2351,7 +1275,7 @@
           </w:tcPr>
           <w:p>
             <w:r>
-              <w:t>Typical (median)</w:t>
+              <w:t>Average</w:t>
             </w:r>
           </w:p>
         </w:tc>
@@ -2373,48 +1297,6 @@
           </w:tcPr>
           <w:p>
             <w:r>
-              <w:t>No history + scores</w:t>
-            </w:r>
-          </w:p>
-        </w:tc>
-        <w:tc>
-          <w:tcPr>
-            <w:tcW w:type="dxa" w:w="2160"/>
-          </w:tcPr>
-          <w:p>
-            <w:r>
-              <w:t>5.6s</w:t>
-            </w:r>
-          </w:p>
-        </w:tc>
-        <w:tc>
-          <w:tcPr>
-            <w:tcW w:type="dxa" w:w="2160"/>
-          </w:tcPr>
-          <w:p>
-            <w:r>
-              <w:t>n/a</w:t>
-            </w:r>
-          </w:p>
-        </w:tc>
-        <w:tc>
-          <w:tcPr>
-            <w:tcW w:type="dxa" w:w="2160"/>
-          </w:tcPr>
-          <w:p>
-            <w:r>
-              <w:t>8.8s</w:t>
-            </w:r>
-          </w:p>
-        </w:tc>
-      </w:tr>
-      <w:tr>
-        <w:tc>
-          <w:tcPr>
-            <w:tcW w:type="dxa" w:w="2160"/>
-          </w:tcPr>
-          <w:p>
-            <w:r>
               <w:t>No history</w:t>
             </w:r>
           </w:p>
@@ -2425,7 +1307,7 @@
           </w:tcPr>
           <w:p>
             <w:r>
-              <w:t>5.3s</w:t>
+              <w:t>5.2s</w:t>
             </w:r>
           </w:p>
         </w:tc>
@@ -2435,7 +1317,7 @@
           </w:tcPr>
           <w:p>
             <w:r>
-              <w:t>5.2s</w:t>
+              <w:t>5.3s</w:t>
             </w:r>
           </w:p>
         </w:tc>
@@ -2457,7 +1339,7 @@
           </w:tcPr>
           <w:p>
             <w:r>
-              <w:t>History + scores</w:t>
+              <w:t>History</w:t>
             </w:r>
           </w:p>
         </w:tc>
@@ -2467,39 +1349,7 @@
           </w:tcPr>
           <w:p>
             <w:r>
-              <w:t>5.4s</w:t>
-            </w:r>
-          </w:p>
-        </w:tc>
-        <w:tc>
-          <w:tcPr>
-            <w:tcW w:type="dxa" w:w="2160"/>
-          </w:tcPr>
-          <w:p>
-            <w:r>
-              <w:t>n/a</w:t>
-            </w:r>
-          </w:p>
-        </w:tc>
-        <w:tc>
-          <w:tcPr>
-            <w:tcW w:type="dxa" w:w="2160"/>
-          </w:tcPr>
-          <w:p>
-            <w:r>
-              <w:t>7.2s</w:t>
-            </w:r>
-          </w:p>
-        </w:tc>
-      </w:tr>
-      <w:tr>
-        <w:tc>
-          <w:tcPr>
-            <w:tcW w:type="dxa" w:w="2160"/>
-          </w:tcPr>
-          <w:p>
-            <w:r>
-              <w:t>History</w:t>
+              <w:t>5.1s</w:t>
             </w:r>
           </w:p>
         </w:tc>
@@ -2519,17 +1369,7 @@
           </w:tcPr>
           <w:p>
             <w:r>
-              <w:t>5.1s</w:t>
-            </w:r>
-          </w:p>
-        </w:tc>
-        <w:tc>
-          <w:tcPr>
-            <w:tcW w:type="dxa" w:w="2160"/>
-          </w:tcPr>
-          <w:p>
-            <w:r>
-              <w:t>9836.8s  ⚠ avg inflated by an outlier</w:t>
+              <w:t>9836.8s  ⚠ one outlier inflated the average</w:t>
             </w:r>
           </w:p>
         </w:tc>
@@ -2539,7 +1379,7 @@
       <w:r>
         <w:drawing>
           <wp:inline xmlns:a="http://schemas.openxmlformats.org/drawingml/2006/main" xmlns:pic="http://schemas.openxmlformats.org/drawingml/2006/picture">
-            <wp:extent cx="5669280" cy="3261559"/>
+            <wp:extent cx="5669280" cy="3026628"/>
             <wp:docPr id="6" name="Picture 6"/>
             <wp:cNvGraphicFramePr>
               <a:graphicFrameLocks noChangeAspect="1"/>
@@ -2560,7 +1400,7 @@
                   <pic:spPr>
                     <a:xfrm>
                       <a:off x="0" y="0"/>
-                      <a:ext cx="5669280" cy="3261559"/>
+                      <a:ext cx="5669280" cy="3026628"/>
                     </a:xfrm>
                     <a:prstGeom prst="rect"/>
                   </pic:spPr>

</xml_diff>

<commit_message>
compare_eval: latency chart excludes the retry-storm outlier so the scale is usable
One ticket hit a retry/backoff storm (~9837s) and dragged the average to ~169s,
squashing every real ~5s bar. runs.json stores only aggregates, so back the
single slowest ticket out of the mean: (avg*n - slowest)/(n-1), applied only when
the slowest is a >3x-median outlier. Chart now plots median + outlier-removed
average (both ~5s); the raw average and slowest stay in the table, outlier flagged.

Co-Authored-By: Claude Opus 4.8 <noreply@anthropic.com>
</commit_message>
<xml_diff>
--- a/out/eval/comparison_all_modes.docx
+++ b/out/eval/comparison_all_modes.docx
@@ -72,7 +72,7 @@
           </w:tcPr>
           <w:p>
             <w:r>
-              <w:t>All 50 Value Streams offered with search relevance scores. No past tickets shown.</w:t>
+              <w:t>All 50 streams with search scores. No past tickets.</w:t>
             </w:r>
           </w:p>
         </w:tc>
@@ -94,7 +94,7 @@
           </w:tcPr>
           <w:p>
             <w:r>
-              <w:t>All 50 Value Streams offered, scores hidden. No past tickets shown.</w:t>
+              <w:t>All 50 streams, scores hidden. No past tickets.</w:t>
             </w:r>
           </w:p>
         </w:tc>
@@ -116,7 +116,7 @@
           </w:tcPr>
           <w:p>
             <w:r>
-              <w:t>All 50 streams + similar past tickets shown as examples, scores shown.</w:t>
+              <w:t>All 50 streams + past tickets shown, scores shown.</w:t>
             </w:r>
           </w:p>
         </w:tc>
@@ -138,7 +138,7 @@
           </w:tcPr>
           <w:p>
             <w:r>
-              <w:t>All 50 streams + similar past tickets shown as examples, scores hidden.</w:t>
+              <w:t>All 50 streams + past tickets shown, scores hidden.</w:t>
             </w:r>
           </w:p>
         </w:tc>
@@ -623,7 +623,7 @@
           </w:tcPr>
           <w:p>
             <w:r>
-              <w:t>5.200</w:t>
+              <w:t>5.220</w:t>
             </w:r>
           </w:p>
         </w:tc>
@@ -633,7 +633,7 @@
           </w:tcPr>
           <w:p>
             <w:r>
-              <w:t>5.100</w:t>
+              <w:t>5.090</w:t>
             </w:r>
           </w:p>
         </w:tc>
@@ -643,7 +643,7 @@
           </w:tcPr>
           <w:p>
             <w:r>
-              <w:t>-0.100</w:t>
+              <w:t>-0.130</w:t>
             </w:r>
           </w:p>
         </w:tc>
@@ -1233,7 +1233,7 @@
     </w:p>
     <w:p>
       <w:r>
-        <w:t>Read the TYPICAL (median) bar — the middle ticket's time, the honest 'usual' speed. The average and slowest are shown too: when they tower over the median, one ticket stalled on retries and dragged the mean up. That is an outlier to investigate, not the real speed.</w:t>
+        <w:t>The chart shows TYPICAL (median) speed and the AVERAGE with the single slowest ticket removed. We remove it because a retry/backoff storm on one ticket can make it take thousands of seconds and wreck the average — that is an infrastructure hiccup, not the real cost. The table keeps the raw numbers so nothing is hidden.</w:t>
       </w:r>
     </w:p>
     <w:tbl>
@@ -1243,15 +1243,16 @@
         <w:tblLook w:firstColumn="1" w:firstRow="1" w:lastColumn="0" w:lastRow="0" w:noHBand="0" w:noVBand="1" w:val="04A0"/>
       </w:tblPr>
       <w:tblGrid>
-        <w:gridCol w:w="2160"/>
-        <w:gridCol w:w="2160"/>
-        <w:gridCol w:w="2160"/>
-        <w:gridCol w:w="2160"/>
+        <w:gridCol w:w="1728"/>
+        <w:gridCol w:w="1728"/>
+        <w:gridCol w:w="1728"/>
+        <w:gridCol w:w="1728"/>
+        <w:gridCol w:w="1728"/>
       </w:tblGrid>
       <w:tr>
         <w:tc>
           <w:tcPr>
-            <w:tcW w:type="dxa" w:w="2160"/>
+            <w:tcW w:type="dxa" w:w="1728"/>
           </w:tcPr>
           <w:p>
             <w:r>
@@ -1261,7 +1262,7 @@
         </w:tc>
         <w:tc>
           <w:tcPr>
-            <w:tcW w:type="dxa" w:w="2160"/>
+            <w:tcW w:type="dxa" w:w="1728"/>
           </w:tcPr>
           <w:p>
             <w:r>
@@ -1271,21 +1272,31 @@
         </w:tc>
         <w:tc>
           <w:tcPr>
-            <w:tcW w:type="dxa" w:w="2160"/>
+            <w:tcW w:type="dxa" w:w="1728"/>
           </w:tcPr>
           <w:p>
             <w:r>
-              <w:t>Average</w:t>
+              <w:t>Average (outlier removed)</w:t>
             </w:r>
           </w:p>
         </w:tc>
         <w:tc>
           <w:tcPr>
-            <w:tcW w:type="dxa" w:w="2160"/>
+            <w:tcW w:type="dxa" w:w="1728"/>
           </w:tcPr>
           <w:p>
             <w:r>
-              <w:t>Slowest</w:t>
+              <w:t>Raw average</w:t>
+            </w:r>
+          </w:p>
+        </w:tc>
+        <w:tc>
+          <w:tcPr>
+            <w:tcW w:type="dxa" w:w="1728"/>
+          </w:tcPr>
+          <w:p>
+            <w:r>
+              <w:t>Raw slowest</w:t>
             </w:r>
           </w:p>
         </w:tc>
@@ -1293,7 +1304,7 @@
       <w:tr>
         <w:tc>
           <w:tcPr>
-            <w:tcW w:type="dxa" w:w="2160"/>
+            <w:tcW w:type="dxa" w:w="1728"/>
           </w:tcPr>
           <w:p>
             <w:r>
@@ -1303,7 +1314,7 @@
         </w:tc>
         <w:tc>
           <w:tcPr>
-            <w:tcW w:type="dxa" w:w="2160"/>
+            <w:tcW w:type="dxa" w:w="1728"/>
           </w:tcPr>
           <w:p>
             <w:r>
@@ -1313,7 +1324,7 @@
         </w:tc>
         <w:tc>
           <w:tcPr>
-            <w:tcW w:type="dxa" w:w="2160"/>
+            <w:tcW w:type="dxa" w:w="1728"/>
           </w:tcPr>
           <w:p>
             <w:r>
@@ -1323,11 +1334,21 @@
         </w:tc>
         <w:tc>
           <w:tcPr>
-            <w:tcW w:type="dxa" w:w="2160"/>
+            <w:tcW w:type="dxa" w:w="1728"/>
           </w:tcPr>
           <w:p>
             <w:r>
-              <w:t>9.4s</w:t>
+              <w:t>5.3s</w:t>
+            </w:r>
+          </w:p>
+        </w:tc>
+        <w:tc>
+          <w:tcPr>
+            <w:tcW w:type="dxa" w:w="1728"/>
+          </w:tcPr>
+          <w:p>
+            <w:r>
+              <w:t>8.1s</w:t>
             </w:r>
           </w:p>
         </w:tc>
@@ -1335,7 +1356,7 @@
       <w:tr>
         <w:tc>
           <w:tcPr>
-            <w:tcW w:type="dxa" w:w="2160"/>
+            <w:tcW w:type="dxa" w:w="1728"/>
           </w:tcPr>
           <w:p>
             <w:r>
@@ -1345,7 +1366,7 @@
         </w:tc>
         <w:tc>
           <w:tcPr>
-            <w:tcW w:type="dxa" w:w="2160"/>
+            <w:tcW w:type="dxa" w:w="1728"/>
           </w:tcPr>
           <w:p>
             <w:r>
@@ -1355,7 +1376,17 @@
         </w:tc>
         <w:tc>
           <w:tcPr>
-            <w:tcW w:type="dxa" w:w="2160"/>
+            <w:tcW w:type="dxa" w:w="1728"/>
+          </w:tcPr>
+          <w:p>
+            <w:r>
+              <w:t>5.3s</w:t>
+            </w:r>
+          </w:p>
+        </w:tc>
+        <w:tc>
+          <w:tcPr>
+            <w:tcW w:type="dxa" w:w="1728"/>
           </w:tcPr>
           <w:p>
             <w:r>
@@ -1365,11 +1396,11 @@
         </w:tc>
         <w:tc>
           <w:tcPr>
-            <w:tcW w:type="dxa" w:w="2160"/>
+            <w:tcW w:type="dxa" w:w="1728"/>
           </w:tcPr>
           <w:p>
             <w:r>
-              <w:t>9836.8s  ⚠ one outlier inflated the average</w:t>
+              <w:t>3284.5s  ⚠ retry-storm outlier</w:t>
             </w:r>
           </w:p>
         </w:tc>
@@ -1379,7 +1410,7 @@
       <w:r>
         <w:drawing>
           <wp:inline xmlns:a="http://schemas.openxmlformats.org/drawingml/2006/main" xmlns:pic="http://schemas.openxmlformats.org/drawingml/2006/picture">
-            <wp:extent cx="5669280" cy="3026628"/>
+            <wp:extent cx="5669280" cy="3431272"/>
             <wp:docPr id="6" name="Picture 6"/>
             <wp:cNvGraphicFramePr>
               <a:graphicFrameLocks noChangeAspect="1"/>
@@ -1400,7 +1431,7 @@
                   <pic:spPr>
                     <a:xfrm>
                       <a:off x="0" y="0"/>
-                      <a:ext cx="5669280" cy="3026628"/>
+                      <a:ext cx="5669280" cy="3431272"/>
                     </a:xfrm>
                     <a:prstGeom prst="rect"/>
                   </pic:spPr>

</xml_diff>